<commit_message>
merubah syarat penandatanganan dan pencairan pada template docx
</commit_message>
<xml_diff>
--- a/template_purna_reguler.docx
+++ b/template_purna_reguler.docx
@@ -3456,14 +3456,14 @@
       <w:bookmarkStart w:id="3" w:name="OLE_LINK19"/>
       <w:bookmarkStart w:id="4" w:name="OLE_LINK17"/>
       <w:bookmarkStart w:id="5" w:name="OLE_LINK8"/>
-      <w:bookmarkStart w:id="6" w:name="OLE_LINK24"/>
+      <w:bookmarkStart w:id="6" w:name="OLE_LINK32"/>
       <w:bookmarkStart w:id="7" w:name="OLE_LINK33"/>
-      <w:bookmarkStart w:id="8" w:name="OLE_LINK41"/>
-      <w:bookmarkStart w:id="9" w:name="OLE_LINK27"/>
-      <w:bookmarkStart w:id="10" w:name="OLE_LINK10"/>
-      <w:bookmarkStart w:id="11" w:name="OLE_LINK32"/>
-      <w:bookmarkStart w:id="12" w:name="OLE_LINK23"/>
-      <w:bookmarkStart w:id="13" w:name="OLE_LINK3"/>
+      <w:bookmarkStart w:id="8" w:name="OLE_LINK27"/>
+      <w:bookmarkStart w:id="9" w:name="OLE_LINK23"/>
+      <w:bookmarkStart w:id="10" w:name="OLE_LINK24"/>
+      <w:bookmarkStart w:id="11" w:name="OLE_LINK10"/>
+      <w:bookmarkStart w:id="12" w:name="OLE_LINK3"/>
+      <w:bookmarkStart w:id="13" w:name="OLE_LINK41"/>
       <w:r>
         <w:rPr>
           <w:rFonts w:ascii="Kalinga" w:hAnsi="Kalinga" w:cs="Kalinga"/>
@@ -4040,91 +4040,101 @@
         </w:rPr>
         <w:t>Menyerahkan Surat Pernyataan Siap Melakukan Pembayaran Apabila suatu saat Kehilangan Tunjangan</w:t>
       </w:r>
-    </w:p>
-    <w:p>
-      <w:pPr>
-        <w:pStyle w:val="6"/>
-        <w:numPr>
-          <w:ilvl w:val="0"/>
-          <w:numId w:val="1"/>
-        </w:numPr>
-        <w:spacing w:line="240" w:lineRule="auto"/>
-        <w:ind w:left="360" w:leftChars="0" w:right="160" w:rightChars="0" w:hanging="280" w:firstLineChars="0"/>
-        <w:jc w:val="both"/>
-        <w:rPr>
-          <w:rFonts w:hint="default" w:ascii="Kalinga" w:hAnsi="Kalinga"/>
-          <w:color w:val="auto"/>
-          <w:sz w:val="20"/>
-          <w:szCs w:val="20"/>
-        </w:rPr>
-      </w:pPr>
-      <w:r>
-        <w:rPr>
-          <w:rFonts w:hint="default" w:ascii="Kalinga" w:hAnsi="Kalinga"/>
-          <w:color w:val="auto"/>
-          <w:sz w:val="20"/>
-          <w:szCs w:val="20"/>
-        </w:rPr>
-        <w:t xml:space="preserve">Menyerahkan Surat </w:t>
-      </w:r>
-      <w:r>
-        <w:rPr>
-          <w:rFonts w:hint="default" w:ascii="Kalinga" w:hAnsi="Kalinga"/>
-          <w:color w:val="auto"/>
-          <w:sz w:val="20"/>
-          <w:szCs w:val="20"/>
-          <w:lang w:val="en-US"/>
-        </w:rPr>
-        <w:t xml:space="preserve">Pernyataan </w:t>
-      </w:r>
-      <w:r>
-        <w:rPr>
-          <w:rFonts w:hint="default" w:ascii="Kalinga" w:hAnsi="Kalinga"/>
-          <w:color w:val="auto"/>
-          <w:sz w:val="20"/>
-          <w:szCs w:val="20"/>
-        </w:rPr>
-        <w:t>Kesanggupan Pembayaran Angsuran Kredit Perbulan Diatas 70% dari Uang Pensiun atau Manfaat Pensiun Bulanan Yang Diterima.</w:t>
-      </w:r>
-    </w:p>
-    <w:p>
-      <w:pPr>
-        <w:pStyle w:val="6"/>
-        <w:numPr>
-          <w:ilvl w:val="0"/>
-          <w:numId w:val="1"/>
-        </w:numPr>
-        <w:spacing w:line="240" w:lineRule="auto"/>
-        <w:ind w:left="360" w:leftChars="0" w:right="160" w:rightChars="0" w:hanging="280" w:firstLineChars="0"/>
-        <w:jc w:val="both"/>
-        <w:rPr>
-          <w:rFonts w:hint="default" w:ascii="Kalinga" w:hAnsi="Kalinga"/>
-          <w:color w:val="auto"/>
-          <w:sz w:val="20"/>
-          <w:szCs w:val="20"/>
-        </w:rPr>
-      </w:pPr>
-      <w:r>
-        <w:rPr>
-          <w:rFonts w:hint="default" w:ascii="Kalinga" w:hAnsi="Kalinga"/>
-          <w:color w:val="auto"/>
-          <w:sz w:val="20"/>
-          <w:szCs w:val="20"/>
-        </w:rPr>
-        <w:t xml:space="preserve">Menyerahkan </w:t>
-      </w:r>
-      <w:r>
-        <w:rPr>
-          <w:rFonts w:hint="default" w:ascii="Kalinga" w:hAnsi="Kalinga"/>
-          <w:color w:val="auto"/>
-          <w:sz w:val="20"/>
-          <w:szCs w:val="20"/>
-          <w:lang w:val="en-US"/>
-        </w:rPr>
-        <w:t xml:space="preserve">Asli </w:t>
+      <w:r>
+        <w:rPr>
+          <w:rFonts w:hint="default" w:ascii="Kalinga" w:hAnsi="Kalinga"/>
+          <w:color w:val="auto"/>
+          <w:sz w:val="20"/>
+          <w:szCs w:val="20"/>
+          <w:lang w:val="en-US"/>
+        </w:rPr>
+        <w:t>.</w:t>
       </w:r>
       <w:bookmarkStart w:id="17" w:name="_GoBack"/>
       <w:bookmarkEnd w:id="17"/>
+    </w:p>
+    <w:p>
+      <w:pPr>
+        <w:pStyle w:val="6"/>
+        <w:numPr>
+          <w:ilvl w:val="0"/>
+          <w:numId w:val="1"/>
+        </w:numPr>
+        <w:spacing w:line="240" w:lineRule="auto"/>
+        <w:ind w:left="360" w:leftChars="0" w:right="160" w:rightChars="0" w:hanging="280" w:firstLineChars="0"/>
+        <w:jc w:val="both"/>
+        <w:rPr>
+          <w:rFonts w:hint="default" w:ascii="Kalinga" w:hAnsi="Kalinga"/>
+          <w:color w:val="auto"/>
+          <w:sz w:val="20"/>
+          <w:szCs w:val="20"/>
+        </w:rPr>
+      </w:pPr>
+      <w:r>
+        <w:rPr>
+          <w:rFonts w:hint="default" w:ascii="Kalinga" w:hAnsi="Kalinga"/>
+          <w:color w:val="auto"/>
+          <w:sz w:val="20"/>
+          <w:szCs w:val="20"/>
+        </w:rPr>
+        <w:t xml:space="preserve">Menyerahkan Surat </w:t>
+      </w:r>
+      <w:r>
+        <w:rPr>
+          <w:rFonts w:hint="default" w:ascii="Kalinga" w:hAnsi="Kalinga"/>
+          <w:color w:val="auto"/>
+          <w:sz w:val="20"/>
+          <w:szCs w:val="20"/>
+          <w:lang w:val="en-US"/>
+        </w:rPr>
+        <w:t xml:space="preserve">Pernyataan </w:t>
+      </w:r>
+      <w:r>
+        <w:rPr>
+          <w:rFonts w:hint="default" w:ascii="Kalinga" w:hAnsi="Kalinga"/>
+          <w:color w:val="auto"/>
+          <w:sz w:val="20"/>
+          <w:szCs w:val="20"/>
+        </w:rPr>
+        <w:t>Kesanggupan Pembayaran Angsuran Kredit Perbulan Diatas 70% dari Uang Pensiun atau Manfaat Pensiun Bulanan Yang Diterima.</w:t>
+      </w:r>
+    </w:p>
+    <w:p>
+      <w:pPr>
+        <w:pStyle w:val="6"/>
+        <w:numPr>
+          <w:ilvl w:val="0"/>
+          <w:numId w:val="1"/>
+        </w:numPr>
+        <w:spacing w:line="240" w:lineRule="auto"/>
+        <w:ind w:left="360" w:leftChars="0" w:right="160" w:rightChars="0" w:hanging="280" w:firstLineChars="0"/>
+        <w:jc w:val="both"/>
+        <w:rPr>
+          <w:rFonts w:hint="default" w:ascii="Kalinga" w:hAnsi="Kalinga"/>
+          <w:color w:val="auto"/>
+          <w:sz w:val="20"/>
+          <w:szCs w:val="20"/>
+        </w:rPr>
+      </w:pPr>
+      <w:r>
+        <w:rPr>
+          <w:rFonts w:hint="default" w:ascii="Kalinga" w:hAnsi="Kalinga"/>
+          <w:color w:val="auto"/>
+          <w:sz w:val="20"/>
+          <w:szCs w:val="20"/>
+        </w:rPr>
+        <w:t xml:space="preserve">Menyerahkan </w:t>
+      </w:r>
+      <w:r>
+        <w:rPr>
+          <w:rFonts w:hint="default" w:ascii="Kalinga" w:hAnsi="Kalinga"/>
+          <w:color w:val="auto"/>
+          <w:sz w:val="20"/>
+          <w:szCs w:val="20"/>
+          <w:lang w:val="en-US"/>
+        </w:rPr>
+        <w:t xml:space="preserve">Asli </w:t>
+      </w:r>
       <w:r>
         <w:rPr>
           <w:rFonts w:hint="default" w:ascii="Kalinga" w:hAnsi="Kalinga"/>
@@ -4223,7 +4233,26 @@
           <w:sz w:val="20"/>
           <w:szCs w:val="20"/>
         </w:rPr>
-        <w:t>{{ item }}{% endfor %}</w:t>
+        <w:t>{{ item }}</w:t>
+      </w:r>
+      <w:r>
+        <w:rPr>
+          <w:rFonts w:hint="default" w:ascii="Kalinga" w:hAnsi="Kalinga"/>
+          <w:color w:val="auto"/>
+          <w:sz w:val="20"/>
+          <w:szCs w:val="20"/>
+          <w:lang w:val="en-US"/>
+        </w:rPr>
+        <w:t>.</w:t>
+      </w:r>
+      <w:r>
+        <w:rPr>
+          <w:rFonts w:hint="default" w:ascii="Kalinga" w:hAnsi="Kalinga"/>
+          <w:color w:val="auto"/>
+          <w:sz w:val="20"/>
+          <w:szCs w:val="20"/>
+        </w:rPr>
+        <w:t>{% endfor %}</w:t>
       </w:r>
     </w:p>
     <w:p>
@@ -4350,6 +4379,16 @@
           <w:szCs w:val="20"/>
         </w:rPr>
         <w:t>Perjanjian Kredit telah ditandatangani oleh Pemohon</w:t>
+      </w:r>
+      <w:r>
+        <w:rPr>
+          <w:rFonts w:hint="default" w:ascii="Kalinga" w:hAnsi="Kalinga"/>
+          <w:color w:val="auto"/>
+          <w:sz w:val="20"/>
+          <w:szCs w:val="20"/>
+          <w:lang w:val="en-US"/>
+        </w:rPr>
+        <w:t>.</w:t>
       </w:r>
     </w:p>
     <w:p>

</xml_diff>

<commit_message>
menambahkan button segmentasi taspen/asabri dan logika label
</commit_message>
<xml_diff>
--- a/template_purna_reguler.docx
+++ b/template_purna_reguler.docx
@@ -16,8 +16,8 @@
           <w:u w:val="single"/>
         </w:rPr>
       </w:pPr>
-      <w:bookmarkStart w:id="0" w:name="OLE_LINK2"/>
-      <w:bookmarkStart w:id="1" w:name="OLE_LINK30"/>
+      <w:bookmarkStart w:id="0" w:name="OLE_LINK30"/>
+      <w:bookmarkStart w:id="1" w:name="OLE_LINK2"/>
       <w:r>
         <w:rPr>
           <w:rFonts w:ascii="Kalinga" w:hAnsi="Kalinga" w:cs="Kalinga"/>
@@ -427,7 +427,47 @@
           <w:sz w:val="20"/>
           <w:szCs w:val="20"/>
         </w:rPr>
-        <w:t>Pemohon merupakan pensiunan {{ jenis_pekerjaan_pemohon | default('PNS', true) }} di {{ nama_instansi_pemohon | default('', true) }} TMT {{ tgl_pensiun_tmt | default('', true) }} Cfm SK Pensiun Nomor {{ no_sk_pensiun | default('', true) }} tanggal {{ tgl_sk_pensiun | default('', true) }}.</w:t>
+        <w:t>Pemohon merupakan {% if segmentasi == 'asabri' %}</w:t>
+      </w:r>
+      <w:r>
+        <w:rPr>
+          <w:rFonts w:hint="default" w:ascii="Kalinga" w:hAnsi="Kalinga"/>
+          <w:color w:val="auto"/>
+          <w:sz w:val="20"/>
+          <w:szCs w:val="20"/>
+          <w:lang w:val="en-US"/>
+        </w:rPr>
+        <w:t>Pensiunan Anggota</w:t>
+      </w:r>
+      <w:r>
+        <w:rPr>
+          <w:rFonts w:hint="default" w:ascii="Kalinga" w:hAnsi="Kalinga"/>
+          <w:color w:val="auto"/>
+          <w:sz w:val="20"/>
+          <w:szCs w:val="20"/>
+        </w:rPr>
+        <w:t>{% else %}</w:t>
+      </w:r>
+      <w:r>
+        <w:rPr>
+          <w:rFonts w:hint="default" w:ascii="Kalinga" w:hAnsi="Kalinga"/>
+          <w:color w:val="auto"/>
+          <w:sz w:val="20"/>
+          <w:szCs w:val="20"/>
+          <w:lang w:val="en-US"/>
+        </w:rPr>
+        <w:t>Pensiunan</w:t>
+      </w:r>
+      <w:bookmarkStart w:id="17" w:name="_GoBack"/>
+      <w:bookmarkEnd w:id="17"/>
+      <w:r>
+        <w:rPr>
+          <w:rFonts w:hint="default" w:ascii="Kalinga" w:hAnsi="Kalinga"/>
+          <w:color w:val="auto"/>
+          <w:sz w:val="20"/>
+          <w:szCs w:val="20"/>
+        </w:rPr>
+        <w:t>{% endif %}{{ jenis_pekerjaan_pemohon | default('PNS', true) }} di {{ nama_instansi_pemohon | default('', true) }} TMT {{ tgl_pensiun_tmt | default('', true) }} Cfm SK Pensiun Nomor {{ no_sk_pensiun | default('', true) }} tanggal {{ tgl_sk_pensiun | default('', true) }}.</w:t>
       </w:r>
     </w:p>
     <w:p>
@@ -3456,12 +3496,12 @@
       <w:bookmarkStart w:id="3" w:name="OLE_LINK19"/>
       <w:bookmarkStart w:id="4" w:name="OLE_LINK17"/>
       <w:bookmarkStart w:id="5" w:name="OLE_LINK8"/>
-      <w:bookmarkStart w:id="6" w:name="OLE_LINK32"/>
-      <w:bookmarkStart w:id="7" w:name="OLE_LINK33"/>
-      <w:bookmarkStart w:id="8" w:name="OLE_LINK27"/>
+      <w:bookmarkStart w:id="6" w:name="OLE_LINK33"/>
+      <w:bookmarkStart w:id="7" w:name="OLE_LINK27"/>
+      <w:bookmarkStart w:id="8" w:name="OLE_LINK32"/>
       <w:bookmarkStart w:id="9" w:name="OLE_LINK23"/>
-      <w:bookmarkStart w:id="10" w:name="OLE_LINK24"/>
-      <w:bookmarkStart w:id="11" w:name="OLE_LINK10"/>
+      <w:bookmarkStart w:id="10" w:name="OLE_LINK10"/>
+      <w:bookmarkStart w:id="11" w:name="OLE_LINK24"/>
       <w:bookmarkStart w:id="12" w:name="OLE_LINK3"/>
       <w:bookmarkStart w:id="13" w:name="OLE_LINK41"/>
       <w:r>
@@ -4050,8 +4090,6 @@
         </w:rPr>
         <w:t>.</w:t>
       </w:r>
-      <w:bookmarkStart w:id="17" w:name="_GoBack"/>
-      <w:bookmarkEnd w:id="17"/>
     </w:p>
     <w:p>
       <w:pPr>

</xml_diff>

<commit_message>
koreksi template purna reguler docx dan memunculkan jenis pengajuan kredit pada halaman riwayat
</commit_message>
<xml_diff>
--- a/template_purna_reguler.docx
+++ b/template_purna_reguler.docx
@@ -16,8 +16,8 @@
           <w:u w:val="single"/>
         </w:rPr>
       </w:pPr>
-      <w:bookmarkStart w:id="0" w:name="OLE_LINK30"/>
-      <w:bookmarkStart w:id="1" w:name="OLE_LINK2"/>
+      <w:bookmarkStart w:id="0" w:name="OLE_LINK2"/>
+      <w:bookmarkStart w:id="1" w:name="OLE_LINK30"/>
       <w:r>
         <w:rPr>
           <w:rFonts w:ascii="Kalinga" w:hAnsi="Kalinga" w:cs="Kalinga"/>
@@ -866,7 +866,64 @@
           <w:sz w:val="20"/>
           <w:szCs w:val="20"/>
         </w:rPr>
-        <w:t>Fasilitas Kredit {{slik_bank_1_jenis | default('', true)}} di {{slik_bank_1_nama}} maks Rp. {{slik_bank_1_maks}} outs Rp. {{slik_bank_1_outs}} Coll {{slik_bank_1_coll}}.{% if slik_bank_1_alasan_aktif == 'ya' %} (Ket: {{ slik_bank_1_alasan }}){% endif %}{% endif %}{% if slik_bank_2_nama %}</w:t>
+        <w:t xml:space="preserve">Fasilitas Kredit {{slik_bank_1_jenis | </w:t>
+      </w:r>
+      <w:r>
+        <w:rPr>
+          <w:rFonts w:hint="default" w:ascii="Kalinga" w:hAnsi="Kalinga"/>
+          <w:color w:val="auto"/>
+          <w:sz w:val="20"/>
+          <w:szCs w:val="20"/>
+          <w:lang w:val="en-US"/>
+        </w:rPr>
+        <w:t>default('', true)}} di Bank</w:t>
+      </w:r>
+      <w:r>
+        <w:rPr>
+          <w:rFonts w:hint="default" w:ascii="Kalinga" w:hAnsi="Kalinga"/>
+          <w:color w:val="auto"/>
+          <w:sz w:val="20"/>
+          <w:szCs w:val="20"/>
+        </w:rPr>
+        <w:t xml:space="preserve"> {{slik_bank_1_nama}} maks Rp. {{slik_bank_1_maks}} outs Rp. {{slik_bank_1_outs}} Coll {{slik_bank_1_coll}}.{% if slik_bank_1_alasan_aktif == 'ya' %} (Ket: {{ slik_bank_1_</w:t>
+      </w:r>
+      <w:r>
+        <w:rPr>
+          <w:rFonts w:hint="default" w:ascii="Kalinga" w:hAnsi="Kalinga"/>
+          <w:color w:val="auto"/>
+          <w:sz w:val="20"/>
+          <w:szCs w:val="20"/>
+          <w:lang w:val="en-US"/>
+        </w:rPr>
+        <w:t>alasan }}).</w:t>
+      </w:r>
+      <w:r>
+        <w:rPr>
+          <w:rFonts w:hint="default" w:ascii="Kalinga" w:hAnsi="Kalinga"/>
+          <w:color w:val="auto"/>
+          <w:sz w:val="20"/>
+          <w:szCs w:val="20"/>
+        </w:rPr>
+        <w:t xml:space="preserve">{% endif %}{% endif </w:t>
+      </w:r>
+      <w:r>
+        <w:rPr>
+          <w:rFonts w:hint="default" w:ascii="Kalinga" w:hAnsi="Kalinga"/>
+          <w:color w:val="auto"/>
+          <w:sz w:val="20"/>
+          <w:szCs w:val="20"/>
+          <w:lang w:val="en-US"/>
+        </w:rPr>
+        <w:t>%}{% if</w:t>
+      </w:r>
+      <w:r>
+        <w:rPr>
+          <w:rFonts w:hint="default" w:ascii="Kalinga" w:hAnsi="Kalinga"/>
+          <w:color w:val="auto"/>
+          <w:sz w:val="20"/>
+          <w:szCs w:val="20"/>
+        </w:rPr>
+        <w:t xml:space="preserve"> slik_bank_2_nama %}</w:t>
       </w:r>
     </w:p>
     <w:p>
@@ -893,7 +950,64 @@
           <w:sz w:val="20"/>
           <w:szCs w:val="20"/>
         </w:rPr>
-        <w:t>Fasilitas Kredit {{slik_bank_2_jenis | default('', true)}} di {{slik_bank_2_nama}} maks Rp. {{slik_bank_2_maks}} outs Rp. {{slik_bank_2_outs}} Coll {{slik_bank_2_coll}}.{% if slik_bank_2_alasan_aktif == 'ya' %} (Ket: {{ slik_bank_2_alasan }}){% endif %}{% endif %}{% if slik_bank_3_nama %}</w:t>
+        <w:t xml:space="preserve">Fasilitas Kredit {{slik_bank_2_jenis | </w:t>
+      </w:r>
+      <w:r>
+        <w:rPr>
+          <w:rFonts w:hint="default" w:ascii="Kalinga" w:hAnsi="Kalinga"/>
+          <w:color w:val="auto"/>
+          <w:sz w:val="20"/>
+          <w:szCs w:val="20"/>
+          <w:lang w:val="en-US"/>
+        </w:rPr>
+        <w:t>default('', true)}} di Bank</w:t>
+      </w:r>
+      <w:r>
+        <w:rPr>
+          <w:rFonts w:hint="default" w:ascii="Kalinga" w:hAnsi="Kalinga"/>
+          <w:color w:val="auto"/>
+          <w:sz w:val="20"/>
+          <w:szCs w:val="20"/>
+        </w:rPr>
+        <w:t xml:space="preserve"> {{slik_bank_2_nama}} maks Rp. {{slik_bank_2_maks}} outs Rp. {{slik_bank_2_outs}} Coll {{slik_bank_2_coll}}.{% if slik_bank_2_alasan_aktif == 'ya' %} (Ket: {{ slik_bank_2_</w:t>
+      </w:r>
+      <w:r>
+        <w:rPr>
+          <w:rFonts w:hint="default" w:ascii="Kalinga" w:hAnsi="Kalinga"/>
+          <w:color w:val="auto"/>
+          <w:sz w:val="20"/>
+          <w:szCs w:val="20"/>
+          <w:lang w:val="en-US"/>
+        </w:rPr>
+        <w:t>alasan }}).</w:t>
+      </w:r>
+      <w:r>
+        <w:rPr>
+          <w:rFonts w:hint="default" w:ascii="Kalinga" w:hAnsi="Kalinga"/>
+          <w:color w:val="auto"/>
+          <w:sz w:val="20"/>
+          <w:szCs w:val="20"/>
+        </w:rPr>
+        <w:t xml:space="preserve">{% endif %}{% endif </w:t>
+      </w:r>
+      <w:r>
+        <w:rPr>
+          <w:rFonts w:hint="default" w:ascii="Kalinga" w:hAnsi="Kalinga"/>
+          <w:color w:val="auto"/>
+          <w:sz w:val="20"/>
+          <w:szCs w:val="20"/>
+          <w:lang w:val="en-US"/>
+        </w:rPr>
+        <w:t>%}{% if</w:t>
+      </w:r>
+      <w:r>
+        <w:rPr>
+          <w:rFonts w:hint="default" w:ascii="Kalinga" w:hAnsi="Kalinga"/>
+          <w:color w:val="auto"/>
+          <w:sz w:val="20"/>
+          <w:szCs w:val="20"/>
+        </w:rPr>
+        <w:t xml:space="preserve"> slik_bank_3_nama %}</w:t>
       </w:r>
     </w:p>
     <w:p>
@@ -920,7 +1034,64 @@
           <w:sz w:val="20"/>
           <w:szCs w:val="20"/>
         </w:rPr>
-        <w:t>Fasilitas Kredit {{slik_bank_3_jenis | default('', true)}} di {{slik_bank_3_nama}} maks Rp. {{slik_bank_3_maks}} outs Rp. {{slik_bank_3_outs}} Coll {{slik_bank_3_coll}}.{% if slik_bank_3_alasan_aktif == 'ya' %} (Ket: {{ slik_bank_3_alasan }}){% endif %}{% endif %}{% if slik_bank_4_nama %}</w:t>
+        <w:t xml:space="preserve">Fasilitas Kredit {{slik_bank_3_jenis | </w:t>
+      </w:r>
+      <w:r>
+        <w:rPr>
+          <w:rFonts w:hint="default" w:ascii="Kalinga" w:hAnsi="Kalinga"/>
+          <w:color w:val="auto"/>
+          <w:sz w:val="20"/>
+          <w:szCs w:val="20"/>
+          <w:lang w:val="en-US"/>
+        </w:rPr>
+        <w:t>default('', true)}} di Bank</w:t>
+      </w:r>
+      <w:r>
+        <w:rPr>
+          <w:rFonts w:hint="default" w:ascii="Kalinga" w:hAnsi="Kalinga"/>
+          <w:color w:val="auto"/>
+          <w:sz w:val="20"/>
+          <w:szCs w:val="20"/>
+        </w:rPr>
+        <w:t xml:space="preserve"> {{slik_bank_3_nama}} maks Rp. {{slik_bank_3_maks}} outs Rp. {{slik_bank_3_outs}} Coll {{slik_bank_3_coll}}.{% if slik_bank_3_alasan_aktif == 'ya' %} (Ket: {{ slik_bank_3_</w:t>
+      </w:r>
+      <w:r>
+        <w:rPr>
+          <w:rFonts w:hint="default" w:ascii="Kalinga" w:hAnsi="Kalinga"/>
+          <w:color w:val="auto"/>
+          <w:sz w:val="20"/>
+          <w:szCs w:val="20"/>
+          <w:lang w:val="en-US"/>
+        </w:rPr>
+        <w:t>alasan }}).</w:t>
+      </w:r>
+      <w:r>
+        <w:rPr>
+          <w:rFonts w:hint="default" w:ascii="Kalinga" w:hAnsi="Kalinga"/>
+          <w:color w:val="auto"/>
+          <w:sz w:val="20"/>
+          <w:szCs w:val="20"/>
+        </w:rPr>
+        <w:t xml:space="preserve">{% endif %}{% endif </w:t>
+      </w:r>
+      <w:r>
+        <w:rPr>
+          <w:rFonts w:hint="default" w:ascii="Kalinga" w:hAnsi="Kalinga"/>
+          <w:color w:val="auto"/>
+          <w:sz w:val="20"/>
+          <w:szCs w:val="20"/>
+          <w:lang w:val="en-US"/>
+        </w:rPr>
+        <w:t>%}{% if</w:t>
+      </w:r>
+      <w:r>
+        <w:rPr>
+          <w:rFonts w:hint="default" w:ascii="Kalinga" w:hAnsi="Kalinga"/>
+          <w:color w:val="auto"/>
+          <w:sz w:val="20"/>
+          <w:szCs w:val="20"/>
+        </w:rPr>
+        <w:t xml:space="preserve"> slik_bank_4_nama %}</w:t>
       </w:r>
     </w:p>
     <w:p>
@@ -947,7 +1118,64 @@
           <w:sz w:val="20"/>
           <w:szCs w:val="20"/>
         </w:rPr>
-        <w:t>Fasilitas Kredit {{slik_bank_4_jenis | default('', true)}} di {{slik_bank_4_nama}} maks Rp. {{slik_bank_4_maks}} outs Rp. {{slik_bank_4_outs}} Coll {{slik_bank_4_coll}}.{% if slik_bank_4_alasan_aktif == 'ya' %} (Ket: {{ slik_bank_4_alasan }}){% endif %}{% endif %}{% if slik_bank_5_nama %}</w:t>
+        <w:t xml:space="preserve">Fasilitas Kredit {{slik_bank_4_jenis | </w:t>
+      </w:r>
+      <w:r>
+        <w:rPr>
+          <w:rFonts w:hint="default" w:ascii="Kalinga" w:hAnsi="Kalinga"/>
+          <w:color w:val="auto"/>
+          <w:sz w:val="20"/>
+          <w:szCs w:val="20"/>
+          <w:lang w:val="en-US"/>
+        </w:rPr>
+        <w:t>default('', true)}} di Bank</w:t>
+      </w:r>
+      <w:r>
+        <w:rPr>
+          <w:rFonts w:hint="default" w:ascii="Kalinga" w:hAnsi="Kalinga"/>
+          <w:color w:val="auto"/>
+          <w:sz w:val="20"/>
+          <w:szCs w:val="20"/>
+        </w:rPr>
+        <w:t xml:space="preserve"> {{slik_bank_4_nama}} maks Rp. {{slik_bank_4_maks}} outs Rp. {{slik_bank_4_outs}} Coll {{slik_bank_4_coll}}.{% if slik_bank_4_alasan_aktif == 'ya' %} (Ket: {{ slik_bank_4_</w:t>
+      </w:r>
+      <w:r>
+        <w:rPr>
+          <w:rFonts w:hint="default" w:ascii="Kalinga" w:hAnsi="Kalinga"/>
+          <w:color w:val="auto"/>
+          <w:sz w:val="20"/>
+          <w:szCs w:val="20"/>
+          <w:lang w:val="en-US"/>
+        </w:rPr>
+        <w:t>alasan }}).</w:t>
+      </w:r>
+      <w:r>
+        <w:rPr>
+          <w:rFonts w:hint="default" w:ascii="Kalinga" w:hAnsi="Kalinga"/>
+          <w:color w:val="auto"/>
+          <w:sz w:val="20"/>
+          <w:szCs w:val="20"/>
+        </w:rPr>
+        <w:t xml:space="preserve">{% endif %}{% endif </w:t>
+      </w:r>
+      <w:r>
+        <w:rPr>
+          <w:rFonts w:hint="default" w:ascii="Kalinga" w:hAnsi="Kalinga"/>
+          <w:color w:val="auto"/>
+          <w:sz w:val="20"/>
+          <w:szCs w:val="20"/>
+          <w:lang w:val="en-US"/>
+        </w:rPr>
+        <w:t>%}{% if</w:t>
+      </w:r>
+      <w:r>
+        <w:rPr>
+          <w:rFonts w:hint="default" w:ascii="Kalinga" w:hAnsi="Kalinga"/>
+          <w:color w:val="auto"/>
+          <w:sz w:val="20"/>
+          <w:szCs w:val="20"/>
+        </w:rPr>
+        <w:t xml:space="preserve"> slik_bank_5_nama %}</w:t>
       </w:r>
     </w:p>
     <w:p>
@@ -974,7 +1202,64 @@
           <w:sz w:val="20"/>
           <w:szCs w:val="20"/>
         </w:rPr>
-        <w:t>Fasilitas Kredit {{slik_bank_5_jenis | default('', true)}} di {{slik_bank_5_nama}} maks Rp. {{slik_bank_5_maks}} outs Rp. {{slik_bank_5_outs}} Coll {{slik_bank_5_coll}}.{% if slik_bank_5_alasan_aktif == 'ya' %} (Ket: {{ slik_bank_5_alasan }}){% endif %}{% endif %}{% if slik_bank_6_nama %}</w:t>
+        <w:t xml:space="preserve">Fasilitas Kredit {{slik_bank_5_jenis | </w:t>
+      </w:r>
+      <w:r>
+        <w:rPr>
+          <w:rFonts w:hint="default" w:ascii="Kalinga" w:hAnsi="Kalinga"/>
+          <w:color w:val="auto"/>
+          <w:sz w:val="20"/>
+          <w:szCs w:val="20"/>
+          <w:lang w:val="en-US"/>
+        </w:rPr>
+        <w:t>default('', true)}} di Bank</w:t>
+      </w:r>
+      <w:r>
+        <w:rPr>
+          <w:rFonts w:hint="default" w:ascii="Kalinga" w:hAnsi="Kalinga"/>
+          <w:color w:val="auto"/>
+          <w:sz w:val="20"/>
+          <w:szCs w:val="20"/>
+        </w:rPr>
+        <w:t xml:space="preserve"> {{slik_bank_5_nama}} maks Rp. {{slik_bank_5_maks}} outs Rp. {{slik_bank_5_outs}} Coll {{slik_bank_5_coll}}.{% if slik_bank_5_alasan_aktif == 'ya' %} (Ket: {{ slik_bank_5_</w:t>
+      </w:r>
+      <w:r>
+        <w:rPr>
+          <w:rFonts w:hint="default" w:ascii="Kalinga" w:hAnsi="Kalinga"/>
+          <w:color w:val="auto"/>
+          <w:sz w:val="20"/>
+          <w:szCs w:val="20"/>
+          <w:lang w:val="en-US"/>
+        </w:rPr>
+        <w:t>alasan }}).</w:t>
+      </w:r>
+      <w:r>
+        <w:rPr>
+          <w:rFonts w:hint="default" w:ascii="Kalinga" w:hAnsi="Kalinga"/>
+          <w:color w:val="auto"/>
+          <w:sz w:val="20"/>
+          <w:szCs w:val="20"/>
+        </w:rPr>
+        <w:t xml:space="preserve">{% endif %}{% endif </w:t>
+      </w:r>
+      <w:r>
+        <w:rPr>
+          <w:rFonts w:hint="default" w:ascii="Kalinga" w:hAnsi="Kalinga"/>
+          <w:color w:val="auto"/>
+          <w:sz w:val="20"/>
+          <w:szCs w:val="20"/>
+          <w:lang w:val="en-US"/>
+        </w:rPr>
+        <w:t>%}{% if</w:t>
+      </w:r>
+      <w:r>
+        <w:rPr>
+          <w:rFonts w:hint="default" w:ascii="Kalinga" w:hAnsi="Kalinga"/>
+          <w:color w:val="auto"/>
+          <w:sz w:val="20"/>
+          <w:szCs w:val="20"/>
+        </w:rPr>
+        <w:t xml:space="preserve"> slik_bank_6_nama %}</w:t>
       </w:r>
     </w:p>
     <w:p>
@@ -1001,7 +1286,64 @@
           <w:sz w:val="20"/>
           <w:szCs w:val="20"/>
         </w:rPr>
-        <w:t>Fasilitas Kredit {{slik_bank_6_jenis | default('', true)}} di {{slik_bank_6_nama}} maks Rp. {{slik_bank_6_maks}} outs Rp. {{slik_bank_6_outs}} Coll {{slik_bank_6_coll}}.{% if slik_bank_6_alasan_aktif == 'ya' %} (Ket: {{ slik_bank_6_alasan }}){% endif %}{% endif %}{% if slik_bank_7_nama %}</w:t>
+        <w:t xml:space="preserve">Fasilitas Kredit {{slik_bank_6_jenis | </w:t>
+      </w:r>
+      <w:r>
+        <w:rPr>
+          <w:rFonts w:hint="default" w:ascii="Kalinga" w:hAnsi="Kalinga"/>
+          <w:color w:val="auto"/>
+          <w:sz w:val="20"/>
+          <w:szCs w:val="20"/>
+          <w:lang w:val="en-US"/>
+        </w:rPr>
+        <w:t>default('', true)}} di Bank</w:t>
+      </w:r>
+      <w:r>
+        <w:rPr>
+          <w:rFonts w:hint="default" w:ascii="Kalinga" w:hAnsi="Kalinga"/>
+          <w:color w:val="auto"/>
+          <w:sz w:val="20"/>
+          <w:szCs w:val="20"/>
+        </w:rPr>
+        <w:t xml:space="preserve"> {{slik_bank_6_nama}} maks Rp. {{slik_bank_6_maks}} outs Rp. {{slik_bank_6_outs}} Coll {{slik_bank_6_coll}}.{% if slik_bank_6_alasan_aktif == 'ya' %} (Ket: {{ slik_bank_6_</w:t>
+      </w:r>
+      <w:r>
+        <w:rPr>
+          <w:rFonts w:hint="default" w:ascii="Kalinga" w:hAnsi="Kalinga"/>
+          <w:color w:val="auto"/>
+          <w:sz w:val="20"/>
+          <w:szCs w:val="20"/>
+          <w:lang w:val="en-US"/>
+        </w:rPr>
+        <w:t>alasan }}).</w:t>
+      </w:r>
+      <w:r>
+        <w:rPr>
+          <w:rFonts w:hint="default" w:ascii="Kalinga" w:hAnsi="Kalinga"/>
+          <w:color w:val="auto"/>
+          <w:sz w:val="20"/>
+          <w:szCs w:val="20"/>
+        </w:rPr>
+        <w:t xml:space="preserve">{% endif %}{% endif </w:t>
+      </w:r>
+      <w:r>
+        <w:rPr>
+          <w:rFonts w:hint="default" w:ascii="Kalinga" w:hAnsi="Kalinga"/>
+          <w:color w:val="auto"/>
+          <w:sz w:val="20"/>
+          <w:szCs w:val="20"/>
+          <w:lang w:val="en-US"/>
+        </w:rPr>
+        <w:t>%}{% if</w:t>
+      </w:r>
+      <w:r>
+        <w:rPr>
+          <w:rFonts w:hint="default" w:ascii="Kalinga" w:hAnsi="Kalinga"/>
+          <w:color w:val="auto"/>
+          <w:sz w:val="20"/>
+          <w:szCs w:val="20"/>
+        </w:rPr>
+        <w:t xml:space="preserve"> slik_bank_7_nama %}</w:t>
       </w:r>
     </w:p>
     <w:p>
@@ -1028,7 +1370,64 @@
           <w:sz w:val="20"/>
           <w:szCs w:val="20"/>
         </w:rPr>
-        <w:t>Fasilitas Kredit {{slik_bank_7_jenis | default('', true)}} di {{slik_bank_7_nama}} maks Rp. {{slik_bank_7_maks}} outs Rp. {{slik_bank_7_outs}} Coll {{slik_bank_7_coll}}.{% if slik_bank_7_alasan_aktif == 'ya' %} (Ket: {{ slik_bank_7_alasan }}){% endif %}{% endif %}{% if slik_bank_8_nama %}</w:t>
+        <w:t xml:space="preserve">Fasilitas Kredit {{slik_bank_7_jenis | </w:t>
+      </w:r>
+      <w:r>
+        <w:rPr>
+          <w:rFonts w:hint="default" w:ascii="Kalinga" w:hAnsi="Kalinga"/>
+          <w:color w:val="auto"/>
+          <w:sz w:val="20"/>
+          <w:szCs w:val="20"/>
+          <w:lang w:val="en-US"/>
+        </w:rPr>
+        <w:t>default('', true)}} di Bank</w:t>
+      </w:r>
+      <w:r>
+        <w:rPr>
+          <w:rFonts w:hint="default" w:ascii="Kalinga" w:hAnsi="Kalinga"/>
+          <w:color w:val="auto"/>
+          <w:sz w:val="20"/>
+          <w:szCs w:val="20"/>
+        </w:rPr>
+        <w:t xml:space="preserve"> {{slik_bank_7_nama}} maks Rp. {{slik_bank_7_maks}} outs Rp. {{slik_bank_7_outs}} Coll {{slik_bank_7_coll}}.{% if slik_bank_7_alasan_aktif == 'ya' %} (Ket: {{ slik_bank_7_</w:t>
+      </w:r>
+      <w:r>
+        <w:rPr>
+          <w:rFonts w:hint="default" w:ascii="Kalinga" w:hAnsi="Kalinga"/>
+          <w:color w:val="auto"/>
+          <w:sz w:val="20"/>
+          <w:szCs w:val="20"/>
+          <w:lang w:val="en-US"/>
+        </w:rPr>
+        <w:t>alasan }}).</w:t>
+      </w:r>
+      <w:r>
+        <w:rPr>
+          <w:rFonts w:hint="default" w:ascii="Kalinga" w:hAnsi="Kalinga"/>
+          <w:color w:val="auto"/>
+          <w:sz w:val="20"/>
+          <w:szCs w:val="20"/>
+        </w:rPr>
+        <w:t xml:space="preserve">{% endif %}{% endif </w:t>
+      </w:r>
+      <w:r>
+        <w:rPr>
+          <w:rFonts w:hint="default" w:ascii="Kalinga" w:hAnsi="Kalinga"/>
+          <w:color w:val="auto"/>
+          <w:sz w:val="20"/>
+          <w:szCs w:val="20"/>
+          <w:lang w:val="en-US"/>
+        </w:rPr>
+        <w:t>%}{% if</w:t>
+      </w:r>
+      <w:r>
+        <w:rPr>
+          <w:rFonts w:hint="default" w:ascii="Kalinga" w:hAnsi="Kalinga"/>
+          <w:color w:val="auto"/>
+          <w:sz w:val="20"/>
+          <w:szCs w:val="20"/>
+        </w:rPr>
+        <w:t xml:space="preserve"> slik_bank_8_nama %}</w:t>
       </w:r>
     </w:p>
     <w:p>
@@ -1055,7 +1454,64 @@
           <w:sz w:val="20"/>
           <w:szCs w:val="20"/>
         </w:rPr>
-        <w:t>Fasilitas Kredit {{slik_bank_8_jenis | default('', true)}} di {{slik_bank_8_nama}} maks Rp. {{slik_bank_8_maks}} outs Rp. {{slik_bank_8_outs}} Coll {{slik_bank_8_coll}}.{% if slik_bank_8_alasan_aktif == 'ya' %} (Ket: {{ slik_bank_8_alasan }}){% endif %}{% endif %}{% if slik_bank_9_nama %}</w:t>
+        <w:t xml:space="preserve">Fasilitas Kredit {{slik_bank_8_jenis | </w:t>
+      </w:r>
+      <w:r>
+        <w:rPr>
+          <w:rFonts w:hint="default" w:ascii="Kalinga" w:hAnsi="Kalinga"/>
+          <w:color w:val="auto"/>
+          <w:sz w:val="20"/>
+          <w:szCs w:val="20"/>
+          <w:lang w:val="en-US"/>
+        </w:rPr>
+        <w:t>default('', true)}} di Bank</w:t>
+      </w:r>
+      <w:r>
+        <w:rPr>
+          <w:rFonts w:hint="default" w:ascii="Kalinga" w:hAnsi="Kalinga"/>
+          <w:color w:val="auto"/>
+          <w:sz w:val="20"/>
+          <w:szCs w:val="20"/>
+        </w:rPr>
+        <w:t xml:space="preserve"> {{slik_bank_8_nama}} maks Rp. {{slik_bank_8_maks}} outs Rp. {{slik_bank_8_outs}} Coll {{slik_bank_8_coll}}.{% if slik_bank_8_alasan_aktif == 'ya' %} (Ket: {{ slik_bank_8_</w:t>
+      </w:r>
+      <w:r>
+        <w:rPr>
+          <w:rFonts w:hint="default" w:ascii="Kalinga" w:hAnsi="Kalinga"/>
+          <w:color w:val="auto"/>
+          <w:sz w:val="20"/>
+          <w:szCs w:val="20"/>
+          <w:lang w:val="en-US"/>
+        </w:rPr>
+        <w:t>alasan }}).</w:t>
+      </w:r>
+      <w:r>
+        <w:rPr>
+          <w:rFonts w:hint="default" w:ascii="Kalinga" w:hAnsi="Kalinga"/>
+          <w:color w:val="auto"/>
+          <w:sz w:val="20"/>
+          <w:szCs w:val="20"/>
+        </w:rPr>
+        <w:t xml:space="preserve">{% endif %}{% endif </w:t>
+      </w:r>
+      <w:r>
+        <w:rPr>
+          <w:rFonts w:hint="default" w:ascii="Kalinga" w:hAnsi="Kalinga"/>
+          <w:color w:val="auto"/>
+          <w:sz w:val="20"/>
+          <w:szCs w:val="20"/>
+          <w:lang w:val="en-US"/>
+        </w:rPr>
+        <w:t>%}{% if</w:t>
+      </w:r>
+      <w:r>
+        <w:rPr>
+          <w:rFonts w:hint="default" w:ascii="Kalinga" w:hAnsi="Kalinga"/>
+          <w:color w:val="auto"/>
+          <w:sz w:val="20"/>
+          <w:szCs w:val="20"/>
+        </w:rPr>
+        <w:t xml:space="preserve"> slik_bank_9_nama %}</w:t>
       </w:r>
     </w:p>
     <w:p>
@@ -1082,7 +1538,64 @@
           <w:sz w:val="20"/>
           <w:szCs w:val="20"/>
         </w:rPr>
-        <w:t>Fasilitas Kredit {{slik_bank_9_jenis | default('', true)}} di {{slik_bank_9_nama}} maks Rp. {{slik_bank_9_maks}} outs Rp. {{slik_bank_9_outs}} Coll {{slik_bank_9_coll}}.{% if slik_bank_9_alasan_aktif == 'ya' %} (Ket: {{ slik_bank_9_alasan }}){% endif %}{% endif %}{% if slik_bank_10_nama %}</w:t>
+        <w:t xml:space="preserve">Fasilitas Kredit {{slik_bank_9_jenis | </w:t>
+      </w:r>
+      <w:r>
+        <w:rPr>
+          <w:rFonts w:hint="default" w:ascii="Kalinga" w:hAnsi="Kalinga"/>
+          <w:color w:val="auto"/>
+          <w:sz w:val="20"/>
+          <w:szCs w:val="20"/>
+          <w:lang w:val="en-US"/>
+        </w:rPr>
+        <w:t>default('', true)}} di Bank</w:t>
+      </w:r>
+      <w:r>
+        <w:rPr>
+          <w:rFonts w:hint="default" w:ascii="Kalinga" w:hAnsi="Kalinga"/>
+          <w:color w:val="auto"/>
+          <w:sz w:val="20"/>
+          <w:szCs w:val="20"/>
+        </w:rPr>
+        <w:t xml:space="preserve"> {{slik_bank_9_nama}} maks Rp. {{slik_bank_9_maks}} outs Rp. {{slik_bank_9_outs}} Coll {{slik_bank_9_coll}}.{% if slik_bank_9_alasan_aktif == 'ya' %} (Ket: {{ slik_bank_9_</w:t>
+      </w:r>
+      <w:r>
+        <w:rPr>
+          <w:rFonts w:hint="default" w:ascii="Kalinga" w:hAnsi="Kalinga"/>
+          <w:color w:val="auto"/>
+          <w:sz w:val="20"/>
+          <w:szCs w:val="20"/>
+          <w:lang w:val="en-US"/>
+        </w:rPr>
+        <w:t>alasan }}).</w:t>
+      </w:r>
+      <w:r>
+        <w:rPr>
+          <w:rFonts w:hint="default" w:ascii="Kalinga" w:hAnsi="Kalinga"/>
+          <w:color w:val="auto"/>
+          <w:sz w:val="20"/>
+          <w:szCs w:val="20"/>
+        </w:rPr>
+        <w:t xml:space="preserve">{% endif %}{% endif </w:t>
+      </w:r>
+      <w:r>
+        <w:rPr>
+          <w:rFonts w:hint="default" w:ascii="Kalinga" w:hAnsi="Kalinga"/>
+          <w:color w:val="auto"/>
+          <w:sz w:val="20"/>
+          <w:szCs w:val="20"/>
+          <w:lang w:val="en-US"/>
+        </w:rPr>
+        <w:t>%}{% if</w:t>
+      </w:r>
+      <w:r>
+        <w:rPr>
+          <w:rFonts w:hint="default" w:ascii="Kalinga" w:hAnsi="Kalinga"/>
+          <w:color w:val="auto"/>
+          <w:sz w:val="20"/>
+          <w:szCs w:val="20"/>
+        </w:rPr>
+        <w:t xml:space="preserve"> slik_bank_10_nama %}</w:t>
       </w:r>
     </w:p>
     <w:p>
@@ -1109,7 +1622,64 @@
           <w:sz w:val="20"/>
           <w:szCs w:val="20"/>
         </w:rPr>
-        <w:t>Fasilitas Kredit {{slik_bank_10_jenis | default('', true)}} di {{slik_bank_10_nama}} maks Rp. {{slik_bank_10_maks}} outs Rp. {{slik_bank_10_outs}} Coll {{slik_bank_10_coll}}.{% if slik_bank_10_alasan_aktif == 'ya' %} (Ket: {{ slik_bank_10_alasan }}){% endif %}{% endif %}{% if slik_bank_11_nama %}</w:t>
+        <w:t xml:space="preserve">Fasilitas Kredit {{slik_bank_10_jenis | </w:t>
+      </w:r>
+      <w:r>
+        <w:rPr>
+          <w:rFonts w:hint="default" w:ascii="Kalinga" w:hAnsi="Kalinga"/>
+          <w:color w:val="auto"/>
+          <w:sz w:val="20"/>
+          <w:szCs w:val="20"/>
+          <w:lang w:val="en-US"/>
+        </w:rPr>
+        <w:t>default('', true)}} di Bank</w:t>
+      </w:r>
+      <w:r>
+        <w:rPr>
+          <w:rFonts w:hint="default" w:ascii="Kalinga" w:hAnsi="Kalinga"/>
+          <w:color w:val="auto"/>
+          <w:sz w:val="20"/>
+          <w:szCs w:val="20"/>
+        </w:rPr>
+        <w:t xml:space="preserve"> {{slik_bank_10_nama}} maks Rp. {{slik_bank_10_maks}} outs Rp. {{slik_bank_10_outs}} Coll {{slik_bank_10_coll}}.{% if slik_bank_10_alasan_aktif == 'ya' %} (Ket: {{ slik_bank_10_</w:t>
+      </w:r>
+      <w:r>
+        <w:rPr>
+          <w:rFonts w:hint="default" w:ascii="Kalinga" w:hAnsi="Kalinga"/>
+          <w:color w:val="auto"/>
+          <w:sz w:val="20"/>
+          <w:szCs w:val="20"/>
+          <w:lang w:val="en-US"/>
+        </w:rPr>
+        <w:t>alasan }}).</w:t>
+      </w:r>
+      <w:r>
+        <w:rPr>
+          <w:rFonts w:hint="default" w:ascii="Kalinga" w:hAnsi="Kalinga"/>
+          <w:color w:val="auto"/>
+          <w:sz w:val="20"/>
+          <w:szCs w:val="20"/>
+        </w:rPr>
+        <w:t xml:space="preserve">{% endif %}{% endif </w:t>
+      </w:r>
+      <w:r>
+        <w:rPr>
+          <w:rFonts w:hint="default" w:ascii="Kalinga" w:hAnsi="Kalinga"/>
+          <w:color w:val="auto"/>
+          <w:sz w:val="20"/>
+          <w:szCs w:val="20"/>
+          <w:lang w:val="en-US"/>
+        </w:rPr>
+        <w:t>%}{% if</w:t>
+      </w:r>
+      <w:r>
+        <w:rPr>
+          <w:rFonts w:hint="default" w:ascii="Kalinga" w:hAnsi="Kalinga"/>
+          <w:color w:val="auto"/>
+          <w:sz w:val="20"/>
+          <w:szCs w:val="20"/>
+        </w:rPr>
+        <w:t xml:space="preserve"> slik_bank_11_nama %}</w:t>
       </w:r>
     </w:p>
     <w:p>
@@ -1146,7 +1716,64 @@
           <w:sz w:val="20"/>
           <w:szCs w:val="20"/>
         </w:rPr>
-        <w:t>asilitas Kredit {{slik_bank_11_jenis | default('', true)}} di {{slik_bank_11_nama}} maks Rp. {{slik_bank_11_maks}} outs Rp. {{slik_bank_11_outs}} Coll {{slik_bank_11_coll}}.{% if slik_bank_11_alasan_aktif == 'ya' %} (Ket: {{ slik_bank_11_alasan }}){% endif %}{% endif %}{% if slik_bank_12_nama %}</w:t>
+        <w:t xml:space="preserve">asilitas Kredit {{slik_bank_11_jenis | </w:t>
+      </w:r>
+      <w:r>
+        <w:rPr>
+          <w:rFonts w:hint="default" w:ascii="Kalinga" w:hAnsi="Kalinga"/>
+          <w:color w:val="auto"/>
+          <w:sz w:val="20"/>
+          <w:szCs w:val="20"/>
+          <w:lang w:val="en-US"/>
+        </w:rPr>
+        <w:t>default('', true)}} di Bank</w:t>
+      </w:r>
+      <w:r>
+        <w:rPr>
+          <w:rFonts w:hint="default" w:ascii="Kalinga" w:hAnsi="Kalinga"/>
+          <w:color w:val="auto"/>
+          <w:sz w:val="20"/>
+          <w:szCs w:val="20"/>
+        </w:rPr>
+        <w:t xml:space="preserve"> {{slik_bank_11_nama}} maks Rp. {{slik_bank_11_maks}} outs Rp. {{slik_bank_11_outs}} Coll {{slik_bank_11_coll}}.{% if slik_bank_11_alasan_aktif == 'ya' %} (Ket: {{ slik_bank_11_</w:t>
+      </w:r>
+      <w:r>
+        <w:rPr>
+          <w:rFonts w:hint="default" w:ascii="Kalinga" w:hAnsi="Kalinga"/>
+          <w:color w:val="auto"/>
+          <w:sz w:val="20"/>
+          <w:szCs w:val="20"/>
+          <w:lang w:val="en-US"/>
+        </w:rPr>
+        <w:t>alasan }}).</w:t>
+      </w:r>
+      <w:r>
+        <w:rPr>
+          <w:rFonts w:hint="default" w:ascii="Kalinga" w:hAnsi="Kalinga"/>
+          <w:color w:val="auto"/>
+          <w:sz w:val="20"/>
+          <w:szCs w:val="20"/>
+        </w:rPr>
+        <w:t xml:space="preserve">{% endif %}{% endif </w:t>
+      </w:r>
+      <w:r>
+        <w:rPr>
+          <w:rFonts w:hint="default" w:ascii="Kalinga" w:hAnsi="Kalinga"/>
+          <w:color w:val="auto"/>
+          <w:sz w:val="20"/>
+          <w:szCs w:val="20"/>
+          <w:lang w:val="en-US"/>
+        </w:rPr>
+        <w:t>%}{% if</w:t>
+      </w:r>
+      <w:r>
+        <w:rPr>
+          <w:rFonts w:hint="default" w:ascii="Kalinga" w:hAnsi="Kalinga"/>
+          <w:color w:val="auto"/>
+          <w:sz w:val="20"/>
+          <w:szCs w:val="20"/>
+        </w:rPr>
+        <w:t xml:space="preserve"> slik_bank_12_nama %}</w:t>
       </w:r>
     </w:p>
     <w:p>
@@ -1173,7 +1800,64 @@
           <w:sz w:val="20"/>
           <w:szCs w:val="20"/>
         </w:rPr>
-        <w:t>Fasilitas Kredit {{slik_bank_12_jenis | default('', true)}} di {{slik_bank_12_nama}} maks Rp. {{slik_bank_12_maks}} outs Rp. {{slik_bank_12_outs}} Coll {{slik_bank_12_coll}}.{% if slik_bank_12_alasan_aktif == 'ya' %} (Ket: {{ slik_bank_12_alasan }}){% endif %}{% endif %}{% if slik_bank_13_nama %}</w:t>
+        <w:t xml:space="preserve">Fasilitas Kredit {{slik_bank_12_jenis | </w:t>
+      </w:r>
+      <w:r>
+        <w:rPr>
+          <w:rFonts w:hint="default" w:ascii="Kalinga" w:hAnsi="Kalinga"/>
+          <w:color w:val="auto"/>
+          <w:sz w:val="20"/>
+          <w:szCs w:val="20"/>
+          <w:lang w:val="en-US"/>
+        </w:rPr>
+        <w:t>default('', true)}} di Bank</w:t>
+      </w:r>
+      <w:r>
+        <w:rPr>
+          <w:rFonts w:hint="default" w:ascii="Kalinga" w:hAnsi="Kalinga"/>
+          <w:color w:val="auto"/>
+          <w:sz w:val="20"/>
+          <w:szCs w:val="20"/>
+        </w:rPr>
+        <w:t xml:space="preserve"> {{slik_bank_12_nama}} maks Rp. {{slik_bank_12_maks}} outs Rp. {{slik_bank_12_outs}} Coll {{slik_bank_12_coll}}.{% if slik_bank_12_alasan_aktif == 'ya' %} (Ket: {{ slik_bank_12_</w:t>
+      </w:r>
+      <w:r>
+        <w:rPr>
+          <w:rFonts w:hint="default" w:ascii="Kalinga" w:hAnsi="Kalinga"/>
+          <w:color w:val="auto"/>
+          <w:sz w:val="20"/>
+          <w:szCs w:val="20"/>
+          <w:lang w:val="en-US"/>
+        </w:rPr>
+        <w:t>alasan }}).</w:t>
+      </w:r>
+      <w:r>
+        <w:rPr>
+          <w:rFonts w:hint="default" w:ascii="Kalinga" w:hAnsi="Kalinga"/>
+          <w:color w:val="auto"/>
+          <w:sz w:val="20"/>
+          <w:szCs w:val="20"/>
+        </w:rPr>
+        <w:t xml:space="preserve">{% endif %}{% endif </w:t>
+      </w:r>
+      <w:r>
+        <w:rPr>
+          <w:rFonts w:hint="default" w:ascii="Kalinga" w:hAnsi="Kalinga"/>
+          <w:color w:val="auto"/>
+          <w:sz w:val="20"/>
+          <w:szCs w:val="20"/>
+          <w:lang w:val="en-US"/>
+        </w:rPr>
+        <w:t>%}{% if</w:t>
+      </w:r>
+      <w:r>
+        <w:rPr>
+          <w:rFonts w:hint="default" w:ascii="Kalinga" w:hAnsi="Kalinga"/>
+          <w:color w:val="auto"/>
+          <w:sz w:val="20"/>
+          <w:szCs w:val="20"/>
+        </w:rPr>
+        <w:t xml:space="preserve"> slik_bank_13_nama %}</w:t>
       </w:r>
     </w:p>
     <w:p>
@@ -1200,7 +1884,64 @@
           <w:sz w:val="20"/>
           <w:szCs w:val="20"/>
         </w:rPr>
-        <w:t>Fasilitas Kredit {{slik_bank_13_jenis | default('', true)}} di {{slik_bank_13_nama}} maks Rp. {{slik_bank_13_maks}} outs Rp. {{slik_bank_13_outs}} Coll {{slik_bank_13_coll}}.{% if slik_bank_13_alasan_aktif == 'ya' %} (Ket: {{ slik_bank_13_alasan }}){% endif %}{% endif %}{% if slik_bank_14_nama %}</w:t>
+        <w:t xml:space="preserve">Fasilitas Kredit {{slik_bank_13_jenis | </w:t>
+      </w:r>
+      <w:r>
+        <w:rPr>
+          <w:rFonts w:hint="default" w:ascii="Kalinga" w:hAnsi="Kalinga"/>
+          <w:color w:val="auto"/>
+          <w:sz w:val="20"/>
+          <w:szCs w:val="20"/>
+          <w:lang w:val="en-US"/>
+        </w:rPr>
+        <w:t>default('', true)}} di Bank</w:t>
+      </w:r>
+      <w:r>
+        <w:rPr>
+          <w:rFonts w:hint="default" w:ascii="Kalinga" w:hAnsi="Kalinga"/>
+          <w:color w:val="auto"/>
+          <w:sz w:val="20"/>
+          <w:szCs w:val="20"/>
+        </w:rPr>
+        <w:t xml:space="preserve"> {{slik_bank_13_nama}} maks Rp. {{slik_bank_13_maks}} outs Rp. {{slik_bank_13_outs}} Coll {{slik_bank_13_coll}}.{% if slik_bank_13_alasan_aktif == 'ya' %} (Ket: {{ slik_bank_13_</w:t>
+      </w:r>
+      <w:r>
+        <w:rPr>
+          <w:rFonts w:hint="default" w:ascii="Kalinga" w:hAnsi="Kalinga"/>
+          <w:color w:val="auto"/>
+          <w:sz w:val="20"/>
+          <w:szCs w:val="20"/>
+          <w:lang w:val="en-US"/>
+        </w:rPr>
+        <w:t>alasan }}).</w:t>
+      </w:r>
+      <w:r>
+        <w:rPr>
+          <w:rFonts w:hint="default" w:ascii="Kalinga" w:hAnsi="Kalinga"/>
+          <w:color w:val="auto"/>
+          <w:sz w:val="20"/>
+          <w:szCs w:val="20"/>
+        </w:rPr>
+        <w:t xml:space="preserve">{% endif %}{% endif </w:t>
+      </w:r>
+      <w:r>
+        <w:rPr>
+          <w:rFonts w:hint="default" w:ascii="Kalinga" w:hAnsi="Kalinga"/>
+          <w:color w:val="auto"/>
+          <w:sz w:val="20"/>
+          <w:szCs w:val="20"/>
+          <w:lang w:val="en-US"/>
+        </w:rPr>
+        <w:t>%}{% if</w:t>
+      </w:r>
+      <w:r>
+        <w:rPr>
+          <w:rFonts w:hint="default" w:ascii="Kalinga" w:hAnsi="Kalinga"/>
+          <w:color w:val="auto"/>
+          <w:sz w:val="20"/>
+          <w:szCs w:val="20"/>
+        </w:rPr>
+        <w:t xml:space="preserve"> slik_bank_14_nama %}</w:t>
       </w:r>
     </w:p>
     <w:p>
@@ -1227,7 +1968,64 @@
           <w:sz w:val="20"/>
           <w:szCs w:val="20"/>
         </w:rPr>
-        <w:t>Fasilitas Kredit {{slik_bank_14_jenis | default('', true)}} di {{slik_bank_14_nama}} maks Rp. {{slik_bank_14_maks}} outs Rp. {{slik_bank_14_outs}} Coll {{slik_bank_14_coll}}.{% if slik_bank_14_alasan_aktif == 'ya' %} (Ket: {{ slik_bank_14_alasan }}){% endif %}{% endif %}{% if slik_bank_15_nama %}</w:t>
+        <w:t xml:space="preserve">Fasilitas Kredit {{slik_bank_14_jenis | </w:t>
+      </w:r>
+      <w:r>
+        <w:rPr>
+          <w:rFonts w:hint="default" w:ascii="Kalinga" w:hAnsi="Kalinga"/>
+          <w:color w:val="auto"/>
+          <w:sz w:val="20"/>
+          <w:szCs w:val="20"/>
+          <w:lang w:val="en-US"/>
+        </w:rPr>
+        <w:t>default('', true)}} di Bank</w:t>
+      </w:r>
+      <w:r>
+        <w:rPr>
+          <w:rFonts w:hint="default" w:ascii="Kalinga" w:hAnsi="Kalinga"/>
+          <w:color w:val="auto"/>
+          <w:sz w:val="20"/>
+          <w:szCs w:val="20"/>
+        </w:rPr>
+        <w:t xml:space="preserve"> {{slik_bank_14_nama}} maks Rp. {{slik_bank_14_maks}} outs Rp. {{slik_bank_14_outs}} Coll {{slik_bank_14_coll}}.{% if slik_bank_14_alasan_aktif == 'ya' %} (Ket: {{ slik_bank_14_</w:t>
+      </w:r>
+      <w:r>
+        <w:rPr>
+          <w:rFonts w:hint="default" w:ascii="Kalinga" w:hAnsi="Kalinga"/>
+          <w:color w:val="auto"/>
+          <w:sz w:val="20"/>
+          <w:szCs w:val="20"/>
+          <w:lang w:val="en-US"/>
+        </w:rPr>
+        <w:t>alasan }}).</w:t>
+      </w:r>
+      <w:r>
+        <w:rPr>
+          <w:rFonts w:hint="default" w:ascii="Kalinga" w:hAnsi="Kalinga"/>
+          <w:color w:val="auto"/>
+          <w:sz w:val="20"/>
+          <w:szCs w:val="20"/>
+        </w:rPr>
+        <w:t xml:space="preserve">{% endif %}{% endif </w:t>
+      </w:r>
+      <w:r>
+        <w:rPr>
+          <w:rFonts w:hint="default" w:ascii="Kalinga" w:hAnsi="Kalinga"/>
+          <w:color w:val="auto"/>
+          <w:sz w:val="20"/>
+          <w:szCs w:val="20"/>
+          <w:lang w:val="en-US"/>
+        </w:rPr>
+        <w:t>%}{% if</w:t>
+      </w:r>
+      <w:r>
+        <w:rPr>
+          <w:rFonts w:hint="default" w:ascii="Kalinga" w:hAnsi="Kalinga"/>
+          <w:color w:val="auto"/>
+          <w:sz w:val="20"/>
+          <w:szCs w:val="20"/>
+        </w:rPr>
+        <w:t xml:space="preserve"> slik_bank_15_nama %}</w:t>
       </w:r>
     </w:p>
     <w:p>
@@ -1255,17 +2053,55 @@
           <w:sz w:val="20"/>
           <w:szCs w:val="20"/>
         </w:rPr>
-        <w:t>Fasilitas Kredit {{slik_bank_15_jenis | default('', true)}} di {{slik_bank_15_nama}} maks Rp. {{slik_bank_15_maks}} outs Rp. {{slik_bank_15_outs}} Coll {{slik_bank_15_coll}}.{% if slik_bank_15_alasan_aktif == 'ya' %} (Ket: {{ slik_bank_15_alasan }}){% endif %}{% endif %}{% endif %}</w:t>
-      </w:r>
-      <w:r>
-        <w:rPr>
-          <w:rFonts w:hint="default" w:ascii="Kalinga" w:hAnsi="Kalinga"/>
-          <w:color w:val="auto"/>
-          <w:sz w:val="20"/>
-          <w:szCs w:val="20"/>
-          <w:lang w:val="en-US"/>
-        </w:rPr>
-        <w:t>{% if mitigasi_aktif == 'ya' and mitigasi_slik_no_surat %}</w:t>
+        <w:t xml:space="preserve">Fasilitas Kredit {{slik_bank_15_jenis | </w:t>
+      </w:r>
+      <w:r>
+        <w:rPr>
+          <w:rFonts w:hint="default" w:ascii="Kalinga" w:hAnsi="Kalinga"/>
+          <w:color w:val="auto"/>
+          <w:sz w:val="20"/>
+          <w:szCs w:val="20"/>
+          <w:lang w:val="en-US"/>
+        </w:rPr>
+        <w:t>default('', true)}} di Bank</w:t>
+      </w:r>
+      <w:r>
+        <w:rPr>
+          <w:rFonts w:hint="default" w:ascii="Kalinga" w:hAnsi="Kalinga"/>
+          <w:color w:val="auto"/>
+          <w:sz w:val="20"/>
+          <w:szCs w:val="20"/>
+        </w:rPr>
+        <w:t xml:space="preserve"> {{slik_bank_15_nama}} maks Rp. {{slik_bank_15_maks}} outs Rp. {{slik_bank_15_outs}} Coll {{slik_bank_15_coll}}.{% if slik_bank_15_alasan_aktif == 'ya' %} (Ket: {{ slik_bank_15_</w:t>
+      </w:r>
+      <w:r>
+        <w:rPr>
+          <w:rFonts w:hint="default" w:ascii="Kalinga" w:hAnsi="Kalinga"/>
+          <w:color w:val="auto"/>
+          <w:sz w:val="20"/>
+          <w:szCs w:val="20"/>
+          <w:lang w:val="en-US"/>
+        </w:rPr>
+        <w:t>alasan }}).</w:t>
+      </w:r>
+      <w:r>
+        <w:rPr>
+          <w:rFonts w:hint="default" w:ascii="Kalinga" w:hAnsi="Kalinga"/>
+          <w:color w:val="auto"/>
+          <w:sz w:val="20"/>
+          <w:szCs w:val="20"/>
+        </w:rPr>
+        <w:t xml:space="preserve">{% endif %}{% endif %}{% endif </w:t>
+      </w:r>
+      <w:r>
+        <w:rPr>
+          <w:rFonts w:hint="default" w:ascii="Kalinga" w:hAnsi="Kalinga"/>
+          <w:color w:val="auto"/>
+          <w:sz w:val="20"/>
+          <w:szCs w:val="20"/>
+          <w:lang w:val="en-US"/>
+        </w:rPr>
+        <w:t>%}{% if mitigasi_aktif == 'ya' and mitigasi_slik_no_surat %}</w:t>
       </w:r>
     </w:p>
     <w:p>
@@ -2038,7 +2874,22 @@
           <w:lang w:val="en-US"/>
         </w:rPr>
         <w:tab/>
-      </w:r>
+        <w:t/>
+      </w:r>
+      <w:r>
+        <w:rPr>
+          <w:rFonts w:hint="default" w:ascii="Kalinga" w:hAnsi="Kalinga"/>
+          <w:b/>
+          <w:bCs/>
+          <w:color w:val="auto"/>
+          <w:sz w:val="20"/>
+          <w:szCs w:val="20"/>
+          <w:lang w:val="en-US"/>
+        </w:rPr>
+        <w:tab/>
+      </w:r>
+      <w:bookmarkStart w:id="17" w:name="_GoBack"/>
+      <w:bookmarkEnd w:id="17"/>
       <w:r>
         <w:rPr>
           <w:rFonts w:hint="default" w:ascii="Kalinga" w:hAnsi="Kalinga"/>
@@ -2413,7 +3264,26 @@
           <w:sz w:val="20"/>
           <w:szCs w:val="20"/>
         </w:rPr>
-        <w:t>Nihil - Data Fasilitas Kredit tidak ditemukan.{% else %}{% if slik_bank_1_nama %}</w:t>
+        <w:t xml:space="preserve">Nihil - Data Fasilitas Kredit tidak ditemukan.{% else </w:t>
+      </w:r>
+      <w:r>
+        <w:rPr>
+          <w:rFonts w:hint="default" w:ascii="Kalinga" w:hAnsi="Kalinga"/>
+          <w:color w:val="auto"/>
+          <w:sz w:val="20"/>
+          <w:szCs w:val="20"/>
+          <w:lang w:val="en-US"/>
+        </w:rPr>
+        <w:t>%}{% if</w:t>
+      </w:r>
+      <w:r>
+        <w:rPr>
+          <w:rFonts w:hint="default" w:ascii="Kalinga" w:hAnsi="Kalinga"/>
+          <w:color w:val="auto"/>
+          <w:sz w:val="20"/>
+          <w:szCs w:val="20"/>
+        </w:rPr>
+        <w:t xml:space="preserve"> slik_bank_1_nama %}</w:t>
       </w:r>
       <w:r>
         <w:rPr>
@@ -2450,7 +3320,45 @@
           <w:sz w:val="20"/>
           <w:szCs w:val="20"/>
         </w:rPr>
-        <w:t>Fasilitas Kredit {{slik_bank_1_jenis | default('', true)}} di {{slik_bank_1_nama}} maks Rp. {{slik_bank_1_maks}} outs Rp. {{slik_bank_1_outs}} Coll {{slik_bank_1_coll}} : Rp. {{ slik_bank_1_angsuran | default('0', true) }},-{% endif %}{% if slik_bank_2_nama %}</w:t>
+        <w:t xml:space="preserve">Fasilitas Kredit {{slik_bank_1_jenis | </w:t>
+      </w:r>
+      <w:r>
+        <w:rPr>
+          <w:rFonts w:hint="default" w:ascii="Kalinga" w:hAnsi="Kalinga"/>
+          <w:color w:val="auto"/>
+          <w:sz w:val="20"/>
+          <w:szCs w:val="20"/>
+          <w:lang w:val="en-US"/>
+        </w:rPr>
+        <w:t>default('', true)}} di Bank</w:t>
+      </w:r>
+      <w:r>
+        <w:rPr>
+          <w:rFonts w:hint="default" w:ascii="Kalinga" w:hAnsi="Kalinga"/>
+          <w:color w:val="auto"/>
+          <w:sz w:val="20"/>
+          <w:szCs w:val="20"/>
+        </w:rPr>
+        <w:t xml:space="preserve"> {{slik_bank_1_nama}} maks Rp. {{slik_bank_1_maks}} outs Rp. {{slik_bank_1_outs}} Coll {{slik_bank_1_coll}} : Rp. {{ slik_bank_1_angsuran | default('0', true) }},-{% endif </w:t>
+      </w:r>
+      <w:r>
+        <w:rPr>
+          <w:rFonts w:hint="default" w:ascii="Kalinga" w:hAnsi="Kalinga"/>
+          <w:color w:val="auto"/>
+          <w:sz w:val="20"/>
+          <w:szCs w:val="20"/>
+          <w:lang w:val="en-US"/>
+        </w:rPr>
+        <w:t>%}{% if</w:t>
+      </w:r>
+      <w:r>
+        <w:rPr>
+          <w:rFonts w:hint="default" w:ascii="Kalinga" w:hAnsi="Kalinga"/>
+          <w:color w:val="auto"/>
+          <w:sz w:val="20"/>
+          <w:szCs w:val="20"/>
+        </w:rPr>
+        <w:t xml:space="preserve"> slik_bank_2_nama %}</w:t>
       </w:r>
     </w:p>
     <w:p>
@@ -2477,7 +3385,26 @@
           <w:sz w:val="20"/>
           <w:szCs w:val="20"/>
         </w:rPr>
-        <w:t xml:space="preserve">Fasilitas Kredit {{slik_bank_2_jenis | default('', true)}} di {{slik_bank_2_nama}} maks Rp. {{slik_bank_2_maks}} outs Rp. {{slik_bank_2_outs}} Coll {{slik_bank_2_coll}} : </w:t>
+        <w:t xml:space="preserve">Fasilitas Kredit {{slik_bank_2_jenis | </w:t>
+      </w:r>
+      <w:r>
+        <w:rPr>
+          <w:rFonts w:hint="default" w:ascii="Kalinga" w:hAnsi="Kalinga"/>
+          <w:color w:val="auto"/>
+          <w:sz w:val="20"/>
+          <w:szCs w:val="20"/>
+          <w:lang w:val="en-US"/>
+        </w:rPr>
+        <w:t>default('', true)}} di Bank</w:t>
+      </w:r>
+      <w:r>
+        <w:rPr>
+          <w:rFonts w:hint="default" w:ascii="Kalinga" w:hAnsi="Kalinga"/>
+          <w:color w:val="auto"/>
+          <w:sz w:val="20"/>
+          <w:szCs w:val="20"/>
+        </w:rPr>
+        <w:t xml:space="preserve"> {{slik_bank_2_nama}} maks Rp. {{slik_bank_2_maks}} outs Rp. {{slik_bank_2_outs}} Coll {{slik_bank_2_coll}} : </w:t>
       </w:r>
       <w:r>
         <w:rPr>
@@ -2495,7 +3422,26 @@
           <w:sz w:val="20"/>
           <w:szCs w:val="20"/>
         </w:rPr>
-        <w:t>Rp. {{ slik_bank_2_angsuran | default('0', true) }},-{% endif %}{% if slik_bank_3_nama %}</w:t>
+        <w:t xml:space="preserve">Rp. {{ slik_bank_2_angsuran | default('0', true) }},-{% endif </w:t>
+      </w:r>
+      <w:r>
+        <w:rPr>
+          <w:rFonts w:hint="default" w:ascii="Kalinga" w:hAnsi="Kalinga"/>
+          <w:color w:val="auto"/>
+          <w:sz w:val="20"/>
+          <w:szCs w:val="20"/>
+          <w:lang w:val="en-US"/>
+        </w:rPr>
+        <w:t>%}{% if</w:t>
+      </w:r>
+      <w:r>
+        <w:rPr>
+          <w:rFonts w:hint="default" w:ascii="Kalinga" w:hAnsi="Kalinga"/>
+          <w:color w:val="auto"/>
+          <w:sz w:val="20"/>
+          <w:szCs w:val="20"/>
+        </w:rPr>
+        <w:t xml:space="preserve"> slik_bank_3_nama %}</w:t>
       </w:r>
     </w:p>
     <w:p>
@@ -2522,7 +3468,26 @@
           <w:sz w:val="20"/>
           <w:szCs w:val="20"/>
         </w:rPr>
-        <w:t xml:space="preserve">Fasilitas Kredit {{slik_bank_3_jenis | default('', true)}} di {{slik_bank_3_nama}} maks Rp. {{slik_bank_3_maks}} outs Rp. {{slik_bank_3_outs}} Coll {{slik_bank_3_coll}} : </w:t>
+        <w:t xml:space="preserve">Fasilitas Kredit {{slik_bank_3_jenis | </w:t>
+      </w:r>
+      <w:r>
+        <w:rPr>
+          <w:rFonts w:hint="default" w:ascii="Kalinga" w:hAnsi="Kalinga"/>
+          <w:color w:val="auto"/>
+          <w:sz w:val="20"/>
+          <w:szCs w:val="20"/>
+          <w:lang w:val="en-US"/>
+        </w:rPr>
+        <w:t>default('', true)}} di Bank</w:t>
+      </w:r>
+      <w:r>
+        <w:rPr>
+          <w:rFonts w:hint="default" w:ascii="Kalinga" w:hAnsi="Kalinga"/>
+          <w:color w:val="auto"/>
+          <w:sz w:val="20"/>
+          <w:szCs w:val="20"/>
+        </w:rPr>
+        <w:t xml:space="preserve"> {{slik_bank_3_nama}} maks Rp. {{slik_bank_3_maks}} outs Rp. {{slik_bank_3_outs}} Coll {{slik_bank_3_coll}} : </w:t>
       </w:r>
       <w:r>
         <w:rPr>
@@ -2540,7 +3505,26 @@
           <w:sz w:val="20"/>
           <w:szCs w:val="20"/>
         </w:rPr>
-        <w:t>Rp. {{ slik_bank_3_angsuran | default('0', true) }},-{% endif %}{% if slik_bank_4_nama %}</w:t>
+        <w:t xml:space="preserve">Rp. {{ slik_bank_3_angsuran | default('0', true) }},-{% endif </w:t>
+      </w:r>
+      <w:r>
+        <w:rPr>
+          <w:rFonts w:hint="default" w:ascii="Kalinga" w:hAnsi="Kalinga"/>
+          <w:color w:val="auto"/>
+          <w:sz w:val="20"/>
+          <w:szCs w:val="20"/>
+          <w:lang w:val="en-US"/>
+        </w:rPr>
+        <w:t>%}{% if</w:t>
+      </w:r>
+      <w:r>
+        <w:rPr>
+          <w:rFonts w:hint="default" w:ascii="Kalinga" w:hAnsi="Kalinga"/>
+          <w:color w:val="auto"/>
+          <w:sz w:val="20"/>
+          <w:szCs w:val="20"/>
+        </w:rPr>
+        <w:t xml:space="preserve"> slik_bank_4_nama %}</w:t>
       </w:r>
     </w:p>
     <w:p>
@@ -2567,7 +3551,26 @@
           <w:sz w:val="20"/>
           <w:szCs w:val="20"/>
         </w:rPr>
-        <w:t xml:space="preserve">Fasilitas Kredit {{slik_bank_4_jenis | default('', true)}} di {{slik_bank_4_nama}} maks Rp. {{slik_bank_4_maks}} outs Rp. {{slik_bank_4_outs}} Coll {{slik_bank_4_coll}} : </w:t>
+        <w:t xml:space="preserve">Fasilitas Kredit {{slik_bank_4_jenis | </w:t>
+      </w:r>
+      <w:r>
+        <w:rPr>
+          <w:rFonts w:hint="default" w:ascii="Kalinga" w:hAnsi="Kalinga"/>
+          <w:color w:val="auto"/>
+          <w:sz w:val="20"/>
+          <w:szCs w:val="20"/>
+          <w:lang w:val="en-US"/>
+        </w:rPr>
+        <w:t>default('', true)}} di Bank</w:t>
+      </w:r>
+      <w:r>
+        <w:rPr>
+          <w:rFonts w:hint="default" w:ascii="Kalinga" w:hAnsi="Kalinga"/>
+          <w:color w:val="auto"/>
+          <w:sz w:val="20"/>
+          <w:szCs w:val="20"/>
+        </w:rPr>
+        <w:t xml:space="preserve"> {{slik_bank_4_nama}} maks Rp. {{slik_bank_4_maks}} outs Rp. {{slik_bank_4_outs}} Coll {{slik_bank_4_coll}} : </w:t>
       </w:r>
       <w:r>
         <w:rPr>
@@ -2585,7 +3588,26 @@
           <w:sz w:val="20"/>
           <w:szCs w:val="20"/>
         </w:rPr>
-        <w:t>Rp. {{ slik_bank_4_angsuran | default('0', true) }},-{% endif %}{% if slik_bank_5_nama %}</w:t>
+        <w:t xml:space="preserve">Rp. {{ slik_bank_4_angsuran | default('0', true) }},-{% endif </w:t>
+      </w:r>
+      <w:r>
+        <w:rPr>
+          <w:rFonts w:hint="default" w:ascii="Kalinga" w:hAnsi="Kalinga"/>
+          <w:color w:val="auto"/>
+          <w:sz w:val="20"/>
+          <w:szCs w:val="20"/>
+          <w:lang w:val="en-US"/>
+        </w:rPr>
+        <w:t>%}{% if</w:t>
+      </w:r>
+      <w:r>
+        <w:rPr>
+          <w:rFonts w:hint="default" w:ascii="Kalinga" w:hAnsi="Kalinga"/>
+          <w:color w:val="auto"/>
+          <w:sz w:val="20"/>
+          <w:szCs w:val="20"/>
+        </w:rPr>
+        <w:t xml:space="preserve"> slik_bank_5_nama %}</w:t>
       </w:r>
     </w:p>
     <w:p>
@@ -2612,7 +3634,26 @@
           <w:sz w:val="20"/>
           <w:szCs w:val="20"/>
         </w:rPr>
-        <w:t xml:space="preserve">Fasilitas Kredit {{slik_bank_5_jenis | default('', true)}} di {{slik_bank_5_nama}} maks Rp. {{slik_bank_5_maks}} outs Rp. {{slik_bank_5_outs}} Coll {{slik_bank_5_coll}} : </w:t>
+        <w:t xml:space="preserve">Fasilitas Kredit {{slik_bank_5_jenis | </w:t>
+      </w:r>
+      <w:r>
+        <w:rPr>
+          <w:rFonts w:hint="default" w:ascii="Kalinga" w:hAnsi="Kalinga"/>
+          <w:color w:val="auto"/>
+          <w:sz w:val="20"/>
+          <w:szCs w:val="20"/>
+          <w:lang w:val="en-US"/>
+        </w:rPr>
+        <w:t>default('', true)}} di Bank</w:t>
+      </w:r>
+      <w:r>
+        <w:rPr>
+          <w:rFonts w:hint="default" w:ascii="Kalinga" w:hAnsi="Kalinga"/>
+          <w:color w:val="auto"/>
+          <w:sz w:val="20"/>
+          <w:szCs w:val="20"/>
+        </w:rPr>
+        <w:t xml:space="preserve"> {{slik_bank_5_nama}} maks Rp. {{slik_bank_5_maks}} outs Rp. {{slik_bank_5_outs}} Coll {{slik_bank_5_coll}} : </w:t>
       </w:r>
       <w:r>
         <w:rPr>
@@ -2630,7 +3671,26 @@
           <w:sz w:val="20"/>
           <w:szCs w:val="20"/>
         </w:rPr>
-        <w:t>Rp. {{ slik_bank_5_angsuran | default('0', true) }},-{% endif %}{% if slik_bank_6_nama %}</w:t>
+        <w:t xml:space="preserve">Rp. {{ slik_bank_5_angsuran | default('0', true) }},-{% endif </w:t>
+      </w:r>
+      <w:r>
+        <w:rPr>
+          <w:rFonts w:hint="default" w:ascii="Kalinga" w:hAnsi="Kalinga"/>
+          <w:color w:val="auto"/>
+          <w:sz w:val="20"/>
+          <w:szCs w:val="20"/>
+          <w:lang w:val="en-US"/>
+        </w:rPr>
+        <w:t>%}{% if</w:t>
+      </w:r>
+      <w:r>
+        <w:rPr>
+          <w:rFonts w:hint="default" w:ascii="Kalinga" w:hAnsi="Kalinga"/>
+          <w:color w:val="auto"/>
+          <w:sz w:val="20"/>
+          <w:szCs w:val="20"/>
+        </w:rPr>
+        <w:t xml:space="preserve"> slik_bank_6_nama %}</w:t>
       </w:r>
     </w:p>
     <w:p>
@@ -2657,7 +3717,26 @@
           <w:sz w:val="20"/>
           <w:szCs w:val="20"/>
         </w:rPr>
-        <w:t xml:space="preserve">Fasilitas Kredit {{slik_bank_6_jenis | default('', true)}} di {{slik_bank_6_nama}} maks Rp. {{slik_bank_6_maks}} outs Rp. {{slik_bank_6_outs}} Coll {{slik_bank_6_coll}} : </w:t>
+        <w:t xml:space="preserve">Fasilitas Kredit {{slik_bank_6_jenis | </w:t>
+      </w:r>
+      <w:r>
+        <w:rPr>
+          <w:rFonts w:hint="default" w:ascii="Kalinga" w:hAnsi="Kalinga"/>
+          <w:color w:val="auto"/>
+          <w:sz w:val="20"/>
+          <w:szCs w:val="20"/>
+          <w:lang w:val="en-US"/>
+        </w:rPr>
+        <w:t>default('', true)}} di Bank</w:t>
+      </w:r>
+      <w:r>
+        <w:rPr>
+          <w:rFonts w:hint="default" w:ascii="Kalinga" w:hAnsi="Kalinga"/>
+          <w:color w:val="auto"/>
+          <w:sz w:val="20"/>
+          <w:szCs w:val="20"/>
+        </w:rPr>
+        <w:t xml:space="preserve"> {{slik_bank_6_nama}} maks Rp. {{slik_bank_6_maks}} outs Rp. {{slik_bank_6_outs}} Coll {{slik_bank_6_coll}} : </w:t>
       </w:r>
       <w:r>
         <w:rPr>
@@ -2675,7 +3754,26 @@
           <w:sz w:val="20"/>
           <w:szCs w:val="20"/>
         </w:rPr>
-        <w:t>Rp. {{ slik_bank_6_angsuran | default('0', true) }},-{% endif %}{% if slik_bank_7_nama %}</w:t>
+        <w:t xml:space="preserve">Rp. {{ slik_bank_6_angsuran | default('0', true) }},-{% endif </w:t>
+      </w:r>
+      <w:r>
+        <w:rPr>
+          <w:rFonts w:hint="default" w:ascii="Kalinga" w:hAnsi="Kalinga"/>
+          <w:color w:val="auto"/>
+          <w:sz w:val="20"/>
+          <w:szCs w:val="20"/>
+          <w:lang w:val="en-US"/>
+        </w:rPr>
+        <w:t>%}{% if</w:t>
+      </w:r>
+      <w:r>
+        <w:rPr>
+          <w:rFonts w:hint="default" w:ascii="Kalinga" w:hAnsi="Kalinga"/>
+          <w:color w:val="auto"/>
+          <w:sz w:val="20"/>
+          <w:szCs w:val="20"/>
+        </w:rPr>
+        <w:t xml:space="preserve"> slik_bank_7_nama %}</w:t>
       </w:r>
     </w:p>
     <w:p>
@@ -2702,7 +3800,26 @@
           <w:sz w:val="20"/>
           <w:szCs w:val="20"/>
         </w:rPr>
-        <w:t xml:space="preserve">Fasilitas Kredit {{slik_bank_7_jenis | default('', true)}} di {{slik_bank_7_nama}} maks Rp. {{slik_bank_7_maks}} outs Rp. {{slik_bank_7_outs}} Coll {{slik_bank_7_coll}} : </w:t>
+        <w:t xml:space="preserve">Fasilitas Kredit {{slik_bank_7_jenis | </w:t>
+      </w:r>
+      <w:r>
+        <w:rPr>
+          <w:rFonts w:hint="default" w:ascii="Kalinga" w:hAnsi="Kalinga"/>
+          <w:color w:val="auto"/>
+          <w:sz w:val="20"/>
+          <w:szCs w:val="20"/>
+          <w:lang w:val="en-US"/>
+        </w:rPr>
+        <w:t>default('', true)}} di Bank</w:t>
+      </w:r>
+      <w:r>
+        <w:rPr>
+          <w:rFonts w:hint="default" w:ascii="Kalinga" w:hAnsi="Kalinga"/>
+          <w:color w:val="auto"/>
+          <w:sz w:val="20"/>
+          <w:szCs w:val="20"/>
+        </w:rPr>
+        <w:t xml:space="preserve"> {{slik_bank_7_nama}} maks Rp. {{slik_bank_7_maks}} outs Rp. {{slik_bank_7_outs}} Coll {{slik_bank_7_coll}} : </w:t>
       </w:r>
       <w:r>
         <w:rPr>
@@ -2720,7 +3837,26 @@
           <w:sz w:val="20"/>
           <w:szCs w:val="20"/>
         </w:rPr>
-        <w:t>Rp. {{ slik_bank_7_angsuran | default('0', true) }},-{% endif %}{% if slik_bank_8_nama %}</w:t>
+        <w:t xml:space="preserve">Rp. {{ slik_bank_7_angsuran | default('0', true) }},-{% endif </w:t>
+      </w:r>
+      <w:r>
+        <w:rPr>
+          <w:rFonts w:hint="default" w:ascii="Kalinga" w:hAnsi="Kalinga"/>
+          <w:color w:val="auto"/>
+          <w:sz w:val="20"/>
+          <w:szCs w:val="20"/>
+          <w:lang w:val="en-US"/>
+        </w:rPr>
+        <w:t>%}{% if</w:t>
+      </w:r>
+      <w:r>
+        <w:rPr>
+          <w:rFonts w:hint="default" w:ascii="Kalinga" w:hAnsi="Kalinga"/>
+          <w:color w:val="auto"/>
+          <w:sz w:val="20"/>
+          <w:szCs w:val="20"/>
+        </w:rPr>
+        <w:t xml:space="preserve"> slik_bank_8_nama %}</w:t>
       </w:r>
     </w:p>
     <w:p>
@@ -2747,7 +3883,26 @@
           <w:sz w:val="20"/>
           <w:szCs w:val="20"/>
         </w:rPr>
-        <w:t xml:space="preserve">Fasilitas Kredit {{slik_bank_8_jenis | default('', true)}} di {{slik_bank_8_nama}} maks Rp. {{slik_bank_8_maks}} outs Rp. {{slik_bank_8_outs}} Coll {{slik_bank_8_coll}} : </w:t>
+        <w:t xml:space="preserve">Fasilitas Kredit {{slik_bank_8_jenis | </w:t>
+      </w:r>
+      <w:r>
+        <w:rPr>
+          <w:rFonts w:hint="default" w:ascii="Kalinga" w:hAnsi="Kalinga"/>
+          <w:color w:val="auto"/>
+          <w:sz w:val="20"/>
+          <w:szCs w:val="20"/>
+          <w:lang w:val="en-US"/>
+        </w:rPr>
+        <w:t>default('', true)}} di Bank</w:t>
+      </w:r>
+      <w:r>
+        <w:rPr>
+          <w:rFonts w:hint="default" w:ascii="Kalinga" w:hAnsi="Kalinga"/>
+          <w:color w:val="auto"/>
+          <w:sz w:val="20"/>
+          <w:szCs w:val="20"/>
+        </w:rPr>
+        <w:t xml:space="preserve"> {{slik_bank_8_nama}} maks Rp. {{slik_bank_8_maks}} outs Rp. {{slik_bank_8_outs}} Coll {{slik_bank_8_coll}} : </w:t>
       </w:r>
       <w:r>
         <w:rPr>
@@ -2765,7 +3920,26 @@
           <w:sz w:val="20"/>
           <w:szCs w:val="20"/>
         </w:rPr>
-        <w:t>Rp. {{ slik_bank_8_angsuran | default('0', true) }},-{% endif %}{% if slik_bank_9_nama %}</w:t>
+        <w:t xml:space="preserve">Rp. {{ slik_bank_8_angsuran | default('0', true) }},-{% endif </w:t>
+      </w:r>
+      <w:r>
+        <w:rPr>
+          <w:rFonts w:hint="default" w:ascii="Kalinga" w:hAnsi="Kalinga"/>
+          <w:color w:val="auto"/>
+          <w:sz w:val="20"/>
+          <w:szCs w:val="20"/>
+          <w:lang w:val="en-US"/>
+        </w:rPr>
+        <w:t>%}{% if</w:t>
+      </w:r>
+      <w:r>
+        <w:rPr>
+          <w:rFonts w:hint="default" w:ascii="Kalinga" w:hAnsi="Kalinga"/>
+          <w:color w:val="auto"/>
+          <w:sz w:val="20"/>
+          <w:szCs w:val="20"/>
+        </w:rPr>
+        <w:t xml:space="preserve"> slik_bank_9_nama %}</w:t>
       </w:r>
     </w:p>
     <w:p>
@@ -2792,7 +3966,26 @@
           <w:sz w:val="20"/>
           <w:szCs w:val="20"/>
         </w:rPr>
-        <w:t xml:space="preserve">Fasilitas Kredit {{slik_bank_9_jenis | default('', true)}} di {{slik_bank_9_nama}} maks Rp. {{slik_bank_9_maks}} outs Rp. {{slik_bank_9_outs}} Coll {{slik_bank_9_coll}} : </w:t>
+        <w:t xml:space="preserve">Fasilitas Kredit {{slik_bank_9_jenis | </w:t>
+      </w:r>
+      <w:r>
+        <w:rPr>
+          <w:rFonts w:hint="default" w:ascii="Kalinga" w:hAnsi="Kalinga"/>
+          <w:color w:val="auto"/>
+          <w:sz w:val="20"/>
+          <w:szCs w:val="20"/>
+          <w:lang w:val="en-US"/>
+        </w:rPr>
+        <w:t>default('', true)}} di Bank</w:t>
+      </w:r>
+      <w:r>
+        <w:rPr>
+          <w:rFonts w:hint="default" w:ascii="Kalinga" w:hAnsi="Kalinga"/>
+          <w:color w:val="auto"/>
+          <w:sz w:val="20"/>
+          <w:szCs w:val="20"/>
+        </w:rPr>
+        <w:t xml:space="preserve"> {{slik_bank_9_nama}} maks Rp. {{slik_bank_9_maks}} outs Rp. {{slik_bank_9_outs}} Coll {{slik_bank_9_coll}} : </w:t>
       </w:r>
       <w:r>
         <w:rPr>
@@ -2810,7 +4003,26 @@
           <w:sz w:val="20"/>
           <w:szCs w:val="20"/>
         </w:rPr>
-        <w:t>Rp. {{ slik_bank_9_angsuran | default('0', true) }},-{% endif %}{% if slik_bank_10_nama %}</w:t>
+        <w:t xml:space="preserve">Rp. {{ slik_bank_9_angsuran | default('0', true) }},-{% endif </w:t>
+      </w:r>
+      <w:r>
+        <w:rPr>
+          <w:rFonts w:hint="default" w:ascii="Kalinga" w:hAnsi="Kalinga"/>
+          <w:color w:val="auto"/>
+          <w:sz w:val="20"/>
+          <w:szCs w:val="20"/>
+          <w:lang w:val="en-US"/>
+        </w:rPr>
+        <w:t>%}{% if</w:t>
+      </w:r>
+      <w:r>
+        <w:rPr>
+          <w:rFonts w:hint="default" w:ascii="Kalinga" w:hAnsi="Kalinga"/>
+          <w:color w:val="auto"/>
+          <w:sz w:val="20"/>
+          <w:szCs w:val="20"/>
+        </w:rPr>
+        <w:t xml:space="preserve"> slik_bank_10_nama %}</w:t>
       </w:r>
     </w:p>
     <w:p>
@@ -2837,7 +4049,26 @@
           <w:sz w:val="20"/>
           <w:szCs w:val="20"/>
         </w:rPr>
-        <w:t xml:space="preserve">Fasilitas Kredit {{slik_bank_10_jenis | default('', true)}} di {{slik_bank_10_nama}} maks Rp. {{slik_bank_10_maks}} outs Rp. {{slik_bank_10_outs}} Coll {{slik_bank_10_coll}} : </w:t>
+        <w:t xml:space="preserve">Fasilitas Kredit {{slik_bank_10_jenis | </w:t>
+      </w:r>
+      <w:r>
+        <w:rPr>
+          <w:rFonts w:hint="default" w:ascii="Kalinga" w:hAnsi="Kalinga"/>
+          <w:color w:val="auto"/>
+          <w:sz w:val="20"/>
+          <w:szCs w:val="20"/>
+          <w:lang w:val="en-US"/>
+        </w:rPr>
+        <w:t>default('', true)}} di Bank</w:t>
+      </w:r>
+      <w:r>
+        <w:rPr>
+          <w:rFonts w:hint="default" w:ascii="Kalinga" w:hAnsi="Kalinga"/>
+          <w:color w:val="auto"/>
+          <w:sz w:val="20"/>
+          <w:szCs w:val="20"/>
+        </w:rPr>
+        <w:t xml:space="preserve"> {{slik_bank_10_nama}} maks Rp. {{slik_bank_10_maks}} outs Rp. {{slik_bank_10_outs}} Coll {{slik_bank_10_coll}} : </w:t>
       </w:r>
       <w:r>
         <w:rPr>
@@ -2855,7 +4086,26 @@
           <w:sz w:val="20"/>
           <w:szCs w:val="20"/>
         </w:rPr>
-        <w:t>Rp. {{ slik_bank_10_angsuran | default('0', true) }},-{% endif %}{% if slik_bank_11_nama %}</w:t>
+        <w:t xml:space="preserve">Rp. {{ slik_bank_10_angsuran | default('0', true) }},-{% endif </w:t>
+      </w:r>
+      <w:r>
+        <w:rPr>
+          <w:rFonts w:hint="default" w:ascii="Kalinga" w:hAnsi="Kalinga"/>
+          <w:color w:val="auto"/>
+          <w:sz w:val="20"/>
+          <w:szCs w:val="20"/>
+          <w:lang w:val="en-US"/>
+        </w:rPr>
+        <w:t>%}{% if</w:t>
+      </w:r>
+      <w:r>
+        <w:rPr>
+          <w:rFonts w:hint="default" w:ascii="Kalinga" w:hAnsi="Kalinga"/>
+          <w:color w:val="auto"/>
+          <w:sz w:val="20"/>
+          <w:szCs w:val="20"/>
+        </w:rPr>
+        <w:t xml:space="preserve"> slik_bank_11_nama %}</w:t>
       </w:r>
     </w:p>
     <w:p>
@@ -2882,7 +4132,26 @@
           <w:sz w:val="20"/>
           <w:szCs w:val="20"/>
         </w:rPr>
-        <w:t xml:space="preserve">Fasilitas Kredit {{slik_bank_11_jenis | default('', true)}} di {{slik_bank_11_nama}} maks Rp. {{slik_bank_11_maks}} outs Rp. {{slik_bank_11_outs}} Coll {{slik_bank_11_coll}} : </w:t>
+        <w:t xml:space="preserve">Fasilitas Kredit {{slik_bank_11_jenis | </w:t>
+      </w:r>
+      <w:r>
+        <w:rPr>
+          <w:rFonts w:hint="default" w:ascii="Kalinga" w:hAnsi="Kalinga"/>
+          <w:color w:val="auto"/>
+          <w:sz w:val="20"/>
+          <w:szCs w:val="20"/>
+          <w:lang w:val="en-US"/>
+        </w:rPr>
+        <w:t>default('', true)}} di Bank</w:t>
+      </w:r>
+      <w:r>
+        <w:rPr>
+          <w:rFonts w:hint="default" w:ascii="Kalinga" w:hAnsi="Kalinga"/>
+          <w:color w:val="auto"/>
+          <w:sz w:val="20"/>
+          <w:szCs w:val="20"/>
+        </w:rPr>
+        <w:t xml:space="preserve"> {{slik_bank_11_nama}} maks Rp. {{slik_bank_11_maks}} outs Rp. {{slik_bank_11_outs}} Coll {{slik_bank_11_coll}} : </w:t>
       </w:r>
       <w:r>
         <w:rPr>
@@ -2900,7 +4169,26 @@
           <w:sz w:val="20"/>
           <w:szCs w:val="20"/>
         </w:rPr>
-        <w:t>Rp. {{ slik_bank_11_angsuran | default('0', true) }},-{% endif %}{% if slik_bank_12_nama %}</w:t>
+        <w:t xml:space="preserve">Rp. {{ slik_bank_11_angsuran | default('0', true) }},-{% endif </w:t>
+      </w:r>
+      <w:r>
+        <w:rPr>
+          <w:rFonts w:hint="default" w:ascii="Kalinga" w:hAnsi="Kalinga"/>
+          <w:color w:val="auto"/>
+          <w:sz w:val="20"/>
+          <w:szCs w:val="20"/>
+          <w:lang w:val="en-US"/>
+        </w:rPr>
+        <w:t>%}{% if</w:t>
+      </w:r>
+      <w:r>
+        <w:rPr>
+          <w:rFonts w:hint="default" w:ascii="Kalinga" w:hAnsi="Kalinga"/>
+          <w:color w:val="auto"/>
+          <w:sz w:val="20"/>
+          <w:szCs w:val="20"/>
+        </w:rPr>
+        <w:t xml:space="preserve"> slik_bank_12_nama %}</w:t>
       </w:r>
     </w:p>
     <w:p>
@@ -2927,7 +4215,26 @@
           <w:sz w:val="20"/>
           <w:szCs w:val="20"/>
         </w:rPr>
-        <w:t xml:space="preserve">Fasilitas Kredit {{slik_bank_12_jenis | default('', true)}} di {{slik_bank_12_nama}} maks Rp. {{slik_bank_12_maks}} outs Rp. {{slik_bank_12_outs}} Coll {{slik_bank_12_coll}} : </w:t>
+        <w:t xml:space="preserve">Fasilitas Kredit {{slik_bank_12_jenis | </w:t>
+      </w:r>
+      <w:r>
+        <w:rPr>
+          <w:rFonts w:hint="default" w:ascii="Kalinga" w:hAnsi="Kalinga"/>
+          <w:color w:val="auto"/>
+          <w:sz w:val="20"/>
+          <w:szCs w:val="20"/>
+          <w:lang w:val="en-US"/>
+        </w:rPr>
+        <w:t>default('', true)}} di Bank</w:t>
+      </w:r>
+      <w:r>
+        <w:rPr>
+          <w:rFonts w:hint="default" w:ascii="Kalinga" w:hAnsi="Kalinga"/>
+          <w:color w:val="auto"/>
+          <w:sz w:val="20"/>
+          <w:szCs w:val="20"/>
+        </w:rPr>
+        <w:t xml:space="preserve"> {{slik_bank_12_nama}} maks Rp. {{slik_bank_12_maks}} outs Rp. {{slik_bank_12_outs}} Coll {{slik_bank_12_coll}} : </w:t>
       </w:r>
       <w:r>
         <w:rPr>
@@ -2945,7 +4252,26 @@
           <w:sz w:val="20"/>
           <w:szCs w:val="20"/>
         </w:rPr>
-        <w:t>Rp. {{ slik_bank_12_angsuran | default('0', true) }},-{% endif %}{% if slik_bank_13_nama %}</w:t>
+        <w:t xml:space="preserve">Rp. {{ slik_bank_12_angsuran | default('0', true) }},-{% endif </w:t>
+      </w:r>
+      <w:r>
+        <w:rPr>
+          <w:rFonts w:hint="default" w:ascii="Kalinga" w:hAnsi="Kalinga"/>
+          <w:color w:val="auto"/>
+          <w:sz w:val="20"/>
+          <w:szCs w:val="20"/>
+          <w:lang w:val="en-US"/>
+        </w:rPr>
+        <w:t>%}{% if</w:t>
+      </w:r>
+      <w:r>
+        <w:rPr>
+          <w:rFonts w:hint="default" w:ascii="Kalinga" w:hAnsi="Kalinga"/>
+          <w:color w:val="auto"/>
+          <w:sz w:val="20"/>
+          <w:szCs w:val="20"/>
+        </w:rPr>
+        <w:t xml:space="preserve"> slik_bank_13_nama %}</w:t>
       </w:r>
     </w:p>
     <w:p>
@@ -2972,7 +4298,26 @@
           <w:sz w:val="20"/>
           <w:szCs w:val="20"/>
         </w:rPr>
-        <w:t xml:space="preserve">Fasilitas Kredit {{slik_bank_13_jenis | default('', true)}} di {{slik_bank_13_nama}} maks Rp. {{slik_bank_13_maks}} outs Rp. {{slik_bank_13_outs}} Coll {{slik_bank_13_coll}} : </w:t>
+        <w:t xml:space="preserve">Fasilitas Kredit {{slik_bank_13_jenis | </w:t>
+      </w:r>
+      <w:r>
+        <w:rPr>
+          <w:rFonts w:hint="default" w:ascii="Kalinga" w:hAnsi="Kalinga"/>
+          <w:color w:val="auto"/>
+          <w:sz w:val="20"/>
+          <w:szCs w:val="20"/>
+          <w:lang w:val="en-US"/>
+        </w:rPr>
+        <w:t>default('', true)}} di Bank</w:t>
+      </w:r>
+      <w:r>
+        <w:rPr>
+          <w:rFonts w:hint="default" w:ascii="Kalinga" w:hAnsi="Kalinga"/>
+          <w:color w:val="auto"/>
+          <w:sz w:val="20"/>
+          <w:szCs w:val="20"/>
+        </w:rPr>
+        <w:t xml:space="preserve"> {{slik_bank_13_nama}} maks Rp. {{slik_bank_13_maks}} outs Rp. {{slik_bank_13_outs}} Coll {{slik_bank_13_coll}} : </w:t>
       </w:r>
       <w:r>
         <w:rPr>
@@ -2990,7 +4335,26 @@
           <w:sz w:val="20"/>
           <w:szCs w:val="20"/>
         </w:rPr>
-        <w:t>Rp. {{ slik_bank_13_angsuran | default('0', true) }},-{% endif %}{% if slik_bank_14_nama %}</w:t>
+        <w:t xml:space="preserve">Rp. {{ slik_bank_13_angsuran | default('0', true) }},-{% endif </w:t>
+      </w:r>
+      <w:r>
+        <w:rPr>
+          <w:rFonts w:hint="default" w:ascii="Kalinga" w:hAnsi="Kalinga"/>
+          <w:color w:val="auto"/>
+          <w:sz w:val="20"/>
+          <w:szCs w:val="20"/>
+          <w:lang w:val="en-US"/>
+        </w:rPr>
+        <w:t>%}{% if</w:t>
+      </w:r>
+      <w:r>
+        <w:rPr>
+          <w:rFonts w:hint="default" w:ascii="Kalinga" w:hAnsi="Kalinga"/>
+          <w:color w:val="auto"/>
+          <w:sz w:val="20"/>
+          <w:szCs w:val="20"/>
+        </w:rPr>
+        <w:t xml:space="preserve"> slik_bank_14_nama %}</w:t>
       </w:r>
     </w:p>
     <w:p>
@@ -3017,7 +4381,26 @@
           <w:sz w:val="20"/>
           <w:szCs w:val="20"/>
         </w:rPr>
-        <w:t xml:space="preserve">Fasilitas Kredit {{slik_bank_14_jenis | default('', true)}} di {{slik_bank_14_nama}} maks Rp. {{slik_bank_14_maks}} outs Rp. {{slik_bank_14_outs}} Coll {{slik_bank_14_coll}} : </w:t>
+        <w:t xml:space="preserve">Fasilitas Kredit {{slik_bank_14_jenis | </w:t>
+      </w:r>
+      <w:r>
+        <w:rPr>
+          <w:rFonts w:hint="default" w:ascii="Kalinga" w:hAnsi="Kalinga"/>
+          <w:color w:val="auto"/>
+          <w:sz w:val="20"/>
+          <w:szCs w:val="20"/>
+          <w:lang w:val="en-US"/>
+        </w:rPr>
+        <w:t>default('', true)}} di Bank</w:t>
+      </w:r>
+      <w:r>
+        <w:rPr>
+          <w:rFonts w:hint="default" w:ascii="Kalinga" w:hAnsi="Kalinga"/>
+          <w:color w:val="auto"/>
+          <w:sz w:val="20"/>
+          <w:szCs w:val="20"/>
+        </w:rPr>
+        <w:t xml:space="preserve"> {{slik_bank_14_nama}} maks Rp. {{slik_bank_14_maks}} outs Rp. {{slik_bank_14_outs}} Coll {{slik_bank_14_coll}} : </w:t>
       </w:r>
       <w:r>
         <w:rPr>
@@ -3035,7 +4418,26 @@
           <w:sz w:val="20"/>
           <w:szCs w:val="20"/>
         </w:rPr>
-        <w:t>Rp. {{ slik_bank_14_angsuran | default('0', true) }},-{% endif %}{% if slik_bank_15_nama %}</w:t>
+        <w:t xml:space="preserve">Rp. {{ slik_bank_14_angsuran | default('0', true) }},-{% endif </w:t>
+      </w:r>
+      <w:r>
+        <w:rPr>
+          <w:rFonts w:hint="default" w:ascii="Kalinga" w:hAnsi="Kalinga"/>
+          <w:color w:val="auto"/>
+          <w:sz w:val="20"/>
+          <w:szCs w:val="20"/>
+          <w:lang w:val="en-US"/>
+        </w:rPr>
+        <w:t>%}{% if</w:t>
+      </w:r>
+      <w:r>
+        <w:rPr>
+          <w:rFonts w:hint="default" w:ascii="Kalinga" w:hAnsi="Kalinga"/>
+          <w:color w:val="auto"/>
+          <w:sz w:val="20"/>
+          <w:szCs w:val="20"/>
+        </w:rPr>
+        <w:t xml:space="preserve"> slik_bank_15_nama %}</w:t>
       </w:r>
     </w:p>
     <w:p>
@@ -3062,7 +4464,26 @@
           <w:sz w:val="20"/>
           <w:szCs w:val="20"/>
         </w:rPr>
-        <w:t xml:space="preserve">Fasilitas Kredit {{slik_bank_15_jenis | default('', true)}} di {{slik_bank_15_nama}} maks Rp. {{slik_bank_15_maks}} outs Rp. {{slik_bank_15_outs}} Coll {{slik_bank_15_coll}} : </w:t>
+        <w:t xml:space="preserve">Fasilitas Kredit {{slik_bank_15_jenis | </w:t>
+      </w:r>
+      <w:r>
+        <w:rPr>
+          <w:rFonts w:hint="default" w:ascii="Kalinga" w:hAnsi="Kalinga"/>
+          <w:color w:val="auto"/>
+          <w:sz w:val="20"/>
+          <w:szCs w:val="20"/>
+          <w:lang w:val="en-US"/>
+        </w:rPr>
+        <w:t>default('', true)}} di Bank</w:t>
+      </w:r>
+      <w:r>
+        <w:rPr>
+          <w:rFonts w:hint="default" w:ascii="Kalinga" w:hAnsi="Kalinga"/>
+          <w:color w:val="auto"/>
+          <w:sz w:val="20"/>
+          <w:szCs w:val="20"/>
+        </w:rPr>
+        <w:t xml:space="preserve"> {{slik_bank_15_nama}} maks Rp. {{slik_bank_15_maks}} outs Rp. {{slik_bank_15_outs}} Coll {{slik_bank_15_coll}} : </w:t>
       </w:r>
       <w:r>
         <w:rPr>
@@ -3665,14 +5086,14 @@
       <w:bookmarkStart w:id="3" w:name="OLE_LINK19"/>
       <w:bookmarkStart w:id="4" w:name="OLE_LINK17"/>
       <w:bookmarkStart w:id="5" w:name="OLE_LINK8"/>
-      <w:bookmarkStart w:id="6" w:name="OLE_LINK24"/>
-      <w:bookmarkStart w:id="7" w:name="OLE_LINK27"/>
-      <w:bookmarkStart w:id="8" w:name="OLE_LINK41"/>
-      <w:bookmarkStart w:id="9" w:name="OLE_LINK32"/>
-      <w:bookmarkStart w:id="10" w:name="OLE_LINK3"/>
-      <w:bookmarkStart w:id="11" w:name="OLE_LINK23"/>
-      <w:bookmarkStart w:id="12" w:name="OLE_LINK33"/>
-      <w:bookmarkStart w:id="13" w:name="OLE_LINK10"/>
+      <w:bookmarkStart w:id="6" w:name="OLE_LINK27"/>
+      <w:bookmarkStart w:id="7" w:name="OLE_LINK24"/>
+      <w:bookmarkStart w:id="8" w:name="OLE_LINK10"/>
+      <w:bookmarkStart w:id="9" w:name="OLE_LINK3"/>
+      <w:bookmarkStart w:id="10" w:name="OLE_LINK32"/>
+      <w:bookmarkStart w:id="11" w:name="OLE_LINK33"/>
+      <w:bookmarkStart w:id="12" w:name="OLE_LINK23"/>
+      <w:bookmarkStart w:id="13" w:name="OLE_LINK41"/>
       <w:r>
         <w:rPr>
           <w:rFonts w:ascii="Kalinga" w:hAnsi="Kalinga" w:cs="Kalinga"/>
@@ -4072,8 +5493,8 @@
       </w:r>
       <w:bookmarkEnd w:id="4"/>
       <w:bookmarkEnd w:id="5"/>
-      <w:bookmarkStart w:id="14" w:name="OLE_LINK34"/>
-      <w:bookmarkStart w:id="15" w:name="OLE_LINK16"/>
+      <w:bookmarkStart w:id="14" w:name="OLE_LINK16"/>
+      <w:bookmarkStart w:id="15" w:name="OLE_LINK34"/>
       <w:r>
         <w:rPr>
           <w:rFonts w:hint="default" w:ascii="Kalinga" w:hAnsi="Kalinga"/>
@@ -4376,18 +5797,36 @@
           <w:sz w:val="20"/>
           <w:szCs w:val="20"/>
         </w:rPr>
-        <w:t>{% if jenis_pengajuan == 'top_up' %}</w:t>
-      </w:r>
-      <w:bookmarkStart w:id="17" w:name="_GoBack"/>
-      <w:bookmarkEnd w:id="17"/>
-      <w:r>
-        <w:rPr>
-          <w:rFonts w:hint="default" w:ascii="Kalinga" w:hAnsi="Kalinga"/>
-          <w:color w:val="auto"/>
-          <w:sz w:val="20"/>
-          <w:szCs w:val="20"/>
-        </w:rPr>
-        <w:t>Fasilitas Kredit Suplesi / Top Up</w:t>
+        <w:t xml:space="preserve">{% if jenis_pengajuan == 'top_up' %}Jaminan yang telah ada sebelumnya berupa Asli SK Pensiun atas nama Pemohon tetap dipertahankan sebagai Jaminan Kredit di BNI{% elif jenis_pengajuan == 'top_up_sisa_gaji' %}Jaminan yang telah ada sebelumnya berupa Asli SK Pensiun atas nama Pemohon tetap dipertahankan sebagai Jaminan Kredit di BNI{% else %}Menyerahkan </w:t>
+      </w:r>
+      <w:r>
+        <w:rPr>
+          <w:rFonts w:hint="default" w:ascii="Kalinga" w:hAnsi="Kalinga"/>
+          <w:color w:val="auto"/>
+          <w:sz w:val="20"/>
+          <w:szCs w:val="20"/>
+          <w:lang w:val="en-US"/>
+        </w:rPr>
+        <w:t xml:space="preserve">Asli </w:t>
+      </w:r>
+      <w:r>
+        <w:rPr>
+          <w:rFonts w:hint="default" w:ascii="Kalinga" w:hAnsi="Kalinga"/>
+          <w:color w:val="auto"/>
+          <w:sz w:val="20"/>
+          <w:szCs w:val="20"/>
+        </w:rPr>
+        <w:t>SK Pensiun atas nama Pemohon sebagai Jaminan Kredit BNI{% endif %}</w:t>
+      </w:r>
+      <w:r>
+        <w:rPr>
+          <w:rFonts w:hint="default" w:ascii="Kalinga" w:hAnsi="Kalinga"/>
+          <w:color w:val="auto"/>
+          <w:sz w:val="20"/>
+          <w:szCs w:val="20"/>
+          <w:lang w:val="en-US"/>
+        </w:rPr>
+        <w:t>.</w:t>
       </w:r>
     </w:p>
     <w:p>
@@ -4414,144 +5853,68 @@
           <w:sz w:val="20"/>
           <w:szCs w:val="20"/>
         </w:rPr>
-        <w:t>{% elif jenis_pengajuan == 'top_up_sisa_gaji' %}</w:t>
-      </w:r>
-    </w:p>
-    <w:p>
-      <w:pPr>
-        <w:pStyle w:val="6"/>
-        <w:numPr>
-          <w:ilvl w:val="0"/>
-          <w:numId w:val="1"/>
-        </w:numPr>
-        <w:spacing w:line="240" w:lineRule="auto"/>
-        <w:ind w:left="360" w:leftChars="0" w:right="160" w:rightChars="0" w:hanging="280" w:firstLineChars="0"/>
-        <w:jc w:val="both"/>
-        <w:rPr>
-          <w:rFonts w:hint="default" w:ascii="Kalinga" w:hAnsi="Kalinga"/>
-          <w:color w:val="auto"/>
-          <w:sz w:val="20"/>
-          <w:szCs w:val="20"/>
-        </w:rPr>
-      </w:pPr>
-      <w:r>
-        <w:rPr>
-          <w:rFonts w:hint="default" w:ascii="Kalinga" w:hAnsi="Kalinga"/>
-          <w:color w:val="auto"/>
-          <w:sz w:val="20"/>
-          <w:szCs w:val="20"/>
-        </w:rPr>
-        <w:t>Fasilitas Kredit Top Up Sisa Gaji</w:t>
-      </w:r>
-    </w:p>
-    <w:p>
-      <w:pPr>
-        <w:pStyle w:val="6"/>
-        <w:numPr>
-          <w:ilvl w:val="0"/>
-          <w:numId w:val="1"/>
-        </w:numPr>
-        <w:spacing w:line="240" w:lineRule="auto"/>
-        <w:ind w:left="360" w:leftChars="0" w:right="160" w:rightChars="0" w:hanging="280" w:firstLineChars="0"/>
-        <w:jc w:val="both"/>
-        <w:rPr>
-          <w:rFonts w:hint="default" w:ascii="Kalinga" w:hAnsi="Kalinga"/>
-          <w:color w:val="auto"/>
-          <w:sz w:val="20"/>
-          <w:szCs w:val="20"/>
-        </w:rPr>
-      </w:pPr>
-      <w:r>
-        <w:rPr>
-          <w:rFonts w:hint="default" w:ascii="Kalinga" w:hAnsi="Kalinga"/>
-          <w:color w:val="auto"/>
-          <w:sz w:val="20"/>
-          <w:szCs w:val="20"/>
-        </w:rPr>
-        <w:t>{% else %}</w:t>
-      </w:r>
-    </w:p>
-    <w:p>
-      <w:pPr>
-        <w:pStyle w:val="6"/>
-        <w:numPr>
-          <w:ilvl w:val="0"/>
-          <w:numId w:val="1"/>
-        </w:numPr>
-        <w:spacing w:line="240" w:lineRule="auto"/>
-        <w:ind w:left="360" w:leftChars="0" w:right="160" w:rightChars="0" w:hanging="280" w:firstLineChars="0"/>
-        <w:jc w:val="both"/>
-        <w:rPr>
-          <w:rFonts w:hint="default" w:ascii="Kalinga" w:hAnsi="Kalinga"/>
-          <w:color w:val="auto"/>
-          <w:sz w:val="20"/>
-          <w:szCs w:val="20"/>
-        </w:rPr>
-      </w:pPr>
-      <w:r>
-        <w:rPr>
-          <w:rFonts w:hint="default" w:ascii="Kalinga" w:hAnsi="Kalinga"/>
-          <w:color w:val="auto"/>
-          <w:sz w:val="20"/>
-          <w:szCs w:val="20"/>
-        </w:rPr>
-        <w:t>Fasilitas Kredit Baru</w:t>
-      </w:r>
-    </w:p>
-    <w:p>
-      <w:pPr>
-        <w:pStyle w:val="6"/>
-        <w:numPr>
-          <w:ilvl w:val="0"/>
-          <w:numId w:val="1"/>
-        </w:numPr>
-        <w:spacing w:line="240" w:lineRule="auto"/>
-        <w:ind w:left="360" w:leftChars="0" w:right="160" w:rightChars="0" w:hanging="280" w:firstLineChars="0"/>
-        <w:jc w:val="both"/>
-        <w:rPr>
-          <w:rFonts w:hint="default" w:ascii="Kalinga" w:hAnsi="Kalinga"/>
-          <w:color w:val="auto"/>
-          <w:sz w:val="20"/>
-          <w:szCs w:val="20"/>
-        </w:rPr>
-      </w:pPr>
-      <w:r>
-        <w:rPr>
-          <w:rFonts w:hint="default" w:ascii="Kalinga" w:hAnsi="Kalinga"/>
-          <w:color w:val="auto"/>
-          <w:sz w:val="20"/>
-          <w:szCs w:val="20"/>
-        </w:rPr>
-        <w:t xml:space="preserve">{% endif %}Menyerahkan </w:t>
-      </w:r>
-      <w:r>
-        <w:rPr>
-          <w:rFonts w:hint="default" w:ascii="Kalinga" w:hAnsi="Kalinga"/>
-          <w:color w:val="auto"/>
-          <w:sz w:val="20"/>
-          <w:szCs w:val="20"/>
-          <w:lang w:val="en-US"/>
-        </w:rPr>
-        <w:t xml:space="preserve">Asli </w:t>
-      </w:r>
-      <w:r>
-        <w:rPr>
-          <w:rFonts w:hint="default" w:ascii="Kalinga" w:hAnsi="Kalinga"/>
-          <w:color w:val="auto"/>
-          <w:sz w:val="20"/>
-          <w:szCs w:val="20"/>
-        </w:rPr>
-        <w:t>SK Pensiun atas nama Pemohon sebagai Jaminan Kredit BNI</w:t>
-      </w:r>
-      <w:r>
-        <w:rPr>
-          <w:rFonts w:hint="default" w:ascii="Kalinga" w:hAnsi="Kalinga"/>
-          <w:color w:val="auto"/>
-          <w:sz w:val="20"/>
-          <w:szCs w:val="20"/>
-          <w:lang w:val="en-US"/>
-        </w:rPr>
-        <w:t>.</w:t>
+        <w:t>{% if jenis_pengajuan == 'top_up_sisa_gaji' %}</w:t>
+      </w:r>
+      <w:r>
+        <w:rPr>
+          <w:rFonts w:hint="default" w:ascii="Kalinga" w:hAnsi="Kalinga" w:cs="Kalinga"/>
+          <w:sz w:val="20"/>
+          <w:szCs w:val="20"/>
+          <w:lang w:val="en-US"/>
+        </w:rPr>
+        <w:t xml:space="preserve">Fasilitas kredit ini saling mengkait dengan fasilitas kredit sebelumnya nomor rekening pinjaman </w:t>
+      </w:r>
+      <w:r>
+        <w:rPr>
+          <w:rFonts w:hint="default" w:ascii="Kalinga" w:hAnsi="Kalinga"/>
+          <w:sz w:val="20"/>
+          <w:szCs w:val="20"/>
+          <w:lang w:val="en-US"/>
+        </w:rPr>
+        <w:t xml:space="preserve">                                                                                                                                        </w:t>
+      </w:r>
+      <w:r>
+        <w:rPr>
+          <w:rFonts w:hint="default" w:ascii="Kalinga" w:hAnsi="Kalinga"/>
+          <w:sz w:val="20"/>
+          <w:szCs w:val="20"/>
+        </w:rPr>
+        <w:t xml:space="preserve">                                                                        1249965481</w:t>
+      </w:r>
+      <w:r>
+        <w:rPr>
+          <w:rFonts w:hint="default" w:ascii="Kalinga" w:hAnsi="Kalinga"/>
+          <w:sz w:val="20"/>
+          <w:szCs w:val="20"/>
+          <w:lang w:val="en-US"/>
+        </w:rPr>
+        <w:t xml:space="preserve"> </w:t>
+      </w:r>
+      <w:r>
+        <w:rPr>
+          <w:rFonts w:hint="default" w:ascii="Kalinga" w:hAnsi="Kalinga"/>
+          <w:sz w:val="20"/>
+          <w:szCs w:val="20"/>
+        </w:rPr>
+        <w:t>atas nama ABDUL MALIK PAKAYA</w:t>
+      </w:r>
+      <w:r>
+        <w:rPr>
+          <w:rFonts w:hint="default" w:ascii="Kalinga" w:hAnsi="Kalinga"/>
+          <w:sz w:val="20"/>
+          <w:szCs w:val="20"/>
+          <w:lang w:val="en-US"/>
+        </w:rPr>
+        <w:t>, No 551/GTL/PK-BNI FLEKSI/2021</w:t>
+      </w:r>
+      <w:r>
+        <w:rPr>
+          <w:rFonts w:hint="default" w:ascii="Kalinga" w:hAnsi="Kalinga"/>
+          <w:color w:val="auto"/>
+          <w:sz w:val="20"/>
+          <w:szCs w:val="20"/>
+        </w:rPr>
+        <w:t>{% endif %}</w:t>
       </w:r>
     </w:p>
     <w:p>
@@ -4878,7 +6241,273 @@
           <w:sz w:val="20"/>
           <w:szCs w:val="20"/>
         </w:rPr>
-        <w:t xml:space="preserve">Rekening BNI Taplus atas nama </w:t>
+        <w:t xml:space="preserve">{% if jenis_pengajuan == 'top_up' %}Rekening BNI Taplus </w:t>
+      </w:r>
+      <w:r>
+        <w:rPr>
+          <w:rFonts w:hint="default" w:ascii="Kalinga" w:hAnsi="Kalinga"/>
+          <w:color w:val="auto"/>
+          <w:sz w:val="20"/>
+          <w:szCs w:val="20"/>
+          <w:lang w:val="en-US"/>
+        </w:rPr>
+        <w:t xml:space="preserve">nomor </w:t>
+      </w:r>
+      <w:r>
+        <w:rPr>
+          <w:rFonts w:hint="default" w:ascii="Kalinga" w:hAnsi="Kalinga"/>
+          <w:color w:val="auto"/>
+          <w:sz w:val="20"/>
+          <w:szCs w:val="20"/>
+        </w:rPr>
+        <w:t>{{ payroll_no_rek | default('', true) }} atas nama {{ nama_pemohon | default('', true) }}</w:t>
+      </w:r>
+      <w:r>
+        <w:rPr>
+          <w:rFonts w:hint="default" w:ascii="Kalinga" w:hAnsi="Kalinga"/>
+          <w:color w:val="auto"/>
+          <w:sz w:val="20"/>
+          <w:szCs w:val="20"/>
+          <w:lang w:val="en-US"/>
+        </w:rPr>
+        <w:t xml:space="preserve"> tetap dijadikan</w:t>
+      </w:r>
+      <w:r>
+        <w:rPr>
+          <w:rFonts w:hint="default" w:ascii="Kalinga" w:hAnsi="Kalinga"/>
+          <w:color w:val="auto"/>
+          <w:sz w:val="20"/>
+          <w:szCs w:val="20"/>
+        </w:rPr>
+        <w:t xml:space="preserve"> Rekening Payroll Gaji Pensiun </w:t>
+      </w:r>
+      <w:r>
+        <w:rPr>
+          <w:rFonts w:hint="default" w:ascii="Kalinga" w:hAnsi="Kalinga"/>
+          <w:color w:val="auto"/>
+          <w:sz w:val="20"/>
+          <w:szCs w:val="20"/>
+          <w:lang w:val="en-US"/>
+        </w:rPr>
+        <w:t xml:space="preserve">serta </w:t>
+      </w:r>
+      <w:r>
+        <w:rPr>
+          <w:rFonts w:hint="default" w:ascii="Kalinga" w:hAnsi="Kalinga"/>
+          <w:color w:val="auto"/>
+          <w:sz w:val="20"/>
+          <w:szCs w:val="20"/>
+        </w:rPr>
+        <w:t xml:space="preserve">dijadikan sebagai Rekening Afiliasi Kredit </w:t>
+      </w:r>
+      <w:r>
+        <w:rPr>
+          <w:rFonts w:hint="default" w:ascii="Kalinga" w:hAnsi="Kalinga"/>
+          <w:color w:val="auto"/>
+          <w:sz w:val="20"/>
+          <w:szCs w:val="20"/>
+          <w:lang w:val="en-US"/>
+        </w:rPr>
+        <w:t xml:space="preserve">dan </w:t>
+      </w:r>
+      <w:r>
+        <w:rPr>
+          <w:rFonts w:hint="default" w:ascii="Kalinga" w:hAnsi="Kalinga"/>
+          <w:color w:val="auto"/>
+          <w:sz w:val="20"/>
+          <w:szCs w:val="20"/>
+        </w:rPr>
+        <w:t xml:space="preserve">akan diblokir sebesar  {{ blokir_angsuran_lunas | default('0', true) }} ({{ blokir_angsuran_lunas_terbilang | default('', true) }}) kali angsuran (Pokok+ Bunga serta ditambah saldo minimum, </w:t>
+      </w:r>
+      <w:r>
+        <w:rPr>
+          <w:rFonts w:hint="default" w:ascii="Kalinga" w:hAnsi="Kalinga"/>
+          <w:color w:val="auto"/>
+          <w:sz w:val="20"/>
+          <w:szCs w:val="20"/>
+          <w:lang w:val="en-US"/>
+        </w:rPr>
+        <w:t>dapat dibuka blokir saat</w:t>
+      </w:r>
+      <w:r>
+        <w:rPr>
+          <w:rFonts w:hint="default" w:ascii="Kalinga" w:hAnsi="Kalinga"/>
+          <w:color w:val="auto"/>
+          <w:sz w:val="20"/>
+          <w:szCs w:val="20"/>
+        </w:rPr>
+        <w:t xml:space="preserve"> </w:t>
+      </w:r>
+      <w:r>
+        <w:rPr>
+          <w:rFonts w:hint="default" w:ascii="Kalinga" w:hAnsi="Kalinga"/>
+          <w:color w:val="auto"/>
+          <w:sz w:val="20"/>
+          <w:szCs w:val="20"/>
+          <w:lang w:val="en-US"/>
+        </w:rPr>
+        <w:t>kredit lunas</w:t>
+      </w:r>
+      <w:r>
+        <w:rPr>
+          <w:rFonts w:hint="default" w:ascii="Kalinga" w:hAnsi="Kalinga"/>
+          <w:color w:val="auto"/>
+          <w:sz w:val="20"/>
+          <w:szCs w:val="20"/>
+        </w:rPr>
+        <w:t>).</w:t>
+      </w:r>
+      <w:r>
+        <w:rPr>
+          <w:rFonts w:hint="default" w:ascii="Kalinga" w:hAnsi="Kalinga"/>
+          <w:color w:val="auto"/>
+          <w:sz w:val="20"/>
+          <w:szCs w:val="20"/>
+          <w:lang w:val="en-US"/>
+        </w:rPr>
+        <w:t xml:space="preserve"> </w:t>
+      </w:r>
+      <w:r>
+        <w:rPr>
+          <w:rFonts w:hint="default" w:ascii="Kalinga" w:hAnsi="Kalinga"/>
+          <w:color w:val="auto"/>
+          <w:sz w:val="20"/>
+          <w:szCs w:val="20"/>
+        </w:rPr>
+        <w:t xml:space="preserve">Dana ini dapat dipotong dari Pencairan Kredit{% elif jenis_pengajuan == 'top_up_sisa_gaji' %}Rekening BNI Taplus </w:t>
+      </w:r>
+      <w:r>
+        <w:rPr>
+          <w:rFonts w:hint="default" w:ascii="Kalinga" w:hAnsi="Kalinga"/>
+          <w:color w:val="auto"/>
+          <w:sz w:val="20"/>
+          <w:szCs w:val="20"/>
+          <w:lang w:val="en-US"/>
+        </w:rPr>
+        <w:t xml:space="preserve">nomor </w:t>
+      </w:r>
+      <w:r>
+        <w:rPr>
+          <w:rFonts w:hint="default" w:ascii="Kalinga" w:hAnsi="Kalinga"/>
+          <w:color w:val="auto"/>
+          <w:sz w:val="20"/>
+          <w:szCs w:val="20"/>
+        </w:rPr>
+        <w:t>{{ payroll_no_rek | default('', true) }} atas nama {{ nama_pemohon | default('', true) }}</w:t>
+      </w:r>
+      <w:r>
+        <w:rPr>
+          <w:rFonts w:hint="default" w:ascii="Kalinga" w:hAnsi="Kalinga"/>
+          <w:color w:val="auto"/>
+          <w:sz w:val="20"/>
+          <w:szCs w:val="20"/>
+          <w:lang w:val="en-US"/>
+        </w:rPr>
+        <w:t xml:space="preserve"> tetap dijadikan</w:t>
+      </w:r>
+      <w:r>
+        <w:rPr>
+          <w:rFonts w:hint="default" w:ascii="Kalinga" w:hAnsi="Kalinga"/>
+          <w:color w:val="auto"/>
+          <w:sz w:val="20"/>
+          <w:szCs w:val="20"/>
+        </w:rPr>
+        <w:t xml:space="preserve"> Rekening Payroll Gaji Pensiun </w:t>
+      </w:r>
+      <w:r>
+        <w:rPr>
+          <w:rFonts w:hint="default" w:ascii="Kalinga" w:hAnsi="Kalinga"/>
+          <w:color w:val="auto"/>
+          <w:sz w:val="20"/>
+          <w:szCs w:val="20"/>
+          <w:lang w:val="en-US"/>
+        </w:rPr>
+        <w:t xml:space="preserve">serta </w:t>
+      </w:r>
+      <w:r>
+        <w:rPr>
+          <w:rFonts w:hint="default" w:ascii="Kalinga" w:hAnsi="Kalinga"/>
+          <w:color w:val="auto"/>
+          <w:sz w:val="20"/>
+          <w:szCs w:val="20"/>
+        </w:rPr>
+        <w:t xml:space="preserve">dijadikan sebagai Rekening Afiliasi Kredit </w:t>
+      </w:r>
+      <w:r>
+        <w:rPr>
+          <w:rFonts w:hint="default" w:ascii="Kalinga" w:hAnsi="Kalinga"/>
+          <w:color w:val="auto"/>
+          <w:sz w:val="20"/>
+          <w:szCs w:val="20"/>
+          <w:lang w:val="en-US"/>
+        </w:rPr>
+        <w:t xml:space="preserve">dan </w:t>
+      </w:r>
+      <w:r>
+        <w:rPr>
+          <w:rFonts w:hint="default" w:ascii="Kalinga" w:hAnsi="Kalinga"/>
+          <w:color w:val="auto"/>
+          <w:sz w:val="20"/>
+          <w:szCs w:val="20"/>
+        </w:rPr>
+        <w:t xml:space="preserve">akan diblokir sebesar  {{ blokir_angsuran_lunas | default('0', true) }} ({{ blokir_angsuran_lunas_terbilang | default('', true) }}) kali angsuran (Pokok+ Bunga serta ditambah saldo minimum, </w:t>
+      </w:r>
+      <w:r>
+        <w:rPr>
+          <w:rFonts w:hint="default" w:ascii="Kalinga" w:hAnsi="Kalinga"/>
+          <w:color w:val="auto"/>
+          <w:sz w:val="20"/>
+          <w:szCs w:val="20"/>
+          <w:lang w:val="en-US"/>
+        </w:rPr>
+        <w:t>dapat dibuka blokir saat</w:t>
+      </w:r>
+      <w:r>
+        <w:rPr>
+          <w:rFonts w:hint="default" w:ascii="Kalinga" w:hAnsi="Kalinga"/>
+          <w:color w:val="auto"/>
+          <w:sz w:val="20"/>
+          <w:szCs w:val="20"/>
+        </w:rPr>
+        <w:t xml:space="preserve"> </w:t>
+      </w:r>
+      <w:r>
+        <w:rPr>
+          <w:rFonts w:hint="default" w:ascii="Kalinga" w:hAnsi="Kalinga"/>
+          <w:color w:val="auto"/>
+          <w:sz w:val="20"/>
+          <w:szCs w:val="20"/>
+          <w:lang w:val="en-US"/>
+        </w:rPr>
+        <w:t>kredit lunas</w:t>
+      </w:r>
+      <w:r>
+        <w:rPr>
+          <w:rFonts w:hint="default" w:ascii="Kalinga" w:hAnsi="Kalinga"/>
+          <w:color w:val="auto"/>
+          <w:sz w:val="20"/>
+          <w:szCs w:val="20"/>
+        </w:rPr>
+        <w:t>).</w:t>
+      </w:r>
+      <w:r>
+        <w:rPr>
+          <w:rFonts w:hint="default" w:ascii="Kalinga" w:hAnsi="Kalinga"/>
+          <w:color w:val="auto"/>
+          <w:sz w:val="20"/>
+          <w:szCs w:val="20"/>
+          <w:lang w:val="en-US"/>
+        </w:rPr>
+        <w:t xml:space="preserve"> </w:t>
+      </w:r>
+      <w:r>
+        <w:rPr>
+          <w:rFonts w:hint="default" w:ascii="Kalinga" w:hAnsi="Kalinga"/>
+          <w:color w:val="auto"/>
+          <w:sz w:val="20"/>
+          <w:szCs w:val="20"/>
+        </w:rPr>
+        <w:t xml:space="preserve">Dana ini dapat dipotong dari Pencairan Kredit{% else %}Rekening BNI Taplus atas nama </w:t>
       </w:r>
       <w:r>
         <w:rPr>
@@ -4935,7 +6564,26 @@
           <w:sz w:val="20"/>
           <w:szCs w:val="20"/>
         </w:rPr>
-        <w:t xml:space="preserve">dijadikan sebagai Rekening Afiliasi Kredit akan diblokir sebesar {{ blokir_angsuran_total | default('0', true) }} ({{ blokir_angsuran_total_terbilang | default('', true) }}) kali angsuran ({{ blokir_angsuran_pindah_gaji | default('0', true) }} ({{ blokir_angsuran_pindah_gaji_terbilang | default('', true) }}) kali angsuran Pindah Gaji (dapat dibuka setelah Gaji Pensiun telah tercermin di Rekening Afiliasi Kredit BNI) dan {{ blokir_angsuran_lunas | default('0', true) }} ({{ blokir_angsuran_lunas_terbilang | default('', true) }}) kali angsuran (Pokok+ Bunga serta ditambah saldo minimum, </w:t>
+        <w:t>dijadikan sebagai Rekening Afiliasi Kredit</w:t>
+      </w:r>
+      <w:r>
+        <w:rPr>
+          <w:rFonts w:hint="default" w:ascii="Kalinga" w:hAnsi="Kalinga"/>
+          <w:color w:val="auto"/>
+          <w:sz w:val="20"/>
+          <w:szCs w:val="20"/>
+          <w:lang w:val="en-US"/>
+        </w:rPr>
+        <w:t xml:space="preserve"> dan </w:t>
+      </w:r>
+      <w:r>
+        <w:rPr>
+          <w:rFonts w:hint="default" w:ascii="Kalinga" w:hAnsi="Kalinga"/>
+          <w:color w:val="auto"/>
+          <w:sz w:val="20"/>
+          <w:szCs w:val="20"/>
+        </w:rPr>
+        <w:t xml:space="preserve">akan diblokir sebesar {{ blokir_angsuran_total | default('0', true) }} ({{ blokir_angsuran_total_terbilang | default('', true) }}) kali angsuran ({{ blokir_angsuran_pindah_gaji | default('0', true) }} ({{ blokir_angsuran_pindah_gaji_terbilang | default('', true) }}) kali angsuran Pindah Gaji (dapat dibuka setelah Gaji Pensiun telah tercermin di Rekening Afiliasi Kredit BNI) dan {{ blokir_angsuran_lunas | default('0', true) }} ({{ blokir_angsuran_lunas_terbilang | default('', true) }}) kali angsuran (Pokok+ Bunga serta ditambah saldo minimum, </w:t>
       </w:r>
       <w:r>
         <w:rPr>
@@ -4992,7 +6640,7 @@
           <w:sz w:val="20"/>
           <w:szCs w:val="20"/>
         </w:rPr>
-        <w:t>Dana ini dapat dipotong dari Pencairan Kredit.</w:t>
+        <w:t>Dana ini dapat dipotong dari Pencairan Kredit{% endif %}.</w:t>
       </w:r>
     </w:p>
     <w:p>

</xml_diff>

<commit_message>
menjadikan form_purna.html sebagai basis seluruh penginputan khusus purna
</commit_message>
<xml_diff>
--- a/template_purna_reguler.docx
+++ b/template_purna_reguler.docx
@@ -373,7 +373,26 @@
           <w:sz w:val="20"/>
           <w:szCs w:val="20"/>
         </w:rPr>
-        <w:t>Usia Pemohon  ± {{ usia_pemohon | default('', true) }} Tahun ({{ tgl_lahir_pemohon | default('', true) }}) Cfm. KTP Nomor {{ no_ktp_pemohon | default('', true) }} tanggal {{ tgl_terbit_ktp | default('', true) }}.{% if status_perkawinan_pemohon == 'Menikah' %}</w:t>
+        <w:t>Usia Pemohon</w:t>
+      </w:r>
+      <w:r>
+        <w:rPr>
+          <w:rFonts w:hint="default" w:ascii="Kalinga" w:hAnsi="Kalinga"/>
+          <w:color w:val="auto"/>
+          <w:sz w:val="20"/>
+          <w:szCs w:val="20"/>
+          <w:lang w:val="en-US"/>
+        </w:rPr>
+        <w:t xml:space="preserve"> </w:t>
+      </w:r>
+      <w:r>
+        <w:rPr>
+          <w:rFonts w:hint="default" w:ascii="Kalinga" w:hAnsi="Kalinga"/>
+          <w:color w:val="auto"/>
+          <w:sz w:val="20"/>
+          <w:szCs w:val="20"/>
+        </w:rPr>
+        <w:t>± {{ usia_pemohon | default('', true) }} Tahun ({{ tgl_lahir_pemohon | default('', true) }}) Cfm. KTP Nomor {{ no_ktp_pemohon | default('', true) }} tanggal {{ tgl_terbit_ktp | default('', true) }}.{% if status_perkawinan_pemohon == 'Menikah' %}</w:t>
       </w:r>
     </w:p>
     <w:p>
@@ -654,7 +673,7 @@
           <w:szCs w:val="20"/>
           <w:lang w:val="en-US"/>
         </w:rPr>
-        <w:t xml:space="preserve"> {% if jenis_pengajuan == 'top_up' %}Purna Top Up{% elif jenis_pengajuan == 'top_up_sisa_gaji' %}Purna Top Up Sisa Gaji{% else %}Purna Reguler{% endif %}</w:t>
+        <w:t xml:space="preserve"> {% if jenis_pengajuan == 'top_up' %}Purna Top Up{% elif jenis_pengajuan == 'top_up_sisa_gaji' %}Purna Top Up Sisa Gaji{% elif jenis_pengajuan == 'takeover' %}Purna Take Over{% else %}Purna Reguler{% endif %}</w:t>
       </w:r>
       <w:r>
         <w:rPr>
@@ -710,1398 +729,496 @@
     <w:p>
       <w:pPr>
         <w:pStyle w:val="6"/>
-        <w:spacing w:line="240" w:lineRule="auto"/>
-        <w:ind w:right="160"/>
-        <w:jc w:val="both"/>
-        <w:rPr>
-          <w:rFonts w:hint="default" w:ascii="Kalinga" w:hAnsi="Kalinga"/>
-          <w:color w:val="auto"/>
-          <w:sz w:val="20"/>
-          <w:szCs w:val="20"/>
-        </w:rPr>
-      </w:pPr>
-      <w:r>
-        <w:rPr>
-          <w:rFonts w:hint="default" w:ascii="Kalinga" w:hAnsi="Kalinga"/>
-          <w:b/>
-          <w:bCs/>
-          <w:color w:val="auto"/>
+        <w:numPr>
+          <w:numId w:val="0"/>
+        </w:numPr>
+        <w:spacing w:line="240" w:lineRule="auto"/>
+        <w:ind w:left="80" w:leftChars="0" w:right="160" w:rightChars="0"/>
+        <w:jc w:val="both"/>
+        <w:rPr>
+          <w:rFonts w:hint="default" w:ascii="Kalinga" w:hAnsi="Kalinga"/>
+          <w:color w:val="auto"/>
+          <w:sz w:val="20"/>
+          <w:szCs w:val="20"/>
+        </w:rPr>
+      </w:pPr>
+      <w:r>
+        <w:rPr>
+          <w:rFonts w:hint="default" w:ascii="Kalinga" w:hAnsi="Kalinga"/>
+          <w:b/>
+          <w:bCs/>
+          <w:color w:val="auto"/>
+          <w:sz w:val="20"/>
+          <w:szCs w:val="20"/>
+        </w:rPr>
+        <w:t>Cfm. Info SLIK Ideb posisi terakhir Tanggal {{ tgl_slik | default('', true) }} Pemohon memiliki Fasilitas Kredit sebagai berikut :</w:t>
+      </w:r>
+      <w:r>
+        <w:rPr>
+          <w:rFonts w:hint="default" w:ascii="Kalinga" w:hAnsi="Kalinga"/>
+          <w:color w:val="auto"/>
+          <w:sz w:val="20"/>
+          <w:szCs w:val="20"/>
+        </w:rPr>
+        <w:t>{% if fasilitas_nihil == 'ya' %}</w:t>
+      </w:r>
+    </w:p>
+    <w:p>
+      <w:pPr>
+        <w:pStyle w:val="6"/>
+        <w:numPr>
+          <w:ilvl w:val="0"/>
+          <w:numId w:val="1"/>
+        </w:numPr>
+        <w:spacing w:line="240" w:lineRule="auto"/>
+        <w:ind w:left="360" w:leftChars="0" w:right="160" w:rightChars="0" w:hanging="280" w:firstLineChars="0"/>
+        <w:jc w:val="both"/>
+        <w:rPr>
+          <w:rFonts w:hint="default" w:ascii="Kalinga" w:hAnsi="Kalinga"/>
+          <w:color w:val="auto"/>
+          <w:sz w:val="20"/>
+          <w:szCs w:val="20"/>
+        </w:rPr>
+      </w:pPr>
+      <w:r>
+        <w:rPr>
+          <w:rFonts w:hint="default" w:ascii="Kalinga" w:hAnsi="Kalinga"/>
+          <w:color w:val="auto"/>
+          <w:sz w:val="20"/>
+          <w:szCs w:val="20"/>
+        </w:rPr>
+        <w:t>Nihil - Data Fasilitas Kredit tidak ditemukan.{% else %}{% if slik_bank_1_nama %}</w:t>
+      </w:r>
+    </w:p>
+    <w:p>
+      <w:pPr>
+        <w:pStyle w:val="6"/>
+        <w:numPr>
+          <w:ilvl w:val="0"/>
+          <w:numId w:val="1"/>
+        </w:numPr>
+        <w:spacing w:line="240" w:lineRule="auto"/>
+        <w:ind w:left="360" w:leftChars="0" w:right="160" w:rightChars="0" w:hanging="280" w:firstLineChars="0"/>
+        <w:jc w:val="both"/>
+        <w:rPr>
+          <w:rFonts w:hint="default" w:ascii="Kalinga" w:hAnsi="Kalinga"/>
+          <w:color w:val="auto"/>
+          <w:sz w:val="20"/>
+          <w:szCs w:val="20"/>
+        </w:rPr>
+      </w:pPr>
+      <w:r>
+        <w:rPr>
+          <w:rFonts w:hint="default" w:ascii="Kalinga" w:hAnsi="Kalinga"/>
+          <w:color w:val="auto"/>
+          <w:sz w:val="20"/>
+          <w:szCs w:val="20"/>
+        </w:rPr>
+        <w:t>Fasilitas Kredit {{slik_bank_1_jenis | default('', true)}} di {{slik_bank_1_nama}} maks Rp. {{slik_bank_1_maks}} outs Rp. {{slik_bank_1_outs}} Coll {{slik_bank_1_coll}}.{% if slik_bank_1_takeover == 'ya' %} (Take Over){% endif %}{% if slik_bank_1_topup_lunas == 'ya' %} (Akan Dilunasi){% endif %}{% if slik_bank_1_alasan_aktif == 'ya' %} (Ket: {{ slik_bank_1_alasan }}).{% endif %}{% endif %}{% if slik_bank_2_nama %}</w:t>
+      </w:r>
+    </w:p>
+    <w:p>
+      <w:pPr>
+        <w:pStyle w:val="6"/>
+        <w:numPr>
+          <w:ilvl w:val="0"/>
+          <w:numId w:val="1"/>
+        </w:numPr>
+        <w:spacing w:line="240" w:lineRule="auto"/>
+        <w:ind w:left="360" w:leftChars="0" w:right="160" w:rightChars="0" w:hanging="280" w:firstLineChars="0"/>
+        <w:jc w:val="both"/>
+        <w:rPr>
+          <w:rFonts w:hint="default" w:ascii="Kalinga" w:hAnsi="Kalinga"/>
+          <w:color w:val="auto"/>
+          <w:sz w:val="20"/>
+          <w:szCs w:val="20"/>
+        </w:rPr>
+      </w:pPr>
+      <w:r>
+        <w:rPr>
+          <w:rFonts w:hint="default" w:ascii="Kalinga" w:hAnsi="Kalinga"/>
+          <w:color w:val="auto"/>
+          <w:sz w:val="20"/>
+          <w:szCs w:val="20"/>
+        </w:rPr>
+        <w:t>Fasilitas Kredit {{slik_bank_2_jenis | default('', true)}} di {{slik_bank_2_nama}} maks Rp. {{slik_bank_2_maks}} outs Rp. {{slik_bank_2_outs}} Coll {{slik_bank_2_coll}}.{% if slik_bank_2_takeover == 'ya' %} (Take Over){% endif %}{% if slik_bank_2_topup_lunas == 'ya' %} (Akan Dilunasi){% endif %}{% if slik_bank_2_alasan_aktif == 'ya' %} (Ket: {{ slik_bank_2_alasan }}).{% endif %}{% endif %}{% if slik_bank_3_nama %}</w:t>
+      </w:r>
+    </w:p>
+    <w:p>
+      <w:pPr>
+        <w:pStyle w:val="6"/>
+        <w:numPr>
+          <w:ilvl w:val="0"/>
+          <w:numId w:val="1"/>
+        </w:numPr>
+        <w:spacing w:line="240" w:lineRule="auto"/>
+        <w:ind w:left="360" w:leftChars="0" w:right="160" w:rightChars="0" w:hanging="280" w:firstLineChars="0"/>
+        <w:jc w:val="both"/>
+        <w:rPr>
+          <w:rFonts w:hint="default" w:ascii="Kalinga" w:hAnsi="Kalinga"/>
+          <w:color w:val="auto"/>
+          <w:sz w:val="20"/>
+          <w:szCs w:val="20"/>
+        </w:rPr>
+      </w:pPr>
+      <w:r>
+        <w:rPr>
+          <w:rFonts w:hint="default" w:ascii="Kalinga" w:hAnsi="Kalinga"/>
+          <w:color w:val="auto"/>
+          <w:sz w:val="20"/>
+          <w:szCs w:val="20"/>
+        </w:rPr>
+        <w:t>Fasilitas Kredit {{slik_bank_3_jenis | default('', true)}} di {{slik_bank_3_nama}} maks Rp. {{slik_bank_3_maks}} outs Rp. {{slik_bank_3_outs}} Coll {{slik_bank_3_coll}}.{% if slik_bank_3_takeover == 'ya' %} (Take Over){% endif %}{% if slik_bank_3_topup_lunas == 'ya' %} (Akan Dilunasi){% endif %}{% if slik_bank_3_alasan_aktif == 'ya' %} (Ket: {{ slik_bank_3_alasan }}).{% endif %}{% endif %}{% if slik_bank_4_nama %}</w:t>
+      </w:r>
+    </w:p>
+    <w:p>
+      <w:pPr>
+        <w:pStyle w:val="6"/>
+        <w:numPr>
+          <w:ilvl w:val="0"/>
+          <w:numId w:val="1"/>
+        </w:numPr>
+        <w:spacing w:line="240" w:lineRule="auto"/>
+        <w:ind w:left="360" w:leftChars="0" w:right="160" w:rightChars="0" w:hanging="280" w:firstLineChars="0"/>
+        <w:jc w:val="both"/>
+        <w:rPr>
+          <w:rFonts w:hint="default" w:ascii="Kalinga" w:hAnsi="Kalinga"/>
+          <w:color w:val="auto"/>
+          <w:sz w:val="20"/>
+          <w:szCs w:val="20"/>
+        </w:rPr>
+      </w:pPr>
+      <w:r>
+        <w:rPr>
+          <w:rFonts w:hint="default" w:ascii="Kalinga" w:hAnsi="Kalinga"/>
+          <w:color w:val="auto"/>
+          <w:sz w:val="20"/>
+          <w:szCs w:val="20"/>
+        </w:rPr>
+        <w:t>Fasilitas Kredit {{slik_bank_4_jenis | default('', true)}} di {{slik_bank_4_nama}} maks Rp. {{slik_bank_4_maks}} outs Rp. {{slik_bank_4_outs}} Coll {{slik_bank_4_coll}}.{% if slik_bank_4_takeover == 'ya' %} (Take Over){% endif %}{% if slik_bank_4_topup_lunas == 'ya' %} (Akan Dilunasi){% endif %}{% if slik_bank_4_alasan_aktif == 'ya' %} (Ket: {{ slik_bank_4_alasan }}).{% endif %}{% endif %}{% if slik_bank_5_nama %}</w:t>
+      </w:r>
+    </w:p>
+    <w:p>
+      <w:pPr>
+        <w:pStyle w:val="6"/>
+        <w:numPr>
+          <w:ilvl w:val="0"/>
+          <w:numId w:val="1"/>
+        </w:numPr>
+        <w:spacing w:line="240" w:lineRule="auto"/>
+        <w:ind w:left="360" w:leftChars="0" w:right="160" w:rightChars="0" w:hanging="280" w:firstLineChars="0"/>
+        <w:jc w:val="both"/>
+        <w:rPr>
+          <w:rFonts w:hint="default" w:ascii="Kalinga" w:hAnsi="Kalinga"/>
+          <w:color w:val="auto"/>
+          <w:sz w:val="20"/>
+          <w:szCs w:val="20"/>
+        </w:rPr>
+      </w:pPr>
+      <w:r>
+        <w:rPr>
+          <w:rFonts w:hint="default" w:ascii="Kalinga" w:hAnsi="Kalinga"/>
+          <w:color w:val="auto"/>
+          <w:sz w:val="20"/>
+          <w:szCs w:val="20"/>
+        </w:rPr>
+        <w:t>Fasilitas Kredit {{slik_bank_5_jenis | default('', true)}} di {{slik_bank_5_nama}} maks Rp. {{slik_bank_5_maks}} outs Rp. {{slik_bank_5_outs}} Coll {{slik_bank_5_coll}}.{% if slik_bank_5_takeover == 'ya' %} (Take Over){% endif %}{% if slik_bank_5_topup_lunas == 'ya' %} (Akan Dilunasi){% endif %}{% if slik_bank_5_alasan_aktif == 'ya' %} (Ket: {{ slik_bank_5_alasan }}).{% endif %}{% endif %}{% if slik_bank_6_nama %}</w:t>
+      </w:r>
+    </w:p>
+    <w:p>
+      <w:pPr>
+        <w:pStyle w:val="6"/>
+        <w:numPr>
+          <w:ilvl w:val="0"/>
+          <w:numId w:val="1"/>
+        </w:numPr>
+        <w:spacing w:line="240" w:lineRule="auto"/>
+        <w:ind w:left="360" w:leftChars="0" w:right="160" w:rightChars="0" w:hanging="280" w:firstLineChars="0"/>
+        <w:jc w:val="both"/>
+        <w:rPr>
+          <w:rFonts w:hint="default" w:ascii="Kalinga" w:hAnsi="Kalinga"/>
+          <w:color w:val="auto"/>
+          <w:sz w:val="20"/>
+          <w:szCs w:val="20"/>
+        </w:rPr>
+      </w:pPr>
+      <w:r>
+        <w:rPr>
+          <w:rFonts w:hint="default" w:ascii="Kalinga" w:hAnsi="Kalinga"/>
+          <w:color w:val="auto"/>
+          <w:sz w:val="20"/>
+          <w:szCs w:val="20"/>
+        </w:rPr>
+        <w:t>Fasilitas Kredit {{slik_bank_6_jenis | default('', true)}} di {{slik_bank_6_nama}} maks Rp. {{slik_bank_6_maks}} outs Rp. {{slik_bank_6_outs}} Coll {{slik_bank_6_coll}}.{% if slik_bank_6_takeover == 'ya' %} (Take Over){% endif %}{% if slik_bank_6_topup_lunas == 'ya' %} (Akan Dilunasi){% endif %}{% if slik_bank_6_alasan_aktif == 'ya' %} (Ket: {{ slik_bank_6_alasan }}).{% endif %}{% endif %}{% if slik_bank_7_nama %}</w:t>
+      </w:r>
+    </w:p>
+    <w:p>
+      <w:pPr>
+        <w:pStyle w:val="6"/>
+        <w:numPr>
+          <w:ilvl w:val="0"/>
+          <w:numId w:val="1"/>
+        </w:numPr>
+        <w:spacing w:line="240" w:lineRule="auto"/>
+        <w:ind w:left="360" w:leftChars="0" w:right="160" w:rightChars="0" w:hanging="280" w:firstLineChars="0"/>
+        <w:jc w:val="both"/>
+        <w:rPr>
+          <w:rFonts w:hint="default" w:ascii="Kalinga" w:hAnsi="Kalinga"/>
+          <w:color w:val="auto"/>
+          <w:sz w:val="20"/>
+          <w:szCs w:val="20"/>
+        </w:rPr>
+      </w:pPr>
+      <w:r>
+        <w:rPr>
+          <w:rFonts w:hint="default" w:ascii="Kalinga" w:hAnsi="Kalinga"/>
+          <w:color w:val="auto"/>
+          <w:sz w:val="20"/>
+          <w:szCs w:val="20"/>
+        </w:rPr>
+        <w:t>Fasilitas Kredit {{slik_bank_7_jenis | default('', true)}} di {{slik_bank_7_nama}} maks Rp. {{slik_bank_7_maks}} outs Rp. {{slik_bank_7_outs}} Coll {{slik_bank_7_coll}}.{% if slik_bank_7_takeover == 'ya' %} (Take Over){% endif %}{% if slik_bank_7_topup_lunas == 'ya' %} (Akan Dilunasi){% endif %}{% if slik_bank_7_alasan_aktif == 'ya' %} (Ket: {{ slik_bank_7_alasan }}).{% endif %}{% endif %}{% if slik_bank_8_nama %}</w:t>
+      </w:r>
+    </w:p>
+    <w:p>
+      <w:pPr>
+        <w:pStyle w:val="6"/>
+        <w:numPr>
+          <w:ilvl w:val="0"/>
+          <w:numId w:val="1"/>
+        </w:numPr>
+        <w:spacing w:line="240" w:lineRule="auto"/>
+        <w:ind w:left="360" w:leftChars="0" w:right="160" w:rightChars="0" w:hanging="280" w:firstLineChars="0"/>
+        <w:jc w:val="both"/>
+        <w:rPr>
+          <w:rFonts w:hint="default" w:ascii="Kalinga" w:hAnsi="Kalinga"/>
+          <w:color w:val="auto"/>
+          <w:sz w:val="20"/>
+          <w:szCs w:val="20"/>
+        </w:rPr>
+      </w:pPr>
+      <w:r>
+        <w:rPr>
+          <w:rFonts w:hint="default" w:ascii="Kalinga" w:hAnsi="Kalinga"/>
+          <w:color w:val="auto"/>
+          <w:sz w:val="20"/>
+          <w:szCs w:val="20"/>
+        </w:rPr>
+        <w:t>Fasilitas Kredit {{slik_bank_8_jenis | default('', true)}} di {{slik_bank_8_nama}} maks Rp. {{slik_bank_8_maks}} outs Rp. {{slik_bank_8_outs}} Coll {{slik_bank_8_coll}}.{% if slik_bank_8_takeover == 'ya' %} (Take Over){% endif %}{% if slik_bank_8_topup_lunas == 'ya' %} (Akan Dilunasi){% endif %}{% if slik_bank_8_alasan_aktif == 'ya' %} (Ket: {{ slik_bank_8_alasan }}).{% endif %}{% endif %}{% if slik_bank_9_nama %}</w:t>
+      </w:r>
+    </w:p>
+    <w:p>
+      <w:pPr>
+        <w:pStyle w:val="6"/>
+        <w:numPr>
+          <w:ilvl w:val="0"/>
+          <w:numId w:val="1"/>
+        </w:numPr>
+        <w:spacing w:line="240" w:lineRule="auto"/>
+        <w:ind w:left="360" w:leftChars="0" w:right="160" w:rightChars="0" w:hanging="280" w:firstLineChars="0"/>
+        <w:jc w:val="both"/>
+        <w:rPr>
+          <w:rFonts w:hint="default" w:ascii="Kalinga" w:hAnsi="Kalinga"/>
+          <w:color w:val="auto"/>
+          <w:sz w:val="20"/>
+          <w:szCs w:val="20"/>
+        </w:rPr>
+      </w:pPr>
+      <w:r>
+        <w:rPr>
+          <w:rFonts w:hint="default" w:ascii="Kalinga" w:hAnsi="Kalinga"/>
+          <w:color w:val="auto"/>
+          <w:sz w:val="20"/>
+          <w:szCs w:val="20"/>
+        </w:rPr>
+        <w:t>Fasilitas Kredit {{slik_bank_9_jenis | default('', true)}} di {{slik_bank_9_nama}} maks Rp. {{slik_bank_9_maks}} outs Rp. {{slik_bank_9_outs}} Coll {{slik_bank_9_coll}}.{% if slik_bank_9_takeover == 'ya' %} (Take Over){% endif %}{% if slik_bank_9_topup_lunas == 'ya' %} (Akan Dilunasi){% endif %}{% if slik_bank_9_alasan_aktif == 'ya' %} (Ket: {{ slik_bank_9_alasan }}).{% endif %}{% endif %}{% if slik_bank_10_nama %}</w:t>
+      </w:r>
+    </w:p>
+    <w:p>
+      <w:pPr>
+        <w:pStyle w:val="6"/>
+        <w:numPr>
+          <w:ilvl w:val="0"/>
+          <w:numId w:val="1"/>
+        </w:numPr>
+        <w:spacing w:line="240" w:lineRule="auto"/>
+        <w:ind w:left="360" w:leftChars="0" w:right="160" w:rightChars="0" w:hanging="280" w:firstLineChars="0"/>
+        <w:jc w:val="both"/>
+        <w:rPr>
+          <w:rFonts w:hint="default" w:ascii="Kalinga" w:hAnsi="Kalinga"/>
+          <w:color w:val="auto"/>
+          <w:sz w:val="20"/>
+          <w:szCs w:val="20"/>
+        </w:rPr>
+      </w:pPr>
+      <w:r>
+        <w:rPr>
+          <w:rFonts w:hint="default" w:ascii="Kalinga" w:hAnsi="Kalinga"/>
+          <w:color w:val="auto"/>
+          <w:sz w:val="20"/>
+          <w:szCs w:val="20"/>
+        </w:rPr>
+        <w:t>Fasilitas Kredit {{slik_bank_10_jenis | default('', true)}} di {{slik_bank_10_nama}} maks Rp. {{slik_bank_10_maks}} outs Rp. {{slik_bank_10_outs}} Coll {{slik_bank_10_coll}}.{% if slik_bank_10_takeover == 'ya' %} (Take Over){% endif %}{% if slik_bank_10_topup_lunas == 'ya' %} (Akan Dilunasi){% endif %}{% if slik_bank_10_alasan_aktif == 'ya' %} (Ket: {{ slik_bank_10_alasan }}).{% endif %}{% endif %}{% if slik_bank_11_nama %}</w:t>
+      </w:r>
+    </w:p>
+    <w:p>
+      <w:pPr>
+        <w:pStyle w:val="6"/>
+        <w:numPr>
+          <w:ilvl w:val="0"/>
+          <w:numId w:val="1"/>
+        </w:numPr>
+        <w:spacing w:line="240" w:lineRule="auto"/>
+        <w:ind w:left="360" w:leftChars="0" w:right="160" w:rightChars="0" w:hanging="280" w:firstLineChars="0"/>
+        <w:jc w:val="both"/>
+        <w:rPr>
+          <w:rFonts w:hint="default" w:ascii="Kalinga" w:hAnsi="Kalinga"/>
+          <w:color w:val="auto"/>
+          <w:sz w:val="20"/>
+          <w:szCs w:val="20"/>
+        </w:rPr>
+      </w:pPr>
+      <w:r>
+        <w:rPr>
+          <w:rFonts w:hint="default" w:ascii="Kalinga" w:hAnsi="Kalinga"/>
+          <w:color w:val="auto"/>
+          <w:sz w:val="20"/>
+          <w:szCs w:val="20"/>
+          <w:lang w:val="en-US"/>
+        </w:rPr>
+        <w:t>F</w:t>
+      </w:r>
+      <w:r>
+        <w:rPr>
+          <w:rFonts w:hint="default" w:ascii="Kalinga" w:hAnsi="Kalinga"/>
+          <w:color w:val="auto"/>
+          <w:sz w:val="20"/>
+          <w:szCs w:val="20"/>
+        </w:rPr>
+        <w:t>asilitas Kredit {{slik_bank_11_jenis | default('', true)}} di {{slik_bank_11_nama}} maks Rp. {{slik_bank_11_maks}} outs Rp. {{slik_bank_11_outs}} Coll {{slik_bank_11_coll}}.{% if slik_bank_11_takeover == 'ya' %} (Take Over){% endif %}{% if slik_bank_11_topup_lunas == 'ya' %} (Akan Dilunasi){% endif %}{% if slik_bank_11_alasan_aktif == 'ya' %} (Ket: {{ slik_bank_11_alasan }}).{% endif %}{% endif %}{% if slik_bank_12_nama %}</w:t>
+      </w:r>
+    </w:p>
+    <w:p>
+      <w:pPr>
+        <w:pStyle w:val="6"/>
+        <w:numPr>
+          <w:ilvl w:val="0"/>
+          <w:numId w:val="1"/>
+        </w:numPr>
+        <w:spacing w:line="240" w:lineRule="auto"/>
+        <w:ind w:left="360" w:leftChars="0" w:right="160" w:rightChars="0" w:hanging="280" w:firstLineChars="0"/>
+        <w:jc w:val="both"/>
+        <w:rPr>
+          <w:rFonts w:hint="default" w:ascii="Kalinga" w:hAnsi="Kalinga"/>
+          <w:color w:val="auto"/>
+          <w:sz w:val="20"/>
+          <w:szCs w:val="20"/>
+        </w:rPr>
+      </w:pPr>
+      <w:r>
+        <w:rPr>
+          <w:rFonts w:hint="default" w:ascii="Kalinga" w:hAnsi="Kalinga"/>
+          <w:color w:val="auto"/>
+          <w:sz w:val="20"/>
+          <w:szCs w:val="20"/>
+        </w:rPr>
+        <w:t>Fasilitas Kredit {{slik_bank_12_jenis | default('', true)}} di {{slik_bank_12_nama}} maks Rp. {{slik_bank_12_maks}} outs Rp. {{slik_bank_12_outs}} Coll {{slik_bank_12_coll}}.{% if slik_bank_12_takeover == 'ya' %} (Take Over){% endif %}{% if slik_bank_12_topup_lunas == 'ya' %} (Akan Dilunasi){% endif %}{% if slik_bank_12_alasan_aktif == 'ya' %} (Ket: {{ slik_bank_12_alasan }}).{% endif %}{% endif %}{% if slik_bank_13_nama %}</w:t>
+      </w:r>
+    </w:p>
+    <w:p>
+      <w:pPr>
+        <w:pStyle w:val="6"/>
+        <w:numPr>
+          <w:ilvl w:val="0"/>
+          <w:numId w:val="1"/>
+        </w:numPr>
+        <w:spacing w:line="240" w:lineRule="auto"/>
+        <w:ind w:left="360" w:leftChars="0" w:right="160" w:rightChars="0" w:hanging="280" w:firstLineChars="0"/>
+        <w:jc w:val="both"/>
+        <w:rPr>
+          <w:rFonts w:hint="default" w:ascii="Kalinga" w:hAnsi="Kalinga"/>
+          <w:color w:val="auto"/>
+          <w:sz w:val="20"/>
+          <w:szCs w:val="20"/>
+        </w:rPr>
+      </w:pPr>
+      <w:r>
+        <w:rPr>
+          <w:rFonts w:hint="default" w:ascii="Kalinga" w:hAnsi="Kalinga"/>
+          <w:color w:val="auto"/>
+          <w:sz w:val="20"/>
+          <w:szCs w:val="20"/>
+        </w:rPr>
+        <w:t>Fasilitas Kredit {{slik_bank_13_jenis | default('', true)}} di {{slik_bank_13_nama}} maks Rp. {{slik_bank_13_maks}} outs Rp. {{slik_bank_13_outs}} Coll {{slik_bank_13_coll}}.{% if slik_bank_13_takeover == 'ya' %} (Take Over){% endif %}{% if slik_bank_13_topup_lunas == 'ya' %} (Akan Dilunasi){% endif %}{% if slik_bank_13_alasan_aktif == 'ya' %} (Ket: {{ slik_bank_13_alasan }}).{% endif %}{% endif %}{% if slik_bank_14_nama %}</w:t>
+      </w:r>
+    </w:p>
+    <w:p>
+      <w:pPr>
+        <w:pStyle w:val="6"/>
+        <w:numPr>
+          <w:ilvl w:val="0"/>
+          <w:numId w:val="1"/>
+        </w:numPr>
+        <w:spacing w:line="240" w:lineRule="auto"/>
+        <w:ind w:left="360" w:leftChars="0" w:right="160" w:rightChars="0" w:hanging="280" w:firstLineChars="0"/>
+        <w:jc w:val="both"/>
+        <w:rPr>
+          <w:rFonts w:hint="default" w:ascii="Kalinga" w:hAnsi="Kalinga"/>
+          <w:color w:val="auto"/>
+          <w:sz w:val="20"/>
+          <w:szCs w:val="20"/>
+        </w:rPr>
+      </w:pPr>
+      <w:r>
+        <w:rPr>
+          <w:rFonts w:hint="default" w:ascii="Kalinga" w:hAnsi="Kalinga"/>
+          <w:color w:val="auto"/>
+          <w:sz w:val="20"/>
+          <w:szCs w:val="20"/>
+        </w:rPr>
+        <w:t>Fasilitas Kredit {{slik_bank_14_jenis | default('', true)}} di {{slik_bank_14_nama}} maks Rp. {{slik_bank_14_maks}} outs Rp. {{slik_bank_14_outs}} Coll {{slik_bank_14_coll}}.{% if slik_bank_14_takeover == 'ya' %} (Take Over){% endif %}{% if slik_bank_14_topup_lunas == 'ya' %} (Akan Dilunasi){% endif %}{% if slik_bank_14_alasan_aktif == 'ya' %} (Ket: {{ slik_bank_14_alasan }}).{% endif %}{% endif %}{% if slik_bank_15_nama %}</w:t>
+      </w:r>
+    </w:p>
+    <w:p>
+      <w:pPr>
+        <w:pStyle w:val="6"/>
+        <w:numPr>
+          <w:ilvl w:val="0"/>
+          <w:numId w:val="1"/>
+        </w:numPr>
+        <w:spacing w:line="240" w:lineRule="auto"/>
+        <w:ind w:left="360" w:leftChars="0" w:right="160" w:rightChars="0" w:hanging="280" w:firstLineChars="0"/>
+        <w:jc w:val="both"/>
+        <w:rPr>
+          <w:rFonts w:hint="default" w:ascii="Kalinga" w:hAnsi="Kalinga"/>
+          <w:b/>
+          <w:bCs/>
+          <w:i/>
+          <w:iCs/>
+          <w:color w:val="FF0000"/>
           <w:sz w:val="20"/>
           <w:szCs w:val="20"/>
           <w:u w:val="single"/>
-        </w:rPr>
-        <w:t xml:space="preserve">Cfm. Info Ideb SLIK Tanggal </w:t>
-      </w:r>
-      <w:r>
-        <w:rPr>
-          <w:rFonts w:hint="default" w:ascii="Kalinga" w:hAnsi="Kalinga"/>
-          <w:b/>
-          <w:bCs/>
-          <w:color w:val="auto"/>
-          <w:sz w:val="20"/>
-          <w:szCs w:val="20"/>
-          <w:u w:val="single"/>
-          <w:lang w:val="en-US"/>
-        </w:rPr>
-        <w:t>{{</w:t>
-      </w:r>
-      <w:r>
-        <w:rPr>
-          <w:rFonts w:hint="default" w:ascii="Kalinga" w:hAnsi="Kalinga"/>
-          <w:b/>
-          <w:bCs/>
-          <w:color w:val="auto"/>
-          <w:sz w:val="20"/>
-          <w:szCs w:val="20"/>
-          <w:u w:val="single"/>
-        </w:rPr>
-        <w:t>tgl_slik</w:t>
-      </w:r>
-      <w:r>
-        <w:rPr>
-          <w:rFonts w:hint="default" w:ascii="Kalinga" w:hAnsi="Kalinga"/>
-          <w:b/>
-          <w:bCs/>
-          <w:color w:val="auto"/>
-          <w:sz w:val="20"/>
-          <w:szCs w:val="20"/>
-          <w:u w:val="single"/>
-          <w:lang w:val="en-US"/>
-        </w:rPr>
-        <w:t>}}</w:t>
-      </w:r>
-      <w:r>
-        <w:rPr>
-          <w:rFonts w:hint="default" w:ascii="Kalinga" w:hAnsi="Kalinga"/>
-          <w:b/>
-          <w:bCs/>
-          <w:color w:val="auto"/>
-          <w:sz w:val="20"/>
-          <w:szCs w:val="20"/>
-          <w:u w:val="single"/>
-        </w:rPr>
-        <w:t>, pemohon memiliki fasilitas kredit sebagai berikut :</w:t>
-      </w:r>
-      <w:r>
-        <w:rPr>
-          <w:rFonts w:hint="default" w:ascii="Kalinga" w:hAnsi="Kalinga"/>
-          <w:color w:val="auto"/>
-          <w:sz w:val="20"/>
-          <w:szCs w:val="20"/>
-        </w:rPr>
-        <w:t>{% if fasilitas_nihil == 'ya' %}</w:t>
-      </w:r>
-    </w:p>
-    <w:p>
-      <w:pPr>
-        <w:pStyle w:val="6"/>
-        <w:numPr>
-          <w:ilvl w:val="0"/>
-          <w:numId w:val="1"/>
-        </w:numPr>
-        <w:spacing w:line="240" w:lineRule="auto"/>
-        <w:ind w:left="360" w:leftChars="0" w:right="160" w:rightChars="0" w:hanging="280" w:firstLineChars="0"/>
-        <w:jc w:val="both"/>
-        <w:rPr>
-          <w:rFonts w:hint="default" w:ascii="Kalinga" w:hAnsi="Kalinga"/>
-          <w:color w:val="auto"/>
-          <w:sz w:val="20"/>
-          <w:szCs w:val="20"/>
-        </w:rPr>
-      </w:pPr>
-      <w:r>
-        <w:rPr>
-          <w:rFonts w:hint="default" w:ascii="Kalinga" w:hAnsi="Kalinga"/>
-          <w:color w:val="auto"/>
-          <w:sz w:val="20"/>
-          <w:szCs w:val="20"/>
-        </w:rPr>
-        <w:t>Nihil - Data Fasilitas Kredit tidak ditemukan.</w:t>
-      </w:r>
-    </w:p>
-    <w:p>
-      <w:pPr>
-        <w:pStyle w:val="6"/>
-        <w:spacing w:line="240" w:lineRule="auto"/>
-        <w:ind w:right="160"/>
-        <w:jc w:val="both"/>
-        <w:rPr>
-          <w:rFonts w:hint="default" w:ascii="Kalinga" w:hAnsi="Kalinga"/>
-          <w:color w:val="auto"/>
-          <w:sz w:val="20"/>
-          <w:szCs w:val="20"/>
-        </w:rPr>
-      </w:pPr>
-      <w:r>
-        <w:rPr>
-          <w:rFonts w:hint="default" w:ascii="Kalinga" w:hAnsi="Kalinga"/>
-          <w:color w:val="auto"/>
-          <w:sz w:val="20"/>
-          <w:szCs w:val="20"/>
-        </w:rPr>
-        <w:t>{% else %}{% if slik_bank_1_nama %}</w:t>
-      </w:r>
-    </w:p>
-    <w:p>
-      <w:pPr>
-        <w:pStyle w:val="6"/>
-        <w:numPr>
-          <w:ilvl w:val="0"/>
-          <w:numId w:val="1"/>
-        </w:numPr>
-        <w:spacing w:line="240" w:lineRule="auto"/>
-        <w:ind w:left="360" w:leftChars="0" w:right="160" w:rightChars="0" w:hanging="280" w:firstLineChars="0"/>
-        <w:jc w:val="both"/>
-        <w:rPr>
-          <w:rFonts w:hint="default" w:ascii="Kalinga" w:hAnsi="Kalinga"/>
-          <w:color w:val="auto"/>
-          <w:sz w:val="20"/>
-          <w:szCs w:val="20"/>
-        </w:rPr>
-      </w:pPr>
-      <w:r>
-        <w:rPr>
-          <w:rFonts w:hint="default" w:ascii="Kalinga" w:hAnsi="Kalinga"/>
-          <w:color w:val="auto"/>
-          <w:sz w:val="20"/>
-          <w:szCs w:val="20"/>
-        </w:rPr>
-        <w:t xml:space="preserve">Fasilitas Kredit {{slik_bank_1_jenis | </w:t>
-      </w:r>
-      <w:r>
-        <w:rPr>
-          <w:rFonts w:hint="default" w:ascii="Kalinga" w:hAnsi="Kalinga"/>
-          <w:color w:val="auto"/>
-          <w:sz w:val="20"/>
-          <w:szCs w:val="20"/>
-          <w:lang w:val="en-US"/>
-        </w:rPr>
-        <w:t>default('', true)}} di Bank</w:t>
-      </w:r>
-      <w:r>
-        <w:rPr>
-          <w:rFonts w:hint="default" w:ascii="Kalinga" w:hAnsi="Kalinga"/>
-          <w:color w:val="auto"/>
-          <w:sz w:val="20"/>
-          <w:szCs w:val="20"/>
-        </w:rPr>
-        <w:t xml:space="preserve"> {{slik_bank_1_nama}} maks Rp. {{slik_bank_1_maks}} outs Rp. {{slik_bank_1_outs}} Coll {{slik_bank_1_coll}}.{% if slik_bank_1_alasan_aktif == 'ya' %} (Ket: {{ slik_bank_1_</w:t>
-      </w:r>
-      <w:r>
-        <w:rPr>
-          <w:rFonts w:hint="default" w:ascii="Kalinga" w:hAnsi="Kalinga"/>
-          <w:color w:val="auto"/>
-          <w:sz w:val="20"/>
-          <w:szCs w:val="20"/>
-          <w:lang w:val="en-US"/>
-        </w:rPr>
-        <w:t>alasan }}).</w:t>
-      </w:r>
-      <w:r>
-        <w:rPr>
-          <w:rFonts w:hint="default" w:ascii="Kalinga" w:hAnsi="Kalinga"/>
-          <w:color w:val="auto"/>
-          <w:sz w:val="20"/>
-          <w:szCs w:val="20"/>
-        </w:rPr>
-        <w:t xml:space="preserve">{% endif %}{% endif </w:t>
-      </w:r>
-      <w:r>
-        <w:rPr>
-          <w:rFonts w:hint="default" w:ascii="Kalinga" w:hAnsi="Kalinga"/>
-          <w:color w:val="auto"/>
-          <w:sz w:val="20"/>
-          <w:szCs w:val="20"/>
-          <w:lang w:val="en-US"/>
-        </w:rPr>
-        <w:t>%}{% if</w:t>
-      </w:r>
-      <w:r>
-        <w:rPr>
-          <w:rFonts w:hint="default" w:ascii="Kalinga" w:hAnsi="Kalinga"/>
-          <w:color w:val="auto"/>
-          <w:sz w:val="20"/>
-          <w:szCs w:val="20"/>
-        </w:rPr>
-        <w:t xml:space="preserve"> slik_bank_2_nama %}</w:t>
-      </w:r>
-    </w:p>
-    <w:p>
-      <w:pPr>
-        <w:pStyle w:val="6"/>
-        <w:numPr>
-          <w:ilvl w:val="0"/>
-          <w:numId w:val="1"/>
-        </w:numPr>
-        <w:spacing w:line="240" w:lineRule="auto"/>
-        <w:ind w:left="360" w:leftChars="0" w:right="160" w:rightChars="0" w:hanging="280" w:firstLineChars="0"/>
-        <w:jc w:val="both"/>
-        <w:rPr>
-          <w:rFonts w:hint="default" w:ascii="Kalinga" w:hAnsi="Kalinga"/>
-          <w:color w:val="auto"/>
-          <w:sz w:val="20"/>
-          <w:szCs w:val="20"/>
-        </w:rPr>
-      </w:pPr>
-      <w:r>
-        <w:rPr>
-          <w:rFonts w:hint="default" w:ascii="Kalinga" w:hAnsi="Kalinga"/>
-          <w:color w:val="auto"/>
-          <w:sz w:val="20"/>
-          <w:szCs w:val="20"/>
-        </w:rPr>
-        <w:t xml:space="preserve">Fasilitas Kredit {{slik_bank_2_jenis | </w:t>
-      </w:r>
-      <w:r>
-        <w:rPr>
-          <w:rFonts w:hint="default" w:ascii="Kalinga" w:hAnsi="Kalinga"/>
-          <w:color w:val="auto"/>
-          <w:sz w:val="20"/>
-          <w:szCs w:val="20"/>
-          <w:lang w:val="en-US"/>
-        </w:rPr>
-        <w:t>default('', true)}} di Bank</w:t>
-      </w:r>
-      <w:r>
-        <w:rPr>
-          <w:rFonts w:hint="default" w:ascii="Kalinga" w:hAnsi="Kalinga"/>
-          <w:color w:val="auto"/>
-          <w:sz w:val="20"/>
-          <w:szCs w:val="20"/>
-        </w:rPr>
-        <w:t xml:space="preserve"> {{slik_bank_2_nama}} maks Rp. {{slik_bank_2_maks}} outs Rp. {{slik_bank_2_outs}} Coll {{slik_bank_2_coll}}.{% if slik_bank_2_alasan_aktif == 'ya' %} (Ket: {{ slik_bank_2_</w:t>
-      </w:r>
-      <w:r>
-        <w:rPr>
-          <w:rFonts w:hint="default" w:ascii="Kalinga" w:hAnsi="Kalinga"/>
-          <w:color w:val="auto"/>
-          <w:sz w:val="20"/>
-          <w:szCs w:val="20"/>
-          <w:lang w:val="en-US"/>
-        </w:rPr>
-        <w:t>alasan }}).</w:t>
-      </w:r>
-      <w:r>
-        <w:rPr>
-          <w:rFonts w:hint="default" w:ascii="Kalinga" w:hAnsi="Kalinga"/>
-          <w:color w:val="auto"/>
-          <w:sz w:val="20"/>
-          <w:szCs w:val="20"/>
-        </w:rPr>
-        <w:t xml:space="preserve">{% endif %}{% endif </w:t>
-      </w:r>
-      <w:r>
-        <w:rPr>
-          <w:rFonts w:hint="default" w:ascii="Kalinga" w:hAnsi="Kalinga"/>
-          <w:color w:val="auto"/>
-          <w:sz w:val="20"/>
-          <w:szCs w:val="20"/>
-          <w:lang w:val="en-US"/>
-        </w:rPr>
-        <w:t>%}{% if</w:t>
-      </w:r>
-      <w:r>
-        <w:rPr>
-          <w:rFonts w:hint="default" w:ascii="Kalinga" w:hAnsi="Kalinga"/>
-          <w:color w:val="auto"/>
-          <w:sz w:val="20"/>
-          <w:szCs w:val="20"/>
-        </w:rPr>
-        <w:t xml:space="preserve"> slik_bank_3_nama %}</w:t>
-      </w:r>
-    </w:p>
-    <w:p>
-      <w:pPr>
-        <w:pStyle w:val="6"/>
-        <w:numPr>
-          <w:ilvl w:val="0"/>
-          <w:numId w:val="1"/>
-        </w:numPr>
-        <w:spacing w:line="240" w:lineRule="auto"/>
-        <w:ind w:left="360" w:leftChars="0" w:right="160" w:rightChars="0" w:hanging="280" w:firstLineChars="0"/>
-        <w:jc w:val="both"/>
-        <w:rPr>
-          <w:rFonts w:hint="default" w:ascii="Kalinga" w:hAnsi="Kalinga"/>
-          <w:color w:val="auto"/>
-          <w:sz w:val="20"/>
-          <w:szCs w:val="20"/>
-        </w:rPr>
-      </w:pPr>
-      <w:r>
-        <w:rPr>
-          <w:rFonts w:hint="default" w:ascii="Kalinga" w:hAnsi="Kalinga"/>
-          <w:color w:val="auto"/>
-          <w:sz w:val="20"/>
-          <w:szCs w:val="20"/>
-        </w:rPr>
-        <w:t xml:space="preserve">Fasilitas Kredit {{slik_bank_3_jenis | </w:t>
-      </w:r>
-      <w:r>
-        <w:rPr>
-          <w:rFonts w:hint="default" w:ascii="Kalinga" w:hAnsi="Kalinga"/>
-          <w:color w:val="auto"/>
-          <w:sz w:val="20"/>
-          <w:szCs w:val="20"/>
-          <w:lang w:val="en-US"/>
-        </w:rPr>
-        <w:t>default('', true)}} di Bank</w:t>
-      </w:r>
-      <w:r>
-        <w:rPr>
-          <w:rFonts w:hint="default" w:ascii="Kalinga" w:hAnsi="Kalinga"/>
-          <w:color w:val="auto"/>
-          <w:sz w:val="20"/>
-          <w:szCs w:val="20"/>
-        </w:rPr>
-        <w:t xml:space="preserve"> {{slik_bank_3_nama}} maks Rp. {{slik_bank_3_maks}} outs Rp. {{slik_bank_3_outs}} Coll {{slik_bank_3_coll}}.{% if slik_bank_3_alasan_aktif == 'ya' %} (Ket: {{ slik_bank_3_</w:t>
-      </w:r>
-      <w:r>
-        <w:rPr>
-          <w:rFonts w:hint="default" w:ascii="Kalinga" w:hAnsi="Kalinga"/>
-          <w:color w:val="auto"/>
-          <w:sz w:val="20"/>
-          <w:szCs w:val="20"/>
-          <w:lang w:val="en-US"/>
-        </w:rPr>
-        <w:t>alasan }}).</w:t>
-      </w:r>
-      <w:r>
-        <w:rPr>
-          <w:rFonts w:hint="default" w:ascii="Kalinga" w:hAnsi="Kalinga"/>
-          <w:color w:val="auto"/>
-          <w:sz w:val="20"/>
-          <w:szCs w:val="20"/>
-        </w:rPr>
-        <w:t xml:space="preserve">{% endif %}{% endif </w:t>
-      </w:r>
-      <w:r>
-        <w:rPr>
-          <w:rFonts w:hint="default" w:ascii="Kalinga" w:hAnsi="Kalinga"/>
-          <w:color w:val="auto"/>
-          <w:sz w:val="20"/>
-          <w:szCs w:val="20"/>
-          <w:lang w:val="en-US"/>
-        </w:rPr>
-        <w:t>%}{% if</w:t>
-      </w:r>
-      <w:r>
-        <w:rPr>
-          <w:rFonts w:hint="default" w:ascii="Kalinga" w:hAnsi="Kalinga"/>
-          <w:color w:val="auto"/>
-          <w:sz w:val="20"/>
-          <w:szCs w:val="20"/>
-        </w:rPr>
-        <w:t xml:space="preserve"> slik_bank_4_nama %}</w:t>
-      </w:r>
-    </w:p>
-    <w:p>
-      <w:pPr>
-        <w:pStyle w:val="6"/>
-        <w:numPr>
-          <w:ilvl w:val="0"/>
-          <w:numId w:val="1"/>
-        </w:numPr>
-        <w:spacing w:line="240" w:lineRule="auto"/>
-        <w:ind w:left="360" w:leftChars="0" w:right="160" w:rightChars="0" w:hanging="280" w:firstLineChars="0"/>
-        <w:jc w:val="both"/>
-        <w:rPr>
-          <w:rFonts w:hint="default" w:ascii="Kalinga" w:hAnsi="Kalinga"/>
-          <w:color w:val="auto"/>
-          <w:sz w:val="20"/>
-          <w:szCs w:val="20"/>
-        </w:rPr>
-      </w:pPr>
-      <w:r>
-        <w:rPr>
-          <w:rFonts w:hint="default" w:ascii="Kalinga" w:hAnsi="Kalinga"/>
-          <w:color w:val="auto"/>
-          <w:sz w:val="20"/>
-          <w:szCs w:val="20"/>
-        </w:rPr>
-        <w:t xml:space="preserve">Fasilitas Kredit {{slik_bank_4_jenis | </w:t>
-      </w:r>
-      <w:r>
-        <w:rPr>
-          <w:rFonts w:hint="default" w:ascii="Kalinga" w:hAnsi="Kalinga"/>
-          <w:color w:val="auto"/>
-          <w:sz w:val="20"/>
-          <w:szCs w:val="20"/>
-          <w:lang w:val="en-US"/>
-        </w:rPr>
-        <w:t>default('', true)}} di Bank</w:t>
-      </w:r>
-      <w:r>
-        <w:rPr>
-          <w:rFonts w:hint="default" w:ascii="Kalinga" w:hAnsi="Kalinga"/>
-          <w:color w:val="auto"/>
-          <w:sz w:val="20"/>
-          <w:szCs w:val="20"/>
-        </w:rPr>
-        <w:t xml:space="preserve"> {{slik_bank_4_nama}} maks Rp. {{slik_bank_4_maks}} outs Rp. {{slik_bank_4_outs}} Coll {{slik_bank_4_coll}}.{% if slik_bank_4_alasan_aktif == 'ya' %} (Ket: {{ slik_bank_4_</w:t>
-      </w:r>
-      <w:r>
-        <w:rPr>
-          <w:rFonts w:hint="default" w:ascii="Kalinga" w:hAnsi="Kalinga"/>
-          <w:color w:val="auto"/>
-          <w:sz w:val="20"/>
-          <w:szCs w:val="20"/>
-          <w:lang w:val="en-US"/>
-        </w:rPr>
-        <w:t>alasan }}).</w:t>
-      </w:r>
-      <w:r>
-        <w:rPr>
-          <w:rFonts w:hint="default" w:ascii="Kalinga" w:hAnsi="Kalinga"/>
-          <w:color w:val="auto"/>
-          <w:sz w:val="20"/>
-          <w:szCs w:val="20"/>
-        </w:rPr>
-        <w:t xml:space="preserve">{% endif %}{% endif </w:t>
-      </w:r>
-      <w:r>
-        <w:rPr>
-          <w:rFonts w:hint="default" w:ascii="Kalinga" w:hAnsi="Kalinga"/>
-          <w:color w:val="auto"/>
-          <w:sz w:val="20"/>
-          <w:szCs w:val="20"/>
-          <w:lang w:val="en-US"/>
-        </w:rPr>
-        <w:t>%}{% if</w:t>
-      </w:r>
-      <w:r>
-        <w:rPr>
-          <w:rFonts w:hint="default" w:ascii="Kalinga" w:hAnsi="Kalinga"/>
-          <w:color w:val="auto"/>
-          <w:sz w:val="20"/>
-          <w:szCs w:val="20"/>
-        </w:rPr>
-        <w:t xml:space="preserve"> slik_bank_5_nama %}</w:t>
-      </w:r>
-    </w:p>
-    <w:p>
-      <w:pPr>
-        <w:pStyle w:val="6"/>
-        <w:numPr>
-          <w:ilvl w:val="0"/>
-          <w:numId w:val="1"/>
-        </w:numPr>
-        <w:spacing w:line="240" w:lineRule="auto"/>
-        <w:ind w:left="360" w:leftChars="0" w:right="160" w:rightChars="0" w:hanging="280" w:firstLineChars="0"/>
-        <w:jc w:val="both"/>
-        <w:rPr>
-          <w:rFonts w:hint="default" w:ascii="Kalinga" w:hAnsi="Kalinga"/>
-          <w:color w:val="auto"/>
-          <w:sz w:val="20"/>
-          <w:szCs w:val="20"/>
-        </w:rPr>
-      </w:pPr>
-      <w:r>
-        <w:rPr>
-          <w:rFonts w:hint="default" w:ascii="Kalinga" w:hAnsi="Kalinga"/>
-          <w:color w:val="auto"/>
-          <w:sz w:val="20"/>
-          <w:szCs w:val="20"/>
-        </w:rPr>
-        <w:t xml:space="preserve">Fasilitas Kredit {{slik_bank_5_jenis | </w:t>
-      </w:r>
-      <w:r>
-        <w:rPr>
-          <w:rFonts w:hint="default" w:ascii="Kalinga" w:hAnsi="Kalinga"/>
-          <w:color w:val="auto"/>
-          <w:sz w:val="20"/>
-          <w:szCs w:val="20"/>
-          <w:lang w:val="en-US"/>
-        </w:rPr>
-        <w:t>default('', true)}} di Bank</w:t>
-      </w:r>
-      <w:r>
-        <w:rPr>
-          <w:rFonts w:hint="default" w:ascii="Kalinga" w:hAnsi="Kalinga"/>
-          <w:color w:val="auto"/>
-          <w:sz w:val="20"/>
-          <w:szCs w:val="20"/>
-        </w:rPr>
-        <w:t xml:space="preserve"> {{slik_bank_5_nama}} maks Rp. {{slik_bank_5_maks}} outs Rp. {{slik_bank_5_outs}} Coll {{slik_bank_5_coll}}.{% if slik_bank_5_alasan_aktif == 'ya' %} (Ket: {{ slik_bank_5_</w:t>
-      </w:r>
-      <w:r>
-        <w:rPr>
-          <w:rFonts w:hint="default" w:ascii="Kalinga" w:hAnsi="Kalinga"/>
-          <w:color w:val="auto"/>
-          <w:sz w:val="20"/>
-          <w:szCs w:val="20"/>
-          <w:lang w:val="en-US"/>
-        </w:rPr>
-        <w:t>alasan }}).</w:t>
-      </w:r>
-      <w:r>
-        <w:rPr>
-          <w:rFonts w:hint="default" w:ascii="Kalinga" w:hAnsi="Kalinga"/>
-          <w:color w:val="auto"/>
-          <w:sz w:val="20"/>
-          <w:szCs w:val="20"/>
-        </w:rPr>
-        <w:t xml:space="preserve">{% endif %}{% endif </w:t>
-      </w:r>
-      <w:r>
-        <w:rPr>
-          <w:rFonts w:hint="default" w:ascii="Kalinga" w:hAnsi="Kalinga"/>
-          <w:color w:val="auto"/>
-          <w:sz w:val="20"/>
-          <w:szCs w:val="20"/>
-          <w:lang w:val="en-US"/>
-        </w:rPr>
-        <w:t>%}{% if</w:t>
-      </w:r>
-      <w:r>
-        <w:rPr>
-          <w:rFonts w:hint="default" w:ascii="Kalinga" w:hAnsi="Kalinga"/>
-          <w:color w:val="auto"/>
-          <w:sz w:val="20"/>
-          <w:szCs w:val="20"/>
-        </w:rPr>
-        <w:t xml:space="preserve"> slik_bank_6_nama %}</w:t>
-      </w:r>
-    </w:p>
-    <w:p>
-      <w:pPr>
-        <w:pStyle w:val="6"/>
-        <w:numPr>
-          <w:ilvl w:val="0"/>
-          <w:numId w:val="1"/>
-        </w:numPr>
-        <w:spacing w:line="240" w:lineRule="auto"/>
-        <w:ind w:left="360" w:leftChars="0" w:right="160" w:rightChars="0" w:hanging="280" w:firstLineChars="0"/>
-        <w:jc w:val="both"/>
-        <w:rPr>
-          <w:rFonts w:hint="default" w:ascii="Kalinga" w:hAnsi="Kalinga"/>
-          <w:color w:val="auto"/>
-          <w:sz w:val="20"/>
-          <w:szCs w:val="20"/>
-        </w:rPr>
-      </w:pPr>
-      <w:r>
-        <w:rPr>
-          <w:rFonts w:hint="default" w:ascii="Kalinga" w:hAnsi="Kalinga"/>
-          <w:color w:val="auto"/>
-          <w:sz w:val="20"/>
-          <w:szCs w:val="20"/>
-        </w:rPr>
-        <w:t xml:space="preserve">Fasilitas Kredit {{slik_bank_6_jenis | </w:t>
-      </w:r>
-      <w:r>
-        <w:rPr>
-          <w:rFonts w:hint="default" w:ascii="Kalinga" w:hAnsi="Kalinga"/>
-          <w:color w:val="auto"/>
-          <w:sz w:val="20"/>
-          <w:szCs w:val="20"/>
-          <w:lang w:val="en-US"/>
-        </w:rPr>
-        <w:t>default('', true)}} di Bank</w:t>
-      </w:r>
-      <w:r>
-        <w:rPr>
-          <w:rFonts w:hint="default" w:ascii="Kalinga" w:hAnsi="Kalinga"/>
-          <w:color w:val="auto"/>
-          <w:sz w:val="20"/>
-          <w:szCs w:val="20"/>
-        </w:rPr>
-        <w:t xml:space="preserve"> {{slik_bank_6_nama}} maks Rp. {{slik_bank_6_maks}} outs Rp. {{slik_bank_6_outs}} Coll {{slik_bank_6_coll}}.{% if slik_bank_6_alasan_aktif == 'ya' %} (Ket: {{ slik_bank_6_</w:t>
-      </w:r>
-      <w:r>
-        <w:rPr>
-          <w:rFonts w:hint="default" w:ascii="Kalinga" w:hAnsi="Kalinga"/>
-          <w:color w:val="auto"/>
-          <w:sz w:val="20"/>
-          <w:szCs w:val="20"/>
-          <w:lang w:val="en-US"/>
-        </w:rPr>
-        <w:t>alasan }}).</w:t>
-      </w:r>
-      <w:r>
-        <w:rPr>
-          <w:rFonts w:hint="default" w:ascii="Kalinga" w:hAnsi="Kalinga"/>
-          <w:color w:val="auto"/>
-          <w:sz w:val="20"/>
-          <w:szCs w:val="20"/>
-        </w:rPr>
-        <w:t xml:space="preserve">{% endif %}{% endif </w:t>
-      </w:r>
-      <w:r>
-        <w:rPr>
-          <w:rFonts w:hint="default" w:ascii="Kalinga" w:hAnsi="Kalinga"/>
-          <w:color w:val="auto"/>
-          <w:sz w:val="20"/>
-          <w:szCs w:val="20"/>
-          <w:lang w:val="en-US"/>
-        </w:rPr>
-        <w:t>%}{% if</w:t>
-      </w:r>
-      <w:r>
-        <w:rPr>
-          <w:rFonts w:hint="default" w:ascii="Kalinga" w:hAnsi="Kalinga"/>
-          <w:color w:val="auto"/>
-          <w:sz w:val="20"/>
-          <w:szCs w:val="20"/>
-        </w:rPr>
-        <w:t xml:space="preserve"> slik_bank_7_nama %}</w:t>
-      </w:r>
-    </w:p>
-    <w:p>
-      <w:pPr>
-        <w:pStyle w:val="6"/>
-        <w:numPr>
-          <w:ilvl w:val="0"/>
-          <w:numId w:val="1"/>
-        </w:numPr>
-        <w:spacing w:line="240" w:lineRule="auto"/>
-        <w:ind w:left="360" w:leftChars="0" w:right="160" w:rightChars="0" w:hanging="280" w:firstLineChars="0"/>
-        <w:jc w:val="both"/>
-        <w:rPr>
-          <w:rFonts w:hint="default" w:ascii="Kalinga" w:hAnsi="Kalinga"/>
-          <w:color w:val="auto"/>
-          <w:sz w:val="20"/>
-          <w:szCs w:val="20"/>
-        </w:rPr>
-      </w:pPr>
-      <w:r>
-        <w:rPr>
-          <w:rFonts w:hint="default" w:ascii="Kalinga" w:hAnsi="Kalinga"/>
-          <w:color w:val="auto"/>
-          <w:sz w:val="20"/>
-          <w:szCs w:val="20"/>
-        </w:rPr>
-        <w:t xml:space="preserve">Fasilitas Kredit {{slik_bank_7_jenis | </w:t>
-      </w:r>
-      <w:r>
-        <w:rPr>
-          <w:rFonts w:hint="default" w:ascii="Kalinga" w:hAnsi="Kalinga"/>
-          <w:color w:val="auto"/>
-          <w:sz w:val="20"/>
-          <w:szCs w:val="20"/>
-          <w:lang w:val="en-US"/>
-        </w:rPr>
-        <w:t>default('', true)}} di Bank</w:t>
-      </w:r>
-      <w:r>
-        <w:rPr>
-          <w:rFonts w:hint="default" w:ascii="Kalinga" w:hAnsi="Kalinga"/>
-          <w:color w:val="auto"/>
-          <w:sz w:val="20"/>
-          <w:szCs w:val="20"/>
-        </w:rPr>
-        <w:t xml:space="preserve"> {{slik_bank_7_nama}} maks Rp. {{slik_bank_7_maks}} outs Rp. {{slik_bank_7_outs}} Coll {{slik_bank_7_coll}}.{% if slik_bank_7_alasan_aktif == 'ya' %} (Ket: {{ slik_bank_7_</w:t>
-      </w:r>
-      <w:r>
-        <w:rPr>
-          <w:rFonts w:hint="default" w:ascii="Kalinga" w:hAnsi="Kalinga"/>
-          <w:color w:val="auto"/>
-          <w:sz w:val="20"/>
-          <w:szCs w:val="20"/>
-          <w:lang w:val="en-US"/>
-        </w:rPr>
-        <w:t>alasan }}).</w:t>
-      </w:r>
-      <w:r>
-        <w:rPr>
-          <w:rFonts w:hint="default" w:ascii="Kalinga" w:hAnsi="Kalinga"/>
-          <w:color w:val="auto"/>
-          <w:sz w:val="20"/>
-          <w:szCs w:val="20"/>
-        </w:rPr>
-        <w:t xml:space="preserve">{% endif %}{% endif </w:t>
-      </w:r>
-      <w:r>
-        <w:rPr>
-          <w:rFonts w:hint="default" w:ascii="Kalinga" w:hAnsi="Kalinga"/>
-          <w:color w:val="auto"/>
-          <w:sz w:val="20"/>
-          <w:szCs w:val="20"/>
-          <w:lang w:val="en-US"/>
-        </w:rPr>
-        <w:t>%}{% if</w:t>
-      </w:r>
-      <w:r>
-        <w:rPr>
-          <w:rFonts w:hint="default" w:ascii="Kalinga" w:hAnsi="Kalinga"/>
-          <w:color w:val="auto"/>
-          <w:sz w:val="20"/>
-          <w:szCs w:val="20"/>
-        </w:rPr>
-        <w:t xml:space="preserve"> slik_bank_8_nama %}</w:t>
-      </w:r>
-    </w:p>
-    <w:p>
-      <w:pPr>
-        <w:pStyle w:val="6"/>
-        <w:numPr>
-          <w:ilvl w:val="0"/>
-          <w:numId w:val="1"/>
-        </w:numPr>
-        <w:spacing w:line="240" w:lineRule="auto"/>
-        <w:ind w:left="360" w:leftChars="0" w:right="160" w:rightChars="0" w:hanging="280" w:firstLineChars="0"/>
-        <w:jc w:val="both"/>
-        <w:rPr>
-          <w:rFonts w:hint="default" w:ascii="Kalinga" w:hAnsi="Kalinga"/>
-          <w:color w:val="auto"/>
-          <w:sz w:val="20"/>
-          <w:szCs w:val="20"/>
-        </w:rPr>
-      </w:pPr>
-      <w:r>
-        <w:rPr>
-          <w:rFonts w:hint="default" w:ascii="Kalinga" w:hAnsi="Kalinga"/>
-          <w:color w:val="auto"/>
-          <w:sz w:val="20"/>
-          <w:szCs w:val="20"/>
-        </w:rPr>
-        <w:t xml:space="preserve">Fasilitas Kredit {{slik_bank_8_jenis | </w:t>
-      </w:r>
-      <w:r>
-        <w:rPr>
-          <w:rFonts w:hint="default" w:ascii="Kalinga" w:hAnsi="Kalinga"/>
-          <w:color w:val="auto"/>
-          <w:sz w:val="20"/>
-          <w:szCs w:val="20"/>
-          <w:lang w:val="en-US"/>
-        </w:rPr>
-        <w:t>default('', true)}} di Bank</w:t>
-      </w:r>
-      <w:r>
-        <w:rPr>
-          <w:rFonts w:hint="default" w:ascii="Kalinga" w:hAnsi="Kalinga"/>
-          <w:color w:val="auto"/>
-          <w:sz w:val="20"/>
-          <w:szCs w:val="20"/>
-        </w:rPr>
-        <w:t xml:space="preserve"> {{slik_bank_8_nama}} maks Rp. {{slik_bank_8_maks}} outs Rp. {{slik_bank_8_outs}} Coll {{slik_bank_8_coll}}.{% if slik_bank_8_alasan_aktif == 'ya' %} (Ket: {{ slik_bank_8_</w:t>
-      </w:r>
-      <w:r>
-        <w:rPr>
-          <w:rFonts w:hint="default" w:ascii="Kalinga" w:hAnsi="Kalinga"/>
-          <w:color w:val="auto"/>
-          <w:sz w:val="20"/>
-          <w:szCs w:val="20"/>
-          <w:lang w:val="en-US"/>
-        </w:rPr>
-        <w:t>alasan }}).</w:t>
-      </w:r>
-      <w:r>
-        <w:rPr>
-          <w:rFonts w:hint="default" w:ascii="Kalinga" w:hAnsi="Kalinga"/>
-          <w:color w:val="auto"/>
-          <w:sz w:val="20"/>
-          <w:szCs w:val="20"/>
-        </w:rPr>
-        <w:t xml:space="preserve">{% endif %}{% endif </w:t>
-      </w:r>
-      <w:r>
-        <w:rPr>
-          <w:rFonts w:hint="default" w:ascii="Kalinga" w:hAnsi="Kalinga"/>
-          <w:color w:val="auto"/>
-          <w:sz w:val="20"/>
-          <w:szCs w:val="20"/>
-          <w:lang w:val="en-US"/>
-        </w:rPr>
-        <w:t>%}{% if</w:t>
-      </w:r>
-      <w:r>
-        <w:rPr>
-          <w:rFonts w:hint="default" w:ascii="Kalinga" w:hAnsi="Kalinga"/>
-          <w:color w:val="auto"/>
-          <w:sz w:val="20"/>
-          <w:szCs w:val="20"/>
-        </w:rPr>
-        <w:t xml:space="preserve"> slik_bank_9_nama %}</w:t>
-      </w:r>
-    </w:p>
-    <w:p>
-      <w:pPr>
-        <w:pStyle w:val="6"/>
-        <w:numPr>
-          <w:ilvl w:val="0"/>
-          <w:numId w:val="1"/>
-        </w:numPr>
-        <w:spacing w:line="240" w:lineRule="auto"/>
-        <w:ind w:left="360" w:leftChars="0" w:right="160" w:rightChars="0" w:hanging="280" w:firstLineChars="0"/>
-        <w:jc w:val="both"/>
-        <w:rPr>
-          <w:rFonts w:hint="default" w:ascii="Kalinga" w:hAnsi="Kalinga"/>
-          <w:color w:val="auto"/>
-          <w:sz w:val="20"/>
-          <w:szCs w:val="20"/>
-        </w:rPr>
-      </w:pPr>
-      <w:r>
-        <w:rPr>
-          <w:rFonts w:hint="default" w:ascii="Kalinga" w:hAnsi="Kalinga"/>
-          <w:color w:val="auto"/>
-          <w:sz w:val="20"/>
-          <w:szCs w:val="20"/>
-        </w:rPr>
-        <w:t xml:space="preserve">Fasilitas Kredit {{slik_bank_9_jenis | </w:t>
-      </w:r>
-      <w:r>
-        <w:rPr>
-          <w:rFonts w:hint="default" w:ascii="Kalinga" w:hAnsi="Kalinga"/>
-          <w:color w:val="auto"/>
-          <w:sz w:val="20"/>
-          <w:szCs w:val="20"/>
-          <w:lang w:val="en-US"/>
-        </w:rPr>
-        <w:t>default('', true)}} di Bank</w:t>
-      </w:r>
-      <w:r>
-        <w:rPr>
-          <w:rFonts w:hint="default" w:ascii="Kalinga" w:hAnsi="Kalinga"/>
-          <w:color w:val="auto"/>
-          <w:sz w:val="20"/>
-          <w:szCs w:val="20"/>
-        </w:rPr>
-        <w:t xml:space="preserve"> {{slik_bank_9_nama}} maks Rp. {{slik_bank_9_maks}} outs Rp. {{slik_bank_9_outs}} Coll {{slik_bank_9_coll}}.{% if slik_bank_9_alasan_aktif == 'ya' %} (Ket: {{ slik_bank_9_</w:t>
-      </w:r>
-      <w:r>
-        <w:rPr>
-          <w:rFonts w:hint="default" w:ascii="Kalinga" w:hAnsi="Kalinga"/>
-          <w:color w:val="auto"/>
-          <w:sz w:val="20"/>
-          <w:szCs w:val="20"/>
-          <w:lang w:val="en-US"/>
-        </w:rPr>
-        <w:t>alasan }}).</w:t>
-      </w:r>
-      <w:r>
-        <w:rPr>
-          <w:rFonts w:hint="default" w:ascii="Kalinga" w:hAnsi="Kalinga"/>
-          <w:color w:val="auto"/>
-          <w:sz w:val="20"/>
-          <w:szCs w:val="20"/>
-        </w:rPr>
-        <w:t xml:space="preserve">{% endif %}{% endif </w:t>
-      </w:r>
-      <w:r>
-        <w:rPr>
-          <w:rFonts w:hint="default" w:ascii="Kalinga" w:hAnsi="Kalinga"/>
-          <w:color w:val="auto"/>
-          <w:sz w:val="20"/>
-          <w:szCs w:val="20"/>
-          <w:lang w:val="en-US"/>
-        </w:rPr>
-        <w:t>%}{% if</w:t>
-      </w:r>
-      <w:r>
-        <w:rPr>
-          <w:rFonts w:hint="default" w:ascii="Kalinga" w:hAnsi="Kalinga"/>
-          <w:color w:val="auto"/>
-          <w:sz w:val="20"/>
-          <w:szCs w:val="20"/>
-        </w:rPr>
-        <w:t xml:space="preserve"> slik_bank_10_nama %}</w:t>
-      </w:r>
-    </w:p>
-    <w:p>
-      <w:pPr>
-        <w:pStyle w:val="6"/>
-        <w:numPr>
-          <w:ilvl w:val="0"/>
-          <w:numId w:val="1"/>
-        </w:numPr>
-        <w:spacing w:line="240" w:lineRule="auto"/>
-        <w:ind w:left="360" w:leftChars="0" w:right="160" w:rightChars="0" w:hanging="280" w:firstLineChars="0"/>
-        <w:jc w:val="both"/>
-        <w:rPr>
-          <w:rFonts w:hint="default" w:ascii="Kalinga" w:hAnsi="Kalinga"/>
-          <w:color w:val="auto"/>
-          <w:sz w:val="20"/>
-          <w:szCs w:val="20"/>
-        </w:rPr>
-      </w:pPr>
-      <w:r>
-        <w:rPr>
-          <w:rFonts w:hint="default" w:ascii="Kalinga" w:hAnsi="Kalinga"/>
-          <w:color w:val="auto"/>
-          <w:sz w:val="20"/>
-          <w:szCs w:val="20"/>
-        </w:rPr>
-        <w:t xml:space="preserve">Fasilitas Kredit {{slik_bank_10_jenis | </w:t>
-      </w:r>
-      <w:r>
-        <w:rPr>
-          <w:rFonts w:hint="default" w:ascii="Kalinga" w:hAnsi="Kalinga"/>
-          <w:color w:val="auto"/>
-          <w:sz w:val="20"/>
-          <w:szCs w:val="20"/>
-          <w:lang w:val="en-US"/>
-        </w:rPr>
-        <w:t>default('', true)}} di Bank</w:t>
-      </w:r>
-      <w:r>
-        <w:rPr>
-          <w:rFonts w:hint="default" w:ascii="Kalinga" w:hAnsi="Kalinga"/>
-          <w:color w:val="auto"/>
-          <w:sz w:val="20"/>
-          <w:szCs w:val="20"/>
-        </w:rPr>
-        <w:t xml:space="preserve"> {{slik_bank_10_nama}} maks Rp. {{slik_bank_10_maks}} outs Rp. {{slik_bank_10_outs}} Coll {{slik_bank_10_coll}}.{% if slik_bank_10_alasan_aktif == 'ya' %} (Ket: {{ slik_bank_10_</w:t>
-      </w:r>
-      <w:r>
-        <w:rPr>
-          <w:rFonts w:hint="default" w:ascii="Kalinga" w:hAnsi="Kalinga"/>
-          <w:color w:val="auto"/>
-          <w:sz w:val="20"/>
-          <w:szCs w:val="20"/>
-          <w:lang w:val="en-US"/>
-        </w:rPr>
-        <w:t>alasan }}).</w:t>
-      </w:r>
-      <w:r>
-        <w:rPr>
-          <w:rFonts w:hint="default" w:ascii="Kalinga" w:hAnsi="Kalinga"/>
-          <w:color w:val="auto"/>
-          <w:sz w:val="20"/>
-          <w:szCs w:val="20"/>
-        </w:rPr>
-        <w:t xml:space="preserve">{% endif %}{% endif </w:t>
-      </w:r>
-      <w:r>
-        <w:rPr>
-          <w:rFonts w:hint="default" w:ascii="Kalinga" w:hAnsi="Kalinga"/>
-          <w:color w:val="auto"/>
-          <w:sz w:val="20"/>
-          <w:szCs w:val="20"/>
-          <w:lang w:val="en-US"/>
-        </w:rPr>
-        <w:t>%}{% if</w:t>
-      </w:r>
-      <w:r>
-        <w:rPr>
-          <w:rFonts w:hint="default" w:ascii="Kalinga" w:hAnsi="Kalinga"/>
-          <w:color w:val="auto"/>
-          <w:sz w:val="20"/>
-          <w:szCs w:val="20"/>
-        </w:rPr>
-        <w:t xml:space="preserve"> slik_bank_11_nama %}</w:t>
-      </w:r>
-    </w:p>
-    <w:p>
-      <w:pPr>
-        <w:pStyle w:val="6"/>
-        <w:numPr>
-          <w:ilvl w:val="0"/>
-          <w:numId w:val="1"/>
-        </w:numPr>
-        <w:spacing w:line="240" w:lineRule="auto"/>
-        <w:ind w:left="360" w:leftChars="0" w:right="160" w:rightChars="0" w:hanging="280" w:firstLineChars="0"/>
-        <w:jc w:val="both"/>
-        <w:rPr>
-          <w:rFonts w:hint="default" w:ascii="Kalinga" w:hAnsi="Kalinga"/>
-          <w:color w:val="auto"/>
-          <w:sz w:val="20"/>
-          <w:szCs w:val="20"/>
-        </w:rPr>
-      </w:pPr>
-      <w:r>
-        <w:rPr>
-          <w:rFonts w:hint="default" w:ascii="Kalinga" w:hAnsi="Kalinga"/>
-          <w:color w:val="auto"/>
-          <w:sz w:val="20"/>
-          <w:szCs w:val="20"/>
-          <w:lang w:val="en-US"/>
-        </w:rPr>
-        <w:t>F</w:t>
-      </w:r>
-      <w:r>
-        <w:rPr>
-          <w:rFonts w:hint="default" w:ascii="Kalinga" w:hAnsi="Kalinga"/>
-          <w:color w:val="auto"/>
-          <w:sz w:val="20"/>
-          <w:szCs w:val="20"/>
-        </w:rPr>
-        <w:t xml:space="preserve">asilitas Kredit {{slik_bank_11_jenis | </w:t>
-      </w:r>
-      <w:r>
-        <w:rPr>
-          <w:rFonts w:hint="default" w:ascii="Kalinga" w:hAnsi="Kalinga"/>
-          <w:color w:val="auto"/>
-          <w:sz w:val="20"/>
-          <w:szCs w:val="20"/>
-          <w:lang w:val="en-US"/>
-        </w:rPr>
-        <w:t>default('', true)}} di Bank</w:t>
-      </w:r>
-      <w:r>
-        <w:rPr>
-          <w:rFonts w:hint="default" w:ascii="Kalinga" w:hAnsi="Kalinga"/>
-          <w:color w:val="auto"/>
-          <w:sz w:val="20"/>
-          <w:szCs w:val="20"/>
-        </w:rPr>
-        <w:t xml:space="preserve"> {{slik_bank_11_nama}} maks Rp. {{slik_bank_11_maks}} outs Rp. {{slik_bank_11_outs}} Coll {{slik_bank_11_coll}}.{% if slik_bank_11_alasan_aktif == 'ya' %} (Ket: {{ slik_bank_11_</w:t>
-      </w:r>
-      <w:r>
-        <w:rPr>
-          <w:rFonts w:hint="default" w:ascii="Kalinga" w:hAnsi="Kalinga"/>
-          <w:color w:val="auto"/>
-          <w:sz w:val="20"/>
-          <w:szCs w:val="20"/>
-          <w:lang w:val="en-US"/>
-        </w:rPr>
-        <w:t>alasan }}).</w:t>
-      </w:r>
-      <w:r>
-        <w:rPr>
-          <w:rFonts w:hint="default" w:ascii="Kalinga" w:hAnsi="Kalinga"/>
-          <w:color w:val="auto"/>
-          <w:sz w:val="20"/>
-          <w:szCs w:val="20"/>
-        </w:rPr>
-        <w:t xml:space="preserve">{% endif %}{% endif </w:t>
-      </w:r>
-      <w:r>
-        <w:rPr>
-          <w:rFonts w:hint="default" w:ascii="Kalinga" w:hAnsi="Kalinga"/>
-          <w:color w:val="auto"/>
-          <w:sz w:val="20"/>
-          <w:szCs w:val="20"/>
-          <w:lang w:val="en-US"/>
-        </w:rPr>
-        <w:t>%}{% if</w:t>
-      </w:r>
-      <w:r>
-        <w:rPr>
-          <w:rFonts w:hint="default" w:ascii="Kalinga" w:hAnsi="Kalinga"/>
-          <w:color w:val="auto"/>
-          <w:sz w:val="20"/>
-          <w:szCs w:val="20"/>
-        </w:rPr>
-        <w:t xml:space="preserve"> slik_bank_12_nama %}</w:t>
-      </w:r>
-    </w:p>
-    <w:p>
-      <w:pPr>
-        <w:pStyle w:val="6"/>
-        <w:numPr>
-          <w:ilvl w:val="0"/>
-          <w:numId w:val="1"/>
-        </w:numPr>
-        <w:spacing w:line="240" w:lineRule="auto"/>
-        <w:ind w:left="360" w:leftChars="0" w:right="160" w:rightChars="0" w:hanging="280" w:firstLineChars="0"/>
-        <w:jc w:val="both"/>
-        <w:rPr>
-          <w:rFonts w:hint="default" w:ascii="Kalinga" w:hAnsi="Kalinga"/>
-          <w:color w:val="auto"/>
-          <w:sz w:val="20"/>
-          <w:szCs w:val="20"/>
-        </w:rPr>
-      </w:pPr>
-      <w:r>
-        <w:rPr>
-          <w:rFonts w:hint="default" w:ascii="Kalinga" w:hAnsi="Kalinga"/>
-          <w:color w:val="auto"/>
-          <w:sz w:val="20"/>
-          <w:szCs w:val="20"/>
-        </w:rPr>
-        <w:t xml:space="preserve">Fasilitas Kredit {{slik_bank_12_jenis | </w:t>
-      </w:r>
-      <w:r>
-        <w:rPr>
-          <w:rFonts w:hint="default" w:ascii="Kalinga" w:hAnsi="Kalinga"/>
-          <w:color w:val="auto"/>
-          <w:sz w:val="20"/>
-          <w:szCs w:val="20"/>
-          <w:lang w:val="en-US"/>
-        </w:rPr>
-        <w:t>default('', true)}} di Bank</w:t>
-      </w:r>
-      <w:r>
-        <w:rPr>
-          <w:rFonts w:hint="default" w:ascii="Kalinga" w:hAnsi="Kalinga"/>
-          <w:color w:val="auto"/>
-          <w:sz w:val="20"/>
-          <w:szCs w:val="20"/>
-        </w:rPr>
-        <w:t xml:space="preserve"> {{slik_bank_12_nama}} maks Rp. {{slik_bank_12_maks}} outs Rp. {{slik_bank_12_outs}} Coll {{slik_bank_12_coll}}.{% if slik_bank_12_alasan_aktif == 'ya' %} (Ket: {{ slik_bank_12_</w:t>
-      </w:r>
-      <w:r>
-        <w:rPr>
-          <w:rFonts w:hint="default" w:ascii="Kalinga" w:hAnsi="Kalinga"/>
-          <w:color w:val="auto"/>
-          <w:sz w:val="20"/>
-          <w:szCs w:val="20"/>
-          <w:lang w:val="en-US"/>
-        </w:rPr>
-        <w:t>alasan }}).</w:t>
-      </w:r>
-      <w:r>
-        <w:rPr>
-          <w:rFonts w:hint="default" w:ascii="Kalinga" w:hAnsi="Kalinga"/>
-          <w:color w:val="auto"/>
-          <w:sz w:val="20"/>
-          <w:szCs w:val="20"/>
-        </w:rPr>
-        <w:t xml:space="preserve">{% endif %}{% endif </w:t>
-      </w:r>
-      <w:r>
-        <w:rPr>
-          <w:rFonts w:hint="default" w:ascii="Kalinga" w:hAnsi="Kalinga"/>
-          <w:color w:val="auto"/>
-          <w:sz w:val="20"/>
-          <w:szCs w:val="20"/>
-          <w:lang w:val="en-US"/>
-        </w:rPr>
-        <w:t>%}{% if</w:t>
-      </w:r>
-      <w:r>
-        <w:rPr>
-          <w:rFonts w:hint="default" w:ascii="Kalinga" w:hAnsi="Kalinga"/>
-          <w:color w:val="auto"/>
-          <w:sz w:val="20"/>
-          <w:szCs w:val="20"/>
-        </w:rPr>
-        <w:t xml:space="preserve"> slik_bank_13_nama %}</w:t>
-      </w:r>
-    </w:p>
-    <w:p>
-      <w:pPr>
-        <w:pStyle w:val="6"/>
-        <w:numPr>
-          <w:ilvl w:val="0"/>
-          <w:numId w:val="1"/>
-        </w:numPr>
-        <w:spacing w:line="240" w:lineRule="auto"/>
-        <w:ind w:left="360" w:leftChars="0" w:right="160" w:rightChars="0" w:hanging="280" w:firstLineChars="0"/>
-        <w:jc w:val="both"/>
-        <w:rPr>
-          <w:rFonts w:hint="default" w:ascii="Kalinga" w:hAnsi="Kalinga"/>
-          <w:color w:val="auto"/>
-          <w:sz w:val="20"/>
-          <w:szCs w:val="20"/>
-        </w:rPr>
-      </w:pPr>
-      <w:r>
-        <w:rPr>
-          <w:rFonts w:hint="default" w:ascii="Kalinga" w:hAnsi="Kalinga"/>
-          <w:color w:val="auto"/>
-          <w:sz w:val="20"/>
-          <w:szCs w:val="20"/>
-        </w:rPr>
-        <w:t xml:space="preserve">Fasilitas Kredit {{slik_bank_13_jenis | </w:t>
-      </w:r>
-      <w:r>
-        <w:rPr>
-          <w:rFonts w:hint="default" w:ascii="Kalinga" w:hAnsi="Kalinga"/>
-          <w:color w:val="auto"/>
-          <w:sz w:val="20"/>
-          <w:szCs w:val="20"/>
-          <w:lang w:val="en-US"/>
-        </w:rPr>
-        <w:t>default('', true)}} di Bank</w:t>
-      </w:r>
-      <w:r>
-        <w:rPr>
-          <w:rFonts w:hint="default" w:ascii="Kalinga" w:hAnsi="Kalinga"/>
-          <w:color w:val="auto"/>
-          <w:sz w:val="20"/>
-          <w:szCs w:val="20"/>
-        </w:rPr>
-        <w:t xml:space="preserve"> {{slik_bank_13_nama}} maks Rp. {{slik_bank_13_maks}} outs Rp. {{slik_bank_13_outs}} Coll {{slik_bank_13_coll}}.{% if slik_bank_13_alasan_aktif == 'ya' %} (Ket: {{ slik_bank_13_</w:t>
-      </w:r>
-      <w:r>
-        <w:rPr>
-          <w:rFonts w:hint="default" w:ascii="Kalinga" w:hAnsi="Kalinga"/>
-          <w:color w:val="auto"/>
-          <w:sz w:val="20"/>
-          <w:szCs w:val="20"/>
-          <w:lang w:val="en-US"/>
-        </w:rPr>
-        <w:t>alasan }}).</w:t>
-      </w:r>
-      <w:r>
-        <w:rPr>
-          <w:rFonts w:hint="default" w:ascii="Kalinga" w:hAnsi="Kalinga"/>
-          <w:color w:val="auto"/>
-          <w:sz w:val="20"/>
-          <w:szCs w:val="20"/>
-        </w:rPr>
-        <w:t xml:space="preserve">{% endif %}{% endif </w:t>
-      </w:r>
-      <w:r>
-        <w:rPr>
-          <w:rFonts w:hint="default" w:ascii="Kalinga" w:hAnsi="Kalinga"/>
-          <w:color w:val="auto"/>
-          <w:sz w:val="20"/>
-          <w:szCs w:val="20"/>
-          <w:lang w:val="en-US"/>
-        </w:rPr>
-        <w:t>%}{% if</w:t>
-      </w:r>
-      <w:r>
-        <w:rPr>
-          <w:rFonts w:hint="default" w:ascii="Kalinga" w:hAnsi="Kalinga"/>
-          <w:color w:val="auto"/>
-          <w:sz w:val="20"/>
-          <w:szCs w:val="20"/>
-        </w:rPr>
-        <w:t xml:space="preserve"> slik_bank_14_nama %}</w:t>
-      </w:r>
-    </w:p>
-    <w:p>
-      <w:pPr>
-        <w:pStyle w:val="6"/>
-        <w:numPr>
-          <w:ilvl w:val="0"/>
-          <w:numId w:val="1"/>
-        </w:numPr>
-        <w:spacing w:line="240" w:lineRule="auto"/>
-        <w:ind w:left="360" w:leftChars="0" w:right="160" w:rightChars="0" w:hanging="280" w:firstLineChars="0"/>
-        <w:jc w:val="both"/>
-        <w:rPr>
-          <w:rFonts w:hint="default" w:ascii="Kalinga" w:hAnsi="Kalinga"/>
-          <w:color w:val="auto"/>
-          <w:sz w:val="20"/>
-          <w:szCs w:val="20"/>
-        </w:rPr>
-      </w:pPr>
-      <w:r>
-        <w:rPr>
-          <w:rFonts w:hint="default" w:ascii="Kalinga" w:hAnsi="Kalinga"/>
-          <w:color w:val="auto"/>
-          <w:sz w:val="20"/>
-          <w:szCs w:val="20"/>
-        </w:rPr>
-        <w:t xml:space="preserve">Fasilitas Kredit {{slik_bank_14_jenis | </w:t>
-      </w:r>
-      <w:r>
-        <w:rPr>
-          <w:rFonts w:hint="default" w:ascii="Kalinga" w:hAnsi="Kalinga"/>
-          <w:color w:val="auto"/>
-          <w:sz w:val="20"/>
-          <w:szCs w:val="20"/>
-          <w:lang w:val="en-US"/>
-        </w:rPr>
-        <w:t>default('', true)}} di Bank</w:t>
-      </w:r>
-      <w:r>
-        <w:rPr>
-          <w:rFonts w:hint="default" w:ascii="Kalinga" w:hAnsi="Kalinga"/>
-          <w:color w:val="auto"/>
-          <w:sz w:val="20"/>
-          <w:szCs w:val="20"/>
-        </w:rPr>
-        <w:t xml:space="preserve"> {{slik_bank_14_nama}} maks Rp. {{slik_bank_14_maks}} outs Rp. {{slik_bank_14_outs}} Coll {{slik_bank_14_coll}}.{% if slik_bank_14_alasan_aktif == 'ya' %} (Ket: {{ slik_bank_14_</w:t>
-      </w:r>
-      <w:r>
-        <w:rPr>
-          <w:rFonts w:hint="default" w:ascii="Kalinga" w:hAnsi="Kalinga"/>
-          <w:color w:val="auto"/>
-          <w:sz w:val="20"/>
-          <w:szCs w:val="20"/>
-          <w:lang w:val="en-US"/>
-        </w:rPr>
-        <w:t>alasan }}).</w:t>
-      </w:r>
-      <w:r>
-        <w:rPr>
-          <w:rFonts w:hint="default" w:ascii="Kalinga" w:hAnsi="Kalinga"/>
-          <w:color w:val="auto"/>
-          <w:sz w:val="20"/>
-          <w:szCs w:val="20"/>
-        </w:rPr>
-        <w:t xml:space="preserve">{% endif %}{% endif </w:t>
-      </w:r>
-      <w:r>
-        <w:rPr>
-          <w:rFonts w:hint="default" w:ascii="Kalinga" w:hAnsi="Kalinga"/>
-          <w:color w:val="auto"/>
-          <w:sz w:val="20"/>
-          <w:szCs w:val="20"/>
-          <w:lang w:val="en-US"/>
-        </w:rPr>
-        <w:t>%}{% if</w:t>
-      </w:r>
-      <w:r>
-        <w:rPr>
-          <w:rFonts w:hint="default" w:ascii="Kalinga" w:hAnsi="Kalinga"/>
-          <w:color w:val="auto"/>
-          <w:sz w:val="20"/>
-          <w:szCs w:val="20"/>
-        </w:rPr>
-        <w:t xml:space="preserve"> slik_bank_15_nama %}</w:t>
-      </w:r>
-    </w:p>
-    <w:p>
-      <w:pPr>
-        <w:pStyle w:val="6"/>
-        <w:numPr>
-          <w:ilvl w:val="0"/>
-          <w:numId w:val="1"/>
-        </w:numPr>
-        <w:spacing w:line="240" w:lineRule="auto"/>
-        <w:ind w:left="360" w:leftChars="0" w:right="160" w:rightChars="0" w:hanging="280" w:firstLineChars="0"/>
-        <w:jc w:val="both"/>
-        <w:rPr>
-          <w:rFonts w:hint="default" w:ascii="Kalinga" w:hAnsi="Kalinga"/>
-          <w:color w:val="auto"/>
-          <w:sz w:val="20"/>
-          <w:szCs w:val="20"/>
-          <w:lang w:val="en-US"/>
-        </w:rPr>
-      </w:pPr>
-      <w:r>
-        <w:rPr>
-          <w:rFonts w:hint="default" w:ascii="Kalinga" w:hAnsi="Kalinga"/>
-          <w:color w:val="auto"/>
-          <w:sz w:val="20"/>
-          <w:szCs w:val="20"/>
-        </w:rPr>
-        <w:t xml:space="preserve">Fasilitas Kredit {{slik_bank_15_jenis | </w:t>
-      </w:r>
-      <w:r>
-        <w:rPr>
-          <w:rFonts w:hint="default" w:ascii="Kalinga" w:hAnsi="Kalinga"/>
-          <w:color w:val="auto"/>
-          <w:sz w:val="20"/>
-          <w:szCs w:val="20"/>
-          <w:lang w:val="en-US"/>
-        </w:rPr>
-        <w:t>default('', true)}} di Bank</w:t>
-      </w:r>
-      <w:r>
-        <w:rPr>
-          <w:rFonts w:hint="default" w:ascii="Kalinga" w:hAnsi="Kalinga"/>
-          <w:color w:val="auto"/>
-          <w:sz w:val="20"/>
-          <w:szCs w:val="20"/>
-        </w:rPr>
-        <w:t xml:space="preserve"> {{slik_bank_15_nama}} maks Rp. {{slik_bank_15_maks}} outs Rp. {{slik_bank_15_outs}} Coll {{slik_bank_15_coll}}.{% if slik_bank_15_alasan_aktif == 'ya' %} (Ket: {{ slik_bank_15_</w:t>
-      </w:r>
-      <w:r>
-        <w:rPr>
-          <w:rFonts w:hint="default" w:ascii="Kalinga" w:hAnsi="Kalinga"/>
-          <w:color w:val="auto"/>
-          <w:sz w:val="20"/>
-          <w:szCs w:val="20"/>
-          <w:lang w:val="en-US"/>
-        </w:rPr>
-        <w:t>alasan }}).</w:t>
-      </w:r>
-      <w:r>
-        <w:rPr>
-          <w:rFonts w:hint="default" w:ascii="Kalinga" w:hAnsi="Kalinga"/>
-          <w:color w:val="auto"/>
-          <w:sz w:val="20"/>
-          <w:szCs w:val="20"/>
-        </w:rPr>
-        <w:t xml:space="preserve">{% endif %}{% endif %}{% endif </w:t>
-      </w:r>
-      <w:r>
-        <w:rPr>
-          <w:rFonts w:hint="default" w:ascii="Kalinga" w:hAnsi="Kalinga"/>
-          <w:color w:val="auto"/>
-          <w:sz w:val="20"/>
-          <w:szCs w:val="20"/>
-          <w:lang w:val="en-US"/>
-        </w:rPr>
-        <w:t>%}{% if mitigasi_aktif == 'ya' and mitigasi_slik_no_surat %}</w:t>
+          <w:lang w:val="en-US"/>
+        </w:rPr>
+      </w:pPr>
+      <w:r>
+        <w:rPr>
+          <w:rFonts w:hint="default" w:ascii="Kalinga" w:hAnsi="Kalinga"/>
+          <w:color w:val="auto"/>
+          <w:sz w:val="20"/>
+          <w:szCs w:val="20"/>
+        </w:rPr>
+        <w:t>Fasilitas Kredit {{slik_bank_15_jenis | default('', true)}} di {{slik_bank_15_nama}} maks Rp. {{slik_bank_15_maks}} outs Rp. {{slik_bank_15_outs}} Coll {{slik_bank_15_coll}}.{% if slik_bank_15_takeover == 'ya' %} (Take Over){% endif %}{% if slik_bank_15_topup_lunas == 'ya' %} (Akan Dilunasi){% endif %}{% if slik_bank_15_alasan_aktif == 'ya' %} (Ket: {{ slik_bank_15_alasan }}).{% endif %}{% endif %}{% endif %}</w:t>
+      </w:r>
+      <w:r>
+        <w:rPr>
+          <w:rFonts w:hint="default" w:ascii="Kalinga" w:hAnsi="Kalinga"/>
+          <w:color w:val="auto"/>
+          <w:sz w:val="20"/>
+          <w:szCs w:val="20"/>
+          <w:lang w:val="en-US"/>
+        </w:rPr>
+        <w:t>{% if mitigasi_aktif == 'ya' %}</w:t>
       </w:r>
     </w:p>
     <w:p>
@@ -2128,22 +1245,29 @@
       <w:r>
         <w:rPr>
           <w:rFonts w:hint="default" w:ascii="Kalinga" w:hAnsi="Kalinga"/>
+          <w:b/>
+          <w:bCs/>
           <w:i/>
           <w:iCs/>
-          <w:color w:val="auto"/>
+          <w:color w:val="FF0000"/>
           <w:sz w:val="20"/>
           <w:szCs w:val="20"/>
           <w:u w:val="single"/>
           <w:lang w:val="en-US"/>
         </w:rPr>
-        <w:t>Mitigasi Risiko Cfm. Surat No. {{mitigasi_slik_no_surat}} Tanggal {{mitigasi_slik_tgl_surat}} Perihal {{isi_perihal_surat}}.</w:t>
-      </w:r>
-      <w:r>
-        <w:rPr>
-          <w:rFonts w:hint="default" w:ascii="Kalinga" w:hAnsi="Kalinga"/>
-          <w:color w:val="auto"/>
-          <w:sz w:val="20"/>
-          <w:szCs w:val="20"/>
+        <w:t>Mitigasi Risiko Cfm. Surat No. DNS/5.4/5645 Tanggal 09 Juli 2025 Perihal Penyampaian Program Relaksasi SLIK untuk Pemrosesan BNI Fleksi Pensiun Semester II Tahun 2025.</w:t>
+      </w:r>
+      <w:r>
+        <w:rPr>
+          <w:rFonts w:hint="default" w:ascii="Kalinga" w:hAnsi="Kalinga"/>
+          <w:b w:val="0"/>
+          <w:bCs w:val="0"/>
+          <w:i w:val="0"/>
+          <w:iCs w:val="0"/>
+          <w:color w:val="auto"/>
+          <w:sz w:val="20"/>
+          <w:szCs w:val="20"/>
+          <w:u w:val="single"/>
           <w:lang w:val="en-US"/>
         </w:rPr>
         <w:t>{% endif %}</w:t>
@@ -2186,7 +1310,32 @@
           <w:szCs w:val="20"/>
           <w:u w:val="single"/>
         </w:rPr>
-        <w:t xml:space="preserve">VERIKASI PENGHASILAN PEMOHON </w:t>
+        <w:t>VERI</w:t>
+      </w:r>
+      <w:r>
+        <w:rPr>
+          <w:rFonts w:hint="default" w:ascii="Kalinga" w:hAnsi="Kalinga" w:cs="Kalinga"/>
+          <w:b/>
+          <w:bCs/>
+          <w:color w:val="auto"/>
+          <w:sz w:val="20"/>
+          <w:szCs w:val="20"/>
+          <w:u w:val="single"/>
+          <w:lang w:val="en-US"/>
+        </w:rPr>
+        <w:t>FI</w:t>
+      </w:r>
+      <w:r>
+        <w:rPr>
+          <w:rFonts w:ascii="Kalinga" w:hAnsi="Kalinga" w:cs="Kalinga"/>
+          <w:b/>
+          <w:bCs/>
+          <w:color w:val="auto"/>
+          <w:sz w:val="20"/>
+          <w:szCs w:val="20"/>
+          <w:u w:val="single"/>
+        </w:rPr>
+        <w:t xml:space="preserve">KASI PENGHASILAN PEMOHON </w:t>
       </w:r>
       <w:bookmarkStart w:id="2" w:name="OLE_LINK25"/>
     </w:p>
@@ -5083,14 +4232,14 @@
       <w:bookmarkStart w:id="3" w:name="OLE_LINK19"/>
       <w:bookmarkStart w:id="4" w:name="OLE_LINK17"/>
       <w:bookmarkStart w:id="5" w:name="OLE_LINK8"/>
-      <w:bookmarkStart w:id="6" w:name="OLE_LINK27"/>
-      <w:bookmarkStart w:id="7" w:name="OLE_LINK24"/>
-      <w:bookmarkStart w:id="8" w:name="OLE_LINK3"/>
-      <w:bookmarkStart w:id="9" w:name="OLE_LINK33"/>
-      <w:bookmarkStart w:id="10" w:name="OLE_LINK10"/>
-      <w:bookmarkStart w:id="11" w:name="OLE_LINK32"/>
-      <w:bookmarkStart w:id="12" w:name="OLE_LINK41"/>
-      <w:bookmarkStart w:id="13" w:name="OLE_LINK23"/>
+      <w:bookmarkStart w:id="6" w:name="OLE_LINK3"/>
+      <w:bookmarkStart w:id="7" w:name="OLE_LINK27"/>
+      <w:bookmarkStart w:id="8" w:name="OLE_LINK33"/>
+      <w:bookmarkStart w:id="9" w:name="OLE_LINK10"/>
+      <w:bookmarkStart w:id="10" w:name="OLE_LINK41"/>
+      <w:bookmarkStart w:id="11" w:name="OLE_LINK23"/>
+      <w:bookmarkStart w:id="12" w:name="OLE_LINK32"/>
+      <w:bookmarkStart w:id="13" w:name="OLE_LINK24"/>
       <w:r>
         <w:rPr>
           <w:rFonts w:ascii="Kalinga" w:hAnsi="Kalinga" w:cs="Kalinga"/>
@@ -5526,7 +4675,26 @@
           <w:sz w:val="20"/>
           <w:szCs w:val="20"/>
         </w:rPr>
-        <w:t>Biaya Propisi {{ biaya_provisi_persen | default('0', true) }}% dari Maksimum Kredit atau sebesar Rp. {{ biaya_provisi_nominal | default('0', true) }},- Biaya Tata Laksana {{ biaya_tata_laksana_persen | default('0', true) }}% dari maksimum kredit atau sebesar Rp. {{ biaya_tata_laksana_nominal | default('0', true) }} dan {% if bebas_biaya_administrasi == 'ya' %}Bebas Biaya Administrasi{% else %}</w:t>
+        <w:t>Biaya Pro</w:t>
+      </w:r>
+      <w:r>
+        <w:rPr>
+          <w:rFonts w:hint="default" w:ascii="Kalinga" w:hAnsi="Kalinga"/>
+          <w:color w:val="auto"/>
+          <w:sz w:val="20"/>
+          <w:szCs w:val="20"/>
+          <w:lang w:val="en-US"/>
+        </w:rPr>
+        <w:t>v</w:t>
+      </w:r>
+      <w:r>
+        <w:rPr>
+          <w:rFonts w:hint="default" w:ascii="Kalinga" w:hAnsi="Kalinga"/>
+          <w:color w:val="auto"/>
+          <w:sz w:val="20"/>
+          <w:szCs w:val="20"/>
+        </w:rPr>
+        <w:t>isi {{ biaya_provisi_persen | default('0', true) }}% dari Maksimum Kredit atau sebesar Rp. {{ biaya_provisi_nominal | default('0', true) }},- Biaya Tata Laksana {{ biaya_tata_laksana_persen | default('0', true) }}% dari maksimum kredit atau sebesar Rp. {{ biaya_tata_laksana_nominal | default('0', true) }} dan {% if bebas_biaya_administrasi == 'ya' %}Bebas Biaya Administrasi{% else %}</w:t>
       </w:r>
       <w:r>
         <w:rPr>
@@ -5545,63 +4713,115 @@
           <w:sz w:val="20"/>
           <w:szCs w:val="20"/>
         </w:rPr>
-        <w:t>iaya Administrasi sebesar Rp. {{ biaya_administrasi | default('0', true) }},-{% endif %} (Cfm Surat No DNS/5.4/8023 Perihal Program Pricing BNI Fleksi (Aktif&amp;Pensiun) Semester II 2025 tanggal 01-09-2025.</w:t>
-      </w:r>
-    </w:p>
-    <w:p>
-      <w:pPr>
-        <w:pStyle w:val="6"/>
-        <w:numPr>
-          <w:ilvl w:val="0"/>
-          <w:numId w:val="1"/>
-        </w:numPr>
-        <w:spacing w:line="240" w:lineRule="auto"/>
-        <w:ind w:left="360" w:leftChars="0" w:right="160" w:rightChars="0" w:hanging="280" w:firstLineChars="0"/>
-        <w:jc w:val="both"/>
-        <w:rPr>
-          <w:rFonts w:hint="default" w:ascii="Kalinga" w:hAnsi="Kalinga"/>
-          <w:color w:val="auto"/>
-          <w:sz w:val="20"/>
-          <w:szCs w:val="20"/>
-        </w:rPr>
-      </w:pPr>
-      <w:r>
-        <w:rPr>
-          <w:rFonts w:hint="default" w:ascii="Kalinga" w:hAnsi="Kalinga"/>
-          <w:color w:val="auto"/>
-          <w:sz w:val="20"/>
-          <w:szCs w:val="20"/>
-          <w:lang w:val="en-US"/>
-        </w:rPr>
-        <w:t xml:space="preserve">Membuka </w:t>
-      </w:r>
-      <w:r>
-        <w:rPr>
-          <w:rFonts w:hint="default" w:ascii="Kalinga" w:hAnsi="Kalinga"/>
-          <w:color w:val="auto"/>
-          <w:sz w:val="20"/>
-          <w:szCs w:val="20"/>
-        </w:rPr>
-        <w:t xml:space="preserve">Rekening BNI Taplus nomor atas nama </w:t>
-      </w:r>
-      <w:r>
-        <w:rPr>
-          <w:rFonts w:hint="default" w:ascii="Kalinga" w:hAnsi="Kalinga"/>
-          <w:color w:val="auto"/>
-          <w:sz w:val="20"/>
-          <w:szCs w:val="20"/>
-          <w:lang w:val="en-US"/>
-        </w:rPr>
-        <w:t>pemohon</w:t>
-      </w:r>
-      <w:r>
-        <w:rPr>
-          <w:rFonts w:hint="default" w:ascii="Kalinga" w:hAnsi="Kalinga"/>
-          <w:color w:val="auto"/>
-          <w:sz w:val="20"/>
-          <w:szCs w:val="20"/>
-        </w:rPr>
-        <w:t xml:space="preserve"> yang menjadi Rekening Payroll  Gaji Pensiun dan dijadikan sebagai Rekening Afiliasi Kredit</w:t>
+        <w:t>iaya Administrasi sebesar Rp. {{ biaya_administrasi | default('0', true) }},-{% endif %} (Cfm Surat No DNS/5.4/8023 Perihal Program Pricing BNI Fleksi (Aktif&amp;Pensiun) Semester II 2025 tanggal 01-09-2025.{% if (payroll_bank and 'BNI' in payroll_bank|upper) and (jenis_pengajuan == 'baru' or jenis_pengajuan == 'top_up' or jenis_pengajuan == 'top_up_sisa_gaji') %}</w:t>
+      </w:r>
+    </w:p>
+    <w:p>
+      <w:pPr>
+        <w:pStyle w:val="6"/>
+        <w:numPr>
+          <w:ilvl w:val="0"/>
+          <w:numId w:val="1"/>
+        </w:numPr>
+        <w:spacing w:line="240" w:lineRule="auto"/>
+        <w:ind w:left="360" w:leftChars="0" w:right="160" w:rightChars="0" w:hanging="280" w:firstLineChars="0"/>
+        <w:jc w:val="both"/>
+        <w:rPr>
+          <w:rFonts w:hint="default" w:ascii="Kalinga" w:hAnsi="Kalinga"/>
+          <w:color w:val="auto"/>
+          <w:sz w:val="20"/>
+          <w:szCs w:val="20"/>
+        </w:rPr>
+      </w:pPr>
+      <w:r>
+        <w:rPr>
+          <w:rFonts w:hint="default" w:ascii="Kalinga" w:hAnsi="Kalinga"/>
+          <w:color w:val="auto"/>
+          <w:sz w:val="20"/>
+          <w:szCs w:val="20"/>
+        </w:rPr>
+        <w:t>Rekening BNI Taplus nomor {{ payroll_no_rek | default('....................', true) }} atas nama {{ nama_pemohon | default('....................', true) }} yang menjadi Rekening Payroll Gaji Pensiun akan dijadikan sebagai Rekening Afiliasi Kredit.{% elif jenis_pengajuan == 'baru' or jenis_pengajuan == 'takeover' %}</w:t>
+      </w:r>
+    </w:p>
+    <w:p>
+      <w:pPr>
+        <w:pStyle w:val="6"/>
+        <w:numPr>
+          <w:ilvl w:val="0"/>
+          <w:numId w:val="1"/>
+        </w:numPr>
+        <w:spacing w:line="240" w:lineRule="auto"/>
+        <w:ind w:left="360" w:leftChars="0" w:right="160" w:rightChars="0" w:hanging="280" w:firstLineChars="0"/>
+        <w:jc w:val="both"/>
+        <w:rPr>
+          <w:rFonts w:hint="default" w:ascii="Kalinga" w:hAnsi="Kalinga"/>
+          <w:color w:val="auto"/>
+          <w:sz w:val="20"/>
+          <w:szCs w:val="20"/>
+        </w:rPr>
+      </w:pPr>
+      <w:r>
+        <w:rPr>
+          <w:rFonts w:hint="default" w:ascii="Kalinga" w:hAnsi="Kalinga"/>
+          <w:color w:val="auto"/>
+          <w:sz w:val="20"/>
+          <w:szCs w:val="20"/>
+        </w:rPr>
+        <w:t>Membuka Rekening BNI Taplus atas nama pemohon yang menjadi Rekening Payroll Gaji Pensiun dan dijadikan sebagai Rekening Afiliasi Kredit.{% endif %}</w:t>
+      </w:r>
+    </w:p>
+    <w:p>
+      <w:pPr>
+        <w:pStyle w:val="6"/>
+        <w:numPr>
+          <w:ilvl w:val="0"/>
+          <w:numId w:val="1"/>
+        </w:numPr>
+        <w:spacing w:line="240" w:lineRule="auto"/>
+        <w:ind w:left="360" w:leftChars="0" w:right="160" w:rightChars="0" w:hanging="280" w:firstLineChars="0"/>
+        <w:jc w:val="both"/>
+        <w:rPr>
+          <w:rFonts w:hint="default" w:ascii="Kalinga" w:hAnsi="Kalinga"/>
+          <w:color w:val="auto"/>
+          <w:sz w:val="20"/>
+          <w:szCs w:val="20"/>
+        </w:rPr>
+      </w:pPr>
+      <w:r>
+        <w:rPr>
+          <w:rFonts w:hint="default" w:ascii="Kalinga" w:hAnsi="Kalinga"/>
+          <w:color w:val="auto"/>
+          <w:sz w:val="20"/>
+          <w:szCs w:val="20"/>
+        </w:rPr>
+        <w:t>Menyerahkan Surat-Surat Pernyataan dan Surat Kuasa Debitur terkait pemberian Fasilitas Kredit Pensiun.</w:t>
+      </w:r>
+    </w:p>
+    <w:p>
+      <w:pPr>
+        <w:pStyle w:val="6"/>
+        <w:numPr>
+          <w:ilvl w:val="0"/>
+          <w:numId w:val="1"/>
+        </w:numPr>
+        <w:spacing w:line="240" w:lineRule="auto"/>
+        <w:ind w:left="360" w:leftChars="0" w:right="160" w:rightChars="0" w:hanging="280" w:firstLineChars="0"/>
+        <w:jc w:val="both"/>
+        <w:rPr>
+          <w:rFonts w:hint="default" w:ascii="Kalinga" w:hAnsi="Kalinga"/>
+          <w:color w:val="auto"/>
+          <w:sz w:val="20"/>
+          <w:szCs w:val="20"/>
+        </w:rPr>
+      </w:pPr>
+      <w:r>
+        <w:rPr>
+          <w:rFonts w:hint="default" w:ascii="Kalinga" w:hAnsi="Kalinga"/>
+          <w:color w:val="auto"/>
+          <w:sz w:val="20"/>
+          <w:szCs w:val="20"/>
+        </w:rPr>
+        <w:t>Menyerahkan Surat Pernyataan Siap Melakukan Pembayaran Apabila suatu saat Kehilangan Tunjangan</w:t>
       </w:r>
       <w:r>
         <w:rPr>
@@ -5638,34 +4858,53 @@
           <w:sz w:val="20"/>
           <w:szCs w:val="20"/>
         </w:rPr>
-        <w:t>Menyerahkan Surat-Surat Pernyataan dan Surat Kuasa Debitur terkait pemberian Fasilitas Kredit Pensiun.</w:t>
-      </w:r>
-    </w:p>
-    <w:p>
-      <w:pPr>
-        <w:pStyle w:val="6"/>
-        <w:numPr>
-          <w:ilvl w:val="0"/>
-          <w:numId w:val="1"/>
-        </w:numPr>
-        <w:spacing w:line="240" w:lineRule="auto"/>
-        <w:ind w:left="360" w:leftChars="0" w:right="160" w:rightChars="0" w:hanging="280" w:firstLineChars="0"/>
-        <w:jc w:val="both"/>
-        <w:rPr>
-          <w:rFonts w:hint="default" w:ascii="Kalinga" w:hAnsi="Kalinga"/>
-          <w:color w:val="auto"/>
-          <w:sz w:val="20"/>
-          <w:szCs w:val="20"/>
-        </w:rPr>
-      </w:pPr>
-      <w:r>
-        <w:rPr>
-          <w:rFonts w:hint="default" w:ascii="Kalinga" w:hAnsi="Kalinga"/>
-          <w:color w:val="auto"/>
-          <w:sz w:val="20"/>
-          <w:szCs w:val="20"/>
-        </w:rPr>
-        <w:t>Menyerahkan Surat Pernyataan Siap Melakukan Pembayaran Apabila suatu saat Kehilangan Tunjangan</w:t>
+        <w:t xml:space="preserve">Menyerahkan Surat </w:t>
+      </w:r>
+      <w:r>
+        <w:rPr>
+          <w:rFonts w:hint="default" w:ascii="Kalinga" w:hAnsi="Kalinga"/>
+          <w:color w:val="auto"/>
+          <w:sz w:val="20"/>
+          <w:szCs w:val="20"/>
+          <w:lang w:val="en-US"/>
+        </w:rPr>
+        <w:t xml:space="preserve">Pernyataan </w:t>
+      </w:r>
+      <w:r>
+        <w:rPr>
+          <w:rFonts w:hint="default" w:ascii="Kalinga" w:hAnsi="Kalinga"/>
+          <w:color w:val="auto"/>
+          <w:sz w:val="20"/>
+          <w:szCs w:val="20"/>
+        </w:rPr>
+        <w:t>Kesanggupan Pembayaran Angsuran Kredit Perbulan Diatas 70% dari Uang Pensiun atau Manfaat Pensiun Bulanan Yang Diterima.{% for item in syarat_penandatanganan_list %}</w:t>
+      </w:r>
+    </w:p>
+    <w:p>
+      <w:pPr>
+        <w:pStyle w:val="6"/>
+        <w:numPr>
+          <w:ilvl w:val="0"/>
+          <w:numId w:val="1"/>
+        </w:numPr>
+        <w:spacing w:line="240" w:lineRule="auto"/>
+        <w:ind w:left="360" w:leftChars="0" w:right="160" w:rightChars="0" w:hanging="280" w:firstLineChars="0"/>
+        <w:jc w:val="both"/>
+        <w:rPr>
+          <w:rFonts w:hint="default" w:ascii="Kalinga" w:hAnsi="Kalinga"/>
+          <w:color w:val="auto"/>
+          <w:sz w:val="20"/>
+          <w:szCs w:val="20"/>
+        </w:rPr>
+      </w:pPr>
+      <w:r>
+        <w:rPr>
+          <w:rFonts w:hint="default" w:ascii="Kalinga" w:hAnsi="Kalinga"/>
+          <w:color w:val="auto"/>
+          <w:sz w:val="20"/>
+          <w:szCs w:val="20"/>
+        </w:rPr>
+        <w:t>{{ item }}</w:t>
       </w:r>
       <w:r>
         <w:rPr>
@@ -5677,78 +4916,60 @@
         </w:rPr>
         <w:t>.</w:t>
       </w:r>
-    </w:p>
-    <w:p>
-      <w:pPr>
-        <w:pStyle w:val="6"/>
-        <w:numPr>
-          <w:ilvl w:val="0"/>
-          <w:numId w:val="1"/>
-        </w:numPr>
-        <w:spacing w:line="240" w:lineRule="auto"/>
-        <w:ind w:left="360" w:leftChars="0" w:right="160" w:rightChars="0" w:hanging="280" w:firstLineChars="0"/>
-        <w:jc w:val="both"/>
-        <w:rPr>
-          <w:rFonts w:hint="default" w:ascii="Kalinga" w:hAnsi="Kalinga"/>
-          <w:color w:val="auto"/>
-          <w:sz w:val="20"/>
-          <w:szCs w:val="20"/>
-        </w:rPr>
-      </w:pPr>
-      <w:r>
-        <w:rPr>
-          <w:rFonts w:hint="default" w:ascii="Kalinga" w:hAnsi="Kalinga"/>
-          <w:color w:val="auto"/>
-          <w:sz w:val="20"/>
-          <w:szCs w:val="20"/>
-        </w:rPr>
-        <w:t xml:space="preserve">Menyerahkan Surat </w:t>
-      </w:r>
-      <w:r>
-        <w:rPr>
-          <w:rFonts w:hint="default" w:ascii="Kalinga" w:hAnsi="Kalinga"/>
-          <w:color w:val="auto"/>
-          <w:sz w:val="20"/>
-          <w:szCs w:val="20"/>
-          <w:lang w:val="en-US"/>
-        </w:rPr>
-        <w:t xml:space="preserve">Pernyataan </w:t>
-      </w:r>
-      <w:r>
-        <w:rPr>
-          <w:rFonts w:hint="default" w:ascii="Kalinga" w:hAnsi="Kalinga"/>
-          <w:color w:val="auto"/>
-          <w:sz w:val="20"/>
-          <w:szCs w:val="20"/>
-        </w:rPr>
-        <w:t>Kesanggupan Pembayaran Angsuran Kredit Perbulan Diatas 70% dari Uang Pensiun atau Manfaat Pensiun Bulanan Yang Diterima.{% for item in syarat_penandatanganan_list %}</w:t>
-      </w:r>
-    </w:p>
-    <w:p>
-      <w:pPr>
-        <w:pStyle w:val="6"/>
-        <w:numPr>
-          <w:ilvl w:val="0"/>
-          <w:numId w:val="1"/>
-        </w:numPr>
-        <w:spacing w:line="240" w:lineRule="auto"/>
-        <w:ind w:left="360" w:leftChars="0" w:right="160" w:rightChars="0" w:hanging="280" w:firstLineChars="0"/>
-        <w:jc w:val="both"/>
-        <w:rPr>
-          <w:rFonts w:hint="default" w:ascii="Kalinga" w:hAnsi="Kalinga"/>
-          <w:color w:val="auto"/>
-          <w:sz w:val="20"/>
-          <w:szCs w:val="20"/>
-        </w:rPr>
-      </w:pPr>
-      <w:r>
-        <w:rPr>
-          <w:rFonts w:hint="default" w:ascii="Kalinga" w:hAnsi="Kalinga"/>
-          <w:color w:val="auto"/>
-          <w:sz w:val="20"/>
-          <w:szCs w:val="20"/>
-        </w:rPr>
-        <w:t>{{ item }}</w:t>
+      <w:r>
+        <w:rPr>
+          <w:rFonts w:hint="default" w:ascii="Kalinga" w:hAnsi="Kalinga"/>
+          <w:color w:val="auto"/>
+          <w:sz w:val="20"/>
+          <w:szCs w:val="20"/>
+        </w:rPr>
+        <w:t>{% endfor %}{% if jenis_pengajuan == 'top_up' or jenis_pengajuan == 'top_up_sisa_gaji' %}</w:t>
+      </w:r>
+    </w:p>
+    <w:p>
+      <w:pPr>
+        <w:pStyle w:val="6"/>
+        <w:numPr>
+          <w:ilvl w:val="0"/>
+          <w:numId w:val="1"/>
+        </w:numPr>
+        <w:spacing w:line="240" w:lineRule="auto"/>
+        <w:ind w:left="360" w:leftChars="0" w:right="160" w:rightChars="0" w:hanging="280" w:firstLineChars="0"/>
+        <w:jc w:val="both"/>
+        <w:rPr>
+          <w:rFonts w:hint="default" w:ascii="Kalinga" w:hAnsi="Kalinga"/>
+          <w:color w:val="auto"/>
+          <w:sz w:val="20"/>
+          <w:szCs w:val="20"/>
+        </w:rPr>
+      </w:pPr>
+      <w:r>
+        <w:rPr>
+          <w:rFonts w:hint="default" w:ascii="Kalinga" w:hAnsi="Kalinga"/>
+          <w:color w:val="auto"/>
+          <w:sz w:val="20"/>
+          <w:szCs w:val="20"/>
+        </w:rPr>
+        <w:t xml:space="preserve">Jaminan yang telah ada sebelumnya berupa Asli SK Pensiun atas nama Pemohon tetap dipertahankan sebagai Jaminan Kredit di BNI{% else %}Menyerahkan </w:t>
+      </w:r>
+      <w:r>
+        <w:rPr>
+          <w:rFonts w:hint="default" w:ascii="Kalinga" w:hAnsi="Kalinga"/>
+          <w:color w:val="auto"/>
+          <w:sz w:val="20"/>
+          <w:szCs w:val="20"/>
+          <w:lang w:val="en-US"/>
+        </w:rPr>
+        <w:t xml:space="preserve">Asli </w:t>
+      </w:r>
+      <w:r>
+        <w:rPr>
+          <w:rFonts w:hint="default" w:ascii="Kalinga" w:hAnsi="Kalinga"/>
+          <w:color w:val="auto"/>
+          <w:sz w:val="20"/>
+          <w:szCs w:val="20"/>
+        </w:rPr>
+        <w:t>SK Pensiun atas nama Pemohon sebagai Jaminan Kredit BNI</w:t>
       </w:r>
       <w:r>
         <w:rPr>
@@ -5767,91 +4988,26 @@
           <w:sz w:val="20"/>
           <w:szCs w:val="20"/>
         </w:rPr>
-        <w:t>{% endfor %}</w:t>
-      </w:r>
-    </w:p>
-    <w:p>
-      <w:pPr>
-        <w:pStyle w:val="6"/>
-        <w:numPr>
-          <w:ilvl w:val="0"/>
-          <w:numId w:val="1"/>
-        </w:numPr>
-        <w:spacing w:line="240" w:lineRule="auto"/>
-        <w:ind w:left="360" w:leftChars="0" w:right="160" w:rightChars="0" w:hanging="280" w:firstLineChars="0"/>
-        <w:jc w:val="both"/>
-        <w:rPr>
-          <w:rFonts w:hint="default" w:ascii="Kalinga" w:hAnsi="Kalinga"/>
-          <w:color w:val="auto"/>
-          <w:sz w:val="20"/>
-          <w:szCs w:val="20"/>
-        </w:rPr>
-      </w:pPr>
-      <w:r>
-        <w:rPr>
-          <w:rFonts w:hint="default" w:ascii="Kalinga" w:hAnsi="Kalinga"/>
-          <w:color w:val="auto"/>
-          <w:sz w:val="20"/>
-          <w:szCs w:val="20"/>
-        </w:rPr>
-        <w:t xml:space="preserve">{% if jenis_pengajuan == 'top_up' or jenis_pengajuan == 'top_up_sisa_gaji' %}Jaminan yang telah ada sebelumnya berupa Asli SK Pensiun atas nama Pemohon tetap dipertahankan sebagai Jaminan Kredit di BNI{% else %}Menyerahkan </w:t>
-      </w:r>
-      <w:r>
-        <w:rPr>
-          <w:rFonts w:hint="default" w:ascii="Kalinga" w:hAnsi="Kalinga"/>
-          <w:color w:val="auto"/>
-          <w:sz w:val="20"/>
-          <w:szCs w:val="20"/>
-          <w:lang w:val="en-US"/>
-        </w:rPr>
-        <w:t xml:space="preserve">Asli </w:t>
-      </w:r>
-      <w:r>
-        <w:rPr>
-          <w:rFonts w:hint="default" w:ascii="Kalinga" w:hAnsi="Kalinga"/>
-          <w:color w:val="auto"/>
-          <w:sz w:val="20"/>
-          <w:szCs w:val="20"/>
-        </w:rPr>
-        <w:t>SK Pensiun atas nama Pemohon sebagai Jaminan Kredit BNI{% endif %}</w:t>
-      </w:r>
-      <w:r>
-        <w:rPr>
-          <w:rFonts w:hint="default" w:ascii="Kalinga" w:hAnsi="Kalinga"/>
-          <w:color w:val="auto"/>
-          <w:sz w:val="20"/>
-          <w:szCs w:val="20"/>
-          <w:lang w:val="en-US"/>
-        </w:rPr>
-        <w:t>.</w:t>
-      </w:r>
-    </w:p>
-    <w:p>
-      <w:pPr>
-        <w:pStyle w:val="6"/>
-        <w:numPr>
-          <w:ilvl w:val="0"/>
-          <w:numId w:val="1"/>
-        </w:numPr>
-        <w:spacing w:line="240" w:lineRule="auto"/>
-        <w:ind w:left="360" w:leftChars="0" w:right="160" w:rightChars="0" w:hanging="280" w:firstLineChars="0"/>
-        <w:jc w:val="both"/>
-        <w:rPr>
-          <w:rFonts w:hint="default" w:ascii="Kalinga" w:hAnsi="Kalinga"/>
-          <w:color w:val="auto"/>
-          <w:sz w:val="20"/>
-          <w:szCs w:val="20"/>
-        </w:rPr>
-      </w:pPr>
-      <w:r>
-        <w:rPr>
-          <w:rFonts w:hint="default" w:ascii="Kalinga" w:hAnsi="Kalinga"/>
-          <w:color w:val="auto"/>
-          <w:sz w:val="20"/>
-          <w:szCs w:val="20"/>
-        </w:rPr>
-        <w:t>{% if jenis_pengajuan == 'top_up_sisa_gaji' %}</w:t>
-      </w:r>
+        <w:t>{% endif %}{% if jenis_pengajuan == 'top_up_sisa_gaji' %}</w:t>
+      </w:r>
+    </w:p>
+    <w:p>
+      <w:pPr>
+        <w:pStyle w:val="6"/>
+        <w:numPr>
+          <w:ilvl w:val="0"/>
+          <w:numId w:val="1"/>
+        </w:numPr>
+        <w:spacing w:line="240" w:lineRule="auto"/>
+        <w:ind w:left="360" w:leftChars="0" w:right="160" w:rightChars="0" w:hanging="280" w:firstLineChars="0"/>
+        <w:jc w:val="both"/>
+        <w:rPr>
+          <w:rFonts w:hint="default" w:ascii="Kalinga" w:hAnsi="Kalinga"/>
+          <w:color w:val="auto"/>
+          <w:sz w:val="20"/>
+          <w:szCs w:val="20"/>
+        </w:rPr>
+      </w:pPr>
       <w:r>
         <w:rPr>
           <w:rFonts w:hint="default" w:ascii="Kalinga" w:hAnsi="Kalinga" w:cs="Kalinga"/>
@@ -5911,7 +5067,7 @@
           <w:szCs w:val="20"/>
           <w:lang w:val="en-US"/>
         </w:rPr>
-        <w:t>, No. PK {{ no_pk_eksisting | default('-', true) }}</w:t>
+        <w:t>, No. PK {{ no_pk_eksisting | default('-', true) }}.</w:t>
       </w:r>
       <w:r>
         <w:rPr>
@@ -5922,18 +5078,6 @@
         </w:rPr>
         <w:t>{% endif %}</w:t>
       </w:r>
-      <w:r>
-        <w:rPr>
-          <w:rFonts w:hint="default" w:ascii="Kalinga" w:hAnsi="Kalinga"/>
-          <w:color w:val="auto"/>
-          <w:sz w:val="20"/>
-          <w:szCs w:val="20"/>
-          <w:lang w:val="en-US"/>
-        </w:rPr>
-        <w:t>.</w:t>
-      </w:r>
-      <w:bookmarkStart w:id="17" w:name="_GoBack"/>
-      <w:bookmarkEnd w:id="17"/>
     </w:p>
     <w:p>
       <w:pPr>
@@ -6186,7 +5330,28 @@
           <w:sz w:val="20"/>
           <w:szCs w:val="20"/>
         </w:rPr>
-        <w:t>Biaya Propisi, Tata Laksana dan Biaya lainnya (apabila ada) agar didebet dari Rekening Afiliasi atas nama Pemohon</w:t>
+        <w:t>Biaya Pro</w:t>
+      </w:r>
+      <w:r>
+        <w:rPr>
+          <w:rFonts w:hint="default" w:ascii="Kalinga" w:hAnsi="Kalinga"/>
+          <w:color w:val="auto"/>
+          <w:sz w:val="20"/>
+          <w:szCs w:val="20"/>
+          <w:lang w:val="en-US"/>
+        </w:rPr>
+        <w:t>v</w:t>
+      </w:r>
+      <w:bookmarkStart w:id="17" w:name="_GoBack"/>
+      <w:bookmarkEnd w:id="17"/>
+      <w:r>
+        <w:rPr>
+          <w:rFonts w:hint="default" w:ascii="Kalinga" w:hAnsi="Kalinga"/>
+          <w:color w:val="auto"/>
+          <w:sz w:val="20"/>
+          <w:szCs w:val="20"/>
+        </w:rPr>
+        <w:t>isi, Tata Laksana dan Biaya lainnya (apabila ada) agar didebet dari Rekening Afiliasi atas nama Pemohon</w:t>
       </w:r>
       <w:r>
         <w:rPr>
@@ -6205,6 +5370,182 @@
           <w:sz w:val="20"/>
           <w:szCs w:val="20"/>
         </w:rPr>
+        <w:t>{% if (payroll_bank and 'BNI' in payroll_bank|upper) and (jenis_pengajuan == 'baru' or jenis_pengajuan == 'top_up' or jenis_pengajuan == 'top_up_sisa_gaji') %}</w:t>
+      </w:r>
+    </w:p>
+    <w:p>
+      <w:pPr>
+        <w:pStyle w:val="6"/>
+        <w:numPr>
+          <w:ilvl w:val="0"/>
+          <w:numId w:val="1"/>
+        </w:numPr>
+        <w:spacing w:line="240" w:lineRule="auto"/>
+        <w:ind w:left="360" w:leftChars="0" w:right="160" w:rightChars="0" w:hanging="280" w:firstLineChars="0"/>
+        <w:jc w:val="both"/>
+        <w:rPr>
+          <w:rFonts w:hint="default" w:ascii="Kalinga" w:hAnsi="Kalinga"/>
+          <w:color w:val="auto"/>
+          <w:sz w:val="20"/>
+          <w:szCs w:val="20"/>
+        </w:rPr>
+      </w:pPr>
+      <w:r>
+        <w:rPr>
+          <w:rFonts w:hint="default" w:ascii="Kalinga" w:hAnsi="Kalinga"/>
+          <w:color w:val="auto"/>
+          <w:sz w:val="20"/>
+          <w:szCs w:val="20"/>
+        </w:rPr>
+        <w:t xml:space="preserve">Rekening BNI Taplus nomor {{ payroll_no_rek | default('....................', true) }} atas nama {{ nama_pemohon | default('....................', true) }} yang </w:t>
+      </w:r>
+      <w:r>
+        <w:rPr>
+          <w:rFonts w:hint="default" w:ascii="Kalinga" w:hAnsi="Kalinga"/>
+          <w:color w:val="auto"/>
+          <w:sz w:val="20"/>
+          <w:szCs w:val="20"/>
+          <w:lang w:val="en-US"/>
+        </w:rPr>
+        <w:t xml:space="preserve">menjadi </w:t>
+      </w:r>
+      <w:r>
+        <w:rPr>
+          <w:rFonts w:hint="default" w:ascii="Kalinga" w:hAnsi="Kalinga"/>
+          <w:color w:val="auto"/>
+          <w:sz w:val="20"/>
+          <w:szCs w:val="20"/>
+        </w:rPr>
+        <w:t>Rekening Payroll Gaji Pensiun akan dijadikan sebagai Rekening Afiliasi Kredit dan diblokir sebesar {{ blokir_angsuran_lunas | default('0', true) }} ({{ blokir_angsuran_lunas_terbilang | default('Nol', true) }}) kali angsuran (Pokok+ Bunga serta ditambah saldo minimum, dapat dibuka blokir saat kredit lunas). Dana ini dapat dipotong dari Pencairan Kredit.{% elif jenis_pengajuan == 'baru' or jenis_pengajuan == 'takeover' %}</w:t>
+      </w:r>
+    </w:p>
+    <w:p>
+      <w:pPr>
+        <w:pStyle w:val="6"/>
+        <w:numPr>
+          <w:ilvl w:val="0"/>
+          <w:numId w:val="1"/>
+        </w:numPr>
+        <w:spacing w:line="240" w:lineRule="auto"/>
+        <w:ind w:left="360" w:leftChars="0" w:right="160" w:rightChars="0" w:hanging="280" w:firstLineChars="0"/>
+        <w:jc w:val="both"/>
+        <w:rPr>
+          <w:rFonts w:hint="default" w:ascii="Kalinga" w:hAnsi="Kalinga"/>
+          <w:color w:val="auto"/>
+          <w:sz w:val="20"/>
+          <w:szCs w:val="20"/>
+        </w:rPr>
+      </w:pPr>
+      <w:r>
+        <w:rPr>
+          <w:rFonts w:hint="default" w:ascii="Kalinga" w:hAnsi="Kalinga"/>
+          <w:color w:val="auto"/>
+          <w:sz w:val="20"/>
+          <w:szCs w:val="20"/>
+        </w:rPr>
+        <w:t xml:space="preserve">Rekening BNI Taplus atas nama Pemohon yang </w:t>
+      </w:r>
+      <w:r>
+        <w:rPr>
+          <w:rFonts w:hint="default" w:ascii="Kalinga" w:hAnsi="Kalinga"/>
+          <w:color w:val="auto"/>
+          <w:sz w:val="20"/>
+          <w:szCs w:val="20"/>
+          <w:lang w:val="en-US"/>
+        </w:rPr>
+        <w:t>menjadi</w:t>
+      </w:r>
+      <w:r>
+        <w:rPr>
+          <w:rFonts w:hint="default" w:ascii="Kalinga" w:hAnsi="Kalinga"/>
+          <w:color w:val="auto"/>
+          <w:sz w:val="20"/>
+          <w:szCs w:val="20"/>
+        </w:rPr>
+        <w:t xml:space="preserve"> Rekening Payroll Gaji Pensiun </w:t>
+      </w:r>
+      <w:r>
+        <w:rPr>
+          <w:rFonts w:hint="default" w:ascii="Kalinga" w:hAnsi="Kalinga"/>
+          <w:color w:val="auto"/>
+          <w:sz w:val="20"/>
+          <w:szCs w:val="20"/>
+          <w:lang w:val="en-US"/>
+        </w:rPr>
+        <w:t xml:space="preserve">akan </w:t>
+      </w:r>
+      <w:r>
+        <w:rPr>
+          <w:rFonts w:hint="default" w:ascii="Kalinga" w:hAnsi="Kalinga"/>
+          <w:color w:val="auto"/>
+          <w:sz w:val="20"/>
+          <w:szCs w:val="20"/>
+        </w:rPr>
+        <w:t>dijadikan sebagai Rekening Afiliasi Kredit dan diblokir sebesar {{ blokir_angsuran_total | default('0', true) }} ({{ blokir_angsuran_total_terbilang | default('Nol', true) }}) kali angsuran ({{ blokir_angsuran_pindah_gaji | default('0', true) }} ({{ blokir_angsuran_pindah_gaji_terbilang | default('Nol', true) }}) kali angsuran Pindah Gaji (dapat dibuka setelah Gaji Pensiun telah tercermin di Rekening Afiliasi Kredit BNI) dan {{ blokir_angsuran_lunas | default('0', true) }} ({{ blokir_angsuran_lunas_terbilang | default('Nol', true) }}) kali angsuran (Pokok+ Bunga serta ditambah saldo minimum, dapat dibuka blokir saat kredit lunas). Dana ini dapat dipotong dari Pencairan Kredit.{% endif %}</w:t>
+      </w:r>
+    </w:p>
+    <w:p>
+      <w:pPr>
+        <w:pStyle w:val="6"/>
+        <w:numPr>
+          <w:ilvl w:val="0"/>
+          <w:numId w:val="1"/>
+        </w:numPr>
+        <w:spacing w:line="240" w:lineRule="auto"/>
+        <w:ind w:left="360" w:leftChars="0" w:right="160" w:rightChars="0" w:hanging="280" w:firstLineChars="0"/>
+        <w:jc w:val="both"/>
+        <w:rPr>
+          <w:rFonts w:hint="default" w:ascii="Kalinga" w:hAnsi="Kalinga"/>
+          <w:color w:val="auto"/>
+          <w:sz w:val="20"/>
+          <w:szCs w:val="20"/>
+        </w:rPr>
+      </w:pPr>
+      <w:r>
+        <w:rPr>
+          <w:rFonts w:ascii="Kalinga" w:hAnsi="Kalinga" w:cs="Kalinga"/>
+          <w:color w:val="auto"/>
+          <w:sz w:val="20"/>
+          <w:szCs w:val="20"/>
+        </w:rPr>
+        <w:t xml:space="preserve">Pencairan dengan Maksimum Kredit sebesar Rp. </w:t>
+      </w:r>
+      <w:r>
+        <w:rPr>
+          <w:rFonts w:hint="default" w:ascii="Kalinga" w:hAnsi="Kalinga"/>
+          <w:color w:val="auto"/>
+          <w:sz w:val="20"/>
+          <w:szCs w:val="20"/>
+          <w:lang w:val="en-US"/>
+        </w:rPr>
+        <w:t xml:space="preserve">{{ usulan_plafon_kredit | default('0', true) }},- </w:t>
+      </w:r>
+      <w:r>
+        <w:rPr>
+          <w:rFonts w:ascii="Kalinga" w:hAnsi="Kalinga" w:cs="Kalinga"/>
+          <w:color w:val="auto"/>
+          <w:sz w:val="20"/>
+          <w:szCs w:val="20"/>
+        </w:rPr>
+        <w:t xml:space="preserve"> akan dilakukan secara sekaligus ke Rekening atas nama Pemoho</w:t>
+      </w:r>
+      <w:r>
+        <w:rPr>
+          <w:rFonts w:hint="default" w:ascii="Kalinga" w:hAnsi="Kalinga" w:cs="Kalinga"/>
+          <w:color w:val="auto"/>
+          <w:sz w:val="20"/>
+          <w:szCs w:val="20"/>
+          <w:lang w:val="en-US"/>
+        </w:rPr>
+        <w:t>n.</w:t>
+      </w:r>
+      <w:r>
+        <w:rPr>
+          <w:rFonts w:hint="default" w:ascii="Kalinga" w:hAnsi="Kalinga"/>
+          <w:color w:val="auto"/>
+          <w:sz w:val="20"/>
+          <w:szCs w:val="20"/>
+        </w:rPr>
         <w:t>{% for item in syarat_pencairan_list %}</w:t>
       </w:r>
     </w:p>
@@ -6219,6 +5560,906 @@
         <w:ind w:left="360" w:leftChars="0" w:right="160" w:rightChars="0" w:hanging="280" w:firstLineChars="0"/>
         <w:jc w:val="both"/>
         <w:rPr>
+          <w:rFonts w:hint="default" w:ascii="Kalinga" w:hAnsi="Kalinga"/>
+          <w:color w:val="auto"/>
+          <w:sz w:val="20"/>
+          <w:szCs w:val="20"/>
+        </w:rPr>
+      </w:pPr>
+      <w:r>
+        <w:rPr>
+          <w:rFonts w:hint="default" w:ascii="Kalinga" w:hAnsi="Kalinga"/>
+          <w:color w:val="auto"/>
+          <w:sz w:val="20"/>
+          <w:szCs w:val="20"/>
+        </w:rPr>
+        <w:t>{{ item }}{% endfor %}{% if (jenis_pengajuan == 'top_up' or jenis_pengajuan == 'top_up_sisa_gaji') and slik_bank_1_topup_lunas == 'ya' %}</w:t>
+      </w:r>
+    </w:p>
+    <w:p>
+      <w:pPr>
+        <w:pStyle w:val="6"/>
+        <w:numPr>
+          <w:ilvl w:val="0"/>
+          <w:numId w:val="1"/>
+        </w:numPr>
+        <w:spacing w:line="240" w:lineRule="auto"/>
+        <w:ind w:left="360" w:leftChars="0" w:right="160" w:rightChars="0" w:hanging="280" w:firstLineChars="0"/>
+        <w:jc w:val="both"/>
+        <w:rPr>
+          <w:rFonts w:hint="default" w:ascii="Kalinga" w:hAnsi="Kalinga"/>
+          <w:color w:val="auto"/>
+          <w:sz w:val="20"/>
+          <w:szCs w:val="20"/>
+        </w:rPr>
+      </w:pPr>
+      <w:r>
+        <w:rPr>
+          <w:rFonts w:hint="default" w:ascii="Kalinga" w:hAnsi="Kalinga"/>
+          <w:color w:val="auto"/>
+          <w:sz w:val="20"/>
+          <w:szCs w:val="20"/>
+        </w:rPr>
+        <w:t>Dilakukan penutupan fasilitas kredit {{ slik_bank_1_jenis | default('', true) }} sebelumnya di {{ slik_bank_1_nama | default('', true) }} dengan nomor rekening {{ no_rekening_pinjaman | default('', true) }} atas nama {{ nama_pemohon | default('', true) }} sebesar nominal pelunasan.{% elif jenis_pengajuan == 'takeover' and slik_bank_1_takeover == 'ya' %}</w:t>
+      </w:r>
+    </w:p>
+    <w:p>
+      <w:pPr>
+        <w:pStyle w:val="6"/>
+        <w:numPr>
+          <w:ilvl w:val="0"/>
+          <w:numId w:val="1"/>
+        </w:numPr>
+        <w:spacing w:line="240" w:lineRule="auto"/>
+        <w:ind w:left="360" w:leftChars="0" w:right="160" w:rightChars="0" w:hanging="280" w:firstLineChars="0"/>
+        <w:jc w:val="both"/>
+        <w:rPr>
+          <w:rFonts w:hint="default" w:ascii="Kalinga" w:hAnsi="Kalinga"/>
+          <w:color w:val="auto"/>
+          <w:sz w:val="20"/>
+          <w:szCs w:val="20"/>
+        </w:rPr>
+      </w:pPr>
+      <w:r>
+        <w:rPr>
+          <w:rFonts w:hint="default" w:ascii="Kalinga" w:hAnsi="Kalinga"/>
+          <w:color w:val="auto"/>
+          <w:sz w:val="20"/>
+          <w:szCs w:val="20"/>
+        </w:rPr>
+        <w:t>Dilakukan penutupan fasilitas kredit {{ slik_bank_1_jenis | default('', true) }} di {{ slik_bank_1_nama | default('', true) }} atas nama {{ nama_pemohon | default('', true) }} sebesar nominal pelunasan.{% endif %}{% if (jenis_pengajuan == 'top_up' or jenis_pengajuan == 'top_up_sisa_gaji') and slik_bank_2_topup_lunas == 'ya' %}</w:t>
+      </w:r>
+    </w:p>
+    <w:p>
+      <w:pPr>
+        <w:pStyle w:val="6"/>
+        <w:numPr>
+          <w:ilvl w:val="0"/>
+          <w:numId w:val="1"/>
+        </w:numPr>
+        <w:spacing w:line="240" w:lineRule="auto"/>
+        <w:ind w:left="360" w:leftChars="0" w:right="160" w:rightChars="0" w:hanging="280" w:firstLineChars="0"/>
+        <w:jc w:val="both"/>
+        <w:rPr>
+          <w:rFonts w:hint="default" w:ascii="Kalinga" w:hAnsi="Kalinga"/>
+          <w:color w:val="auto"/>
+          <w:sz w:val="20"/>
+          <w:szCs w:val="20"/>
+        </w:rPr>
+      </w:pPr>
+      <w:r>
+        <w:rPr>
+          <w:rFonts w:hint="default" w:ascii="Kalinga" w:hAnsi="Kalinga"/>
+          <w:color w:val="auto"/>
+          <w:sz w:val="20"/>
+          <w:szCs w:val="20"/>
+        </w:rPr>
+        <w:t>Dilakukan penutupan fasilitas kredit {{ slik_bank_2_jenis | default('', true) }} sebelumnya di {{ slik_bank_2_nama | default('', true) }} dengan nomor rekening {{ no_rekening_pinjaman | default('', true) }} atas nama {{ nama_pemohon | default('', true) }} sebesar nominal pelunasan.{% elif jenis_pengajuan == 'takeover' and slik_bank_2_takeover == 'ya' %}</w:t>
+      </w:r>
+    </w:p>
+    <w:p>
+      <w:pPr>
+        <w:pStyle w:val="6"/>
+        <w:numPr>
+          <w:ilvl w:val="0"/>
+          <w:numId w:val="1"/>
+        </w:numPr>
+        <w:spacing w:line="240" w:lineRule="auto"/>
+        <w:ind w:left="360" w:leftChars="0" w:right="160" w:rightChars="0" w:hanging="280" w:firstLineChars="0"/>
+        <w:jc w:val="both"/>
+        <w:rPr>
+          <w:rFonts w:hint="default" w:ascii="Kalinga" w:hAnsi="Kalinga"/>
+          <w:color w:val="auto"/>
+          <w:sz w:val="20"/>
+          <w:szCs w:val="20"/>
+        </w:rPr>
+      </w:pPr>
+      <w:r>
+        <w:rPr>
+          <w:rFonts w:hint="default" w:ascii="Kalinga" w:hAnsi="Kalinga"/>
+          <w:color w:val="auto"/>
+          <w:sz w:val="20"/>
+          <w:szCs w:val="20"/>
+        </w:rPr>
+        <w:t>Dilakukan penutupan fasilitas kredit {{ slik_bank_2_jenis | default('', true) }} di {{ slik_bank_2_nama | default('', true) }} atas nama {{ nama_pemohon | default('', true) }} sebesar nominal pelunasan.{% endif %}{% if (jenis_pengajuan == 'top_up' or jenis_pengajuan == 'top_up_sisa_gaji') and slik_bank_3_topup_lunas == 'ya' %}</w:t>
+      </w:r>
+    </w:p>
+    <w:p>
+      <w:pPr>
+        <w:pStyle w:val="6"/>
+        <w:numPr>
+          <w:ilvl w:val="0"/>
+          <w:numId w:val="1"/>
+        </w:numPr>
+        <w:spacing w:line="240" w:lineRule="auto"/>
+        <w:ind w:left="360" w:leftChars="0" w:right="160" w:rightChars="0" w:hanging="280" w:firstLineChars="0"/>
+        <w:jc w:val="both"/>
+        <w:rPr>
+          <w:rFonts w:hint="default" w:ascii="Kalinga" w:hAnsi="Kalinga"/>
+          <w:color w:val="auto"/>
+          <w:sz w:val="20"/>
+          <w:szCs w:val="20"/>
+        </w:rPr>
+      </w:pPr>
+      <w:r>
+        <w:rPr>
+          <w:rFonts w:hint="default" w:ascii="Kalinga" w:hAnsi="Kalinga"/>
+          <w:color w:val="auto"/>
+          <w:sz w:val="20"/>
+          <w:szCs w:val="20"/>
+        </w:rPr>
+        <w:t>Dilakukan penutupan fasilitas kredit {{ slik_bank_3_jenis | default('', true) }} sebelumnya di {{ slik_bank_3_nama | default('', true) }} dengan nomor rekening {{ no_rekening_pinjaman | default('', true) }} atas nama {{ nama_pemohon | default('', true) }} sebesar nominal pelunasan.{% elif jenis_pengajuan == 'takeover' and slik_bank_3_takeover == 'ya' %}</w:t>
+      </w:r>
+    </w:p>
+    <w:p>
+      <w:pPr>
+        <w:pStyle w:val="6"/>
+        <w:numPr>
+          <w:ilvl w:val="0"/>
+          <w:numId w:val="1"/>
+        </w:numPr>
+        <w:spacing w:line="240" w:lineRule="auto"/>
+        <w:ind w:left="360" w:leftChars="0" w:right="160" w:rightChars="0" w:hanging="280" w:firstLineChars="0"/>
+        <w:jc w:val="both"/>
+        <w:rPr>
+          <w:rFonts w:hint="default" w:ascii="Kalinga" w:hAnsi="Kalinga"/>
+          <w:color w:val="auto"/>
+          <w:sz w:val="20"/>
+          <w:szCs w:val="20"/>
+        </w:rPr>
+      </w:pPr>
+      <w:r>
+        <w:rPr>
+          <w:rFonts w:hint="default" w:ascii="Kalinga" w:hAnsi="Kalinga"/>
+          <w:color w:val="auto"/>
+          <w:sz w:val="20"/>
+          <w:szCs w:val="20"/>
+        </w:rPr>
+        <w:t>Dilakukan penutupan fasilitas kredit {{ slik_bank_3_jenis | default('', true) }} di {{ slik_bank_3_nama | default('', true) }} atas nama {{ nama_pemohon | default('', true) }} sebesar nominal pelunasan.{% endif %}{% if (jenis_pengajuan == 'top_up' or jenis_pengajuan == 'top_up_sisa_gaji') and slik_bank_4_topup_lunas == 'ya' %}</w:t>
+      </w:r>
+    </w:p>
+    <w:p>
+      <w:pPr>
+        <w:pStyle w:val="6"/>
+        <w:numPr>
+          <w:ilvl w:val="0"/>
+          <w:numId w:val="1"/>
+        </w:numPr>
+        <w:spacing w:line="240" w:lineRule="auto"/>
+        <w:ind w:left="360" w:leftChars="0" w:right="160" w:rightChars="0" w:hanging="280" w:firstLineChars="0"/>
+        <w:jc w:val="both"/>
+        <w:rPr>
+          <w:rFonts w:hint="default" w:ascii="Kalinga" w:hAnsi="Kalinga"/>
+          <w:color w:val="auto"/>
+          <w:sz w:val="20"/>
+          <w:szCs w:val="20"/>
+        </w:rPr>
+      </w:pPr>
+      <w:r>
+        <w:rPr>
+          <w:rFonts w:hint="default" w:ascii="Kalinga" w:hAnsi="Kalinga"/>
+          <w:color w:val="auto"/>
+          <w:sz w:val="20"/>
+          <w:szCs w:val="20"/>
+        </w:rPr>
+        <w:t>Dilakukan penutupan fasilitas kredit {{ slik_bank_4_jenis | default('', true) }} sebelumnya di {{ slik_bank_4_nama | default('', true) }} dengan nomor rekening {{ no_rekening_pinjaman | default('', true) }} atas nama {{ nama_pemohon | default('', true) }} sebesar nominal pelunasan.{% elif jenis_pengajuan == 'takeover' and slik_bank_4_takeover == 'ya' %}</w:t>
+      </w:r>
+    </w:p>
+    <w:p>
+      <w:pPr>
+        <w:pStyle w:val="6"/>
+        <w:numPr>
+          <w:ilvl w:val="0"/>
+          <w:numId w:val="1"/>
+        </w:numPr>
+        <w:spacing w:line="240" w:lineRule="auto"/>
+        <w:ind w:left="360" w:leftChars="0" w:right="160" w:rightChars="0" w:hanging="280" w:firstLineChars="0"/>
+        <w:jc w:val="both"/>
+        <w:rPr>
+          <w:rFonts w:hint="default" w:ascii="Kalinga" w:hAnsi="Kalinga"/>
+          <w:color w:val="auto"/>
+          <w:sz w:val="20"/>
+          <w:szCs w:val="20"/>
+        </w:rPr>
+      </w:pPr>
+      <w:r>
+        <w:rPr>
+          <w:rFonts w:hint="default" w:ascii="Kalinga" w:hAnsi="Kalinga"/>
+          <w:color w:val="auto"/>
+          <w:sz w:val="20"/>
+          <w:szCs w:val="20"/>
+        </w:rPr>
+        <w:t>Dilakukan penutupan fasilitas kredit {{ slik_bank_4_jenis | default('', true) }} di {{ slik_bank_4_nama | default('', true) }} atas nama {{ nama_pemohon | default('', true) }} sebesar nominal pelunasan.{% endif %}{% if (jenis_pengajuan == 'top_up' or jenis_pengajuan == 'top_up_sisa_gaji') and slik_bank_5_topup_lunas == 'ya' %}</w:t>
+      </w:r>
+    </w:p>
+    <w:p>
+      <w:pPr>
+        <w:pStyle w:val="6"/>
+        <w:numPr>
+          <w:ilvl w:val="0"/>
+          <w:numId w:val="1"/>
+        </w:numPr>
+        <w:spacing w:line="240" w:lineRule="auto"/>
+        <w:ind w:left="360" w:leftChars="0" w:right="160" w:rightChars="0" w:hanging="280" w:firstLineChars="0"/>
+        <w:jc w:val="both"/>
+        <w:rPr>
+          <w:rFonts w:hint="default" w:ascii="Kalinga" w:hAnsi="Kalinga"/>
+          <w:color w:val="auto"/>
+          <w:sz w:val="20"/>
+          <w:szCs w:val="20"/>
+        </w:rPr>
+      </w:pPr>
+      <w:r>
+        <w:rPr>
+          <w:rFonts w:hint="default" w:ascii="Kalinga" w:hAnsi="Kalinga"/>
+          <w:color w:val="auto"/>
+          <w:sz w:val="20"/>
+          <w:szCs w:val="20"/>
+        </w:rPr>
+        <w:t>Dilakukan penutupan fasilitas kredit {{ slik_bank_5_jenis | default('', true) }} sebelumnya di {{ slik_bank_5_nama | default('', true) }} dengan nomor rekening {{ no_rekening_pinjaman | default('', true) }} atas nama {{ nama_pemohon | default('', true) }} sebesar nominal pelunasan.{% elif jenis_pengajuan == 'takeover' and slik_bank_5_takeover == 'ya' %}</w:t>
+      </w:r>
+    </w:p>
+    <w:p>
+      <w:pPr>
+        <w:pStyle w:val="6"/>
+        <w:numPr>
+          <w:ilvl w:val="0"/>
+          <w:numId w:val="1"/>
+        </w:numPr>
+        <w:spacing w:line="240" w:lineRule="auto"/>
+        <w:ind w:left="360" w:leftChars="0" w:right="160" w:rightChars="0" w:hanging="280" w:firstLineChars="0"/>
+        <w:jc w:val="both"/>
+        <w:rPr>
+          <w:rFonts w:hint="default" w:ascii="Kalinga" w:hAnsi="Kalinga"/>
+          <w:color w:val="auto"/>
+          <w:sz w:val="20"/>
+          <w:szCs w:val="20"/>
+        </w:rPr>
+      </w:pPr>
+      <w:r>
+        <w:rPr>
+          <w:rFonts w:hint="default" w:ascii="Kalinga" w:hAnsi="Kalinga"/>
+          <w:color w:val="auto"/>
+          <w:sz w:val="20"/>
+          <w:szCs w:val="20"/>
+        </w:rPr>
+        <w:t>Dilakukan penutupan fasilitas kredit {{ slik_bank_5_jenis | default('', true) }} di {{ slik_bank_5_nama | default('', true) }} atas nama {{ nama_pemohon | default('', true) }} sebesar nominal pelunasan.{% endif %}{% if (jenis_pengajuan == 'top_up' or jenis_pengajuan == 'top_up_sisa_gaji') and slik_bank_6_topup_lunas == 'ya' %}</w:t>
+      </w:r>
+    </w:p>
+    <w:p>
+      <w:pPr>
+        <w:pStyle w:val="6"/>
+        <w:numPr>
+          <w:ilvl w:val="0"/>
+          <w:numId w:val="1"/>
+        </w:numPr>
+        <w:spacing w:line="240" w:lineRule="auto"/>
+        <w:ind w:left="360" w:leftChars="0" w:right="160" w:rightChars="0" w:hanging="280" w:firstLineChars="0"/>
+        <w:jc w:val="both"/>
+        <w:rPr>
+          <w:rFonts w:hint="default" w:ascii="Kalinga" w:hAnsi="Kalinga"/>
+          <w:color w:val="auto"/>
+          <w:sz w:val="20"/>
+          <w:szCs w:val="20"/>
+        </w:rPr>
+      </w:pPr>
+      <w:r>
+        <w:rPr>
+          <w:rFonts w:hint="default" w:ascii="Kalinga" w:hAnsi="Kalinga"/>
+          <w:color w:val="auto"/>
+          <w:sz w:val="20"/>
+          <w:szCs w:val="20"/>
+        </w:rPr>
+        <w:t>Dilakukan penutupan fasilitas kredit {{ slik_bank_6_jenis | default('', true) }} sebelumnya di {{ slik_bank_6_nama | default('', true) }} dengan nomor rekening {{ no_rekening_pinjaman | default('', true) }} atas nama {{ nama_pemohon | default('', true) }} sebesar nominal pelunasan.{% elif jenis_pengajuan == 'takeover' and slik_bank_6_takeover == 'ya' %}</w:t>
+      </w:r>
+    </w:p>
+    <w:p>
+      <w:pPr>
+        <w:pStyle w:val="6"/>
+        <w:numPr>
+          <w:ilvl w:val="0"/>
+          <w:numId w:val="1"/>
+        </w:numPr>
+        <w:spacing w:line="240" w:lineRule="auto"/>
+        <w:ind w:left="360" w:leftChars="0" w:right="160" w:rightChars="0" w:hanging="280" w:firstLineChars="0"/>
+        <w:jc w:val="both"/>
+        <w:rPr>
+          <w:rFonts w:hint="default" w:ascii="Kalinga" w:hAnsi="Kalinga"/>
+          <w:color w:val="auto"/>
+          <w:sz w:val="20"/>
+          <w:szCs w:val="20"/>
+        </w:rPr>
+      </w:pPr>
+      <w:r>
+        <w:rPr>
+          <w:rFonts w:hint="default" w:ascii="Kalinga" w:hAnsi="Kalinga"/>
+          <w:color w:val="auto"/>
+          <w:sz w:val="20"/>
+          <w:szCs w:val="20"/>
+        </w:rPr>
+        <w:t>Dilakukan penutupan fasilitas kredit {{ slik_bank_6_jenis | default('', true) }} di {{ slik_bank_6_nama | default('', true) }} atas nama {{ nama_pemohon | default('', true) }} sebesar nominal pelunasan.{% endif %}{% if (jenis_pengajuan == 'top_up' or jenis_pengajuan == 'top_up_sisa_gaji') and slik_bank_7_topup_lunas == 'ya' %}</w:t>
+      </w:r>
+    </w:p>
+    <w:p>
+      <w:pPr>
+        <w:pStyle w:val="6"/>
+        <w:numPr>
+          <w:ilvl w:val="0"/>
+          <w:numId w:val="1"/>
+        </w:numPr>
+        <w:spacing w:line="240" w:lineRule="auto"/>
+        <w:ind w:left="360" w:leftChars="0" w:right="160" w:rightChars="0" w:hanging="280" w:firstLineChars="0"/>
+        <w:jc w:val="both"/>
+        <w:rPr>
+          <w:rFonts w:hint="default" w:ascii="Kalinga" w:hAnsi="Kalinga"/>
+          <w:color w:val="auto"/>
+          <w:sz w:val="20"/>
+          <w:szCs w:val="20"/>
+        </w:rPr>
+      </w:pPr>
+      <w:r>
+        <w:rPr>
+          <w:rFonts w:hint="default" w:ascii="Kalinga" w:hAnsi="Kalinga"/>
+          <w:color w:val="auto"/>
+          <w:sz w:val="20"/>
+          <w:szCs w:val="20"/>
+        </w:rPr>
+        <w:t>Dilakukan penutupan fasilitas kredit {{ slik_bank_7_jenis | default('', true) }} sebelumnya di {{ slik_bank_7_nama | default('', true) }} dengan nomor rekening {{ no_rekening_pinjaman | default('', true) }} atas nama {{ nama_pemohon | default('', true) }} sebesar nominal pelunasan.{% elif jenis_pengajuan == 'takeover' and slik_bank_7_takeover == 'ya' %}</w:t>
+      </w:r>
+    </w:p>
+    <w:p>
+      <w:pPr>
+        <w:pStyle w:val="6"/>
+        <w:numPr>
+          <w:ilvl w:val="0"/>
+          <w:numId w:val="1"/>
+        </w:numPr>
+        <w:spacing w:line="240" w:lineRule="auto"/>
+        <w:ind w:left="360" w:leftChars="0" w:right="160" w:rightChars="0" w:hanging="280" w:firstLineChars="0"/>
+        <w:jc w:val="both"/>
+        <w:rPr>
+          <w:rFonts w:hint="default" w:ascii="Kalinga" w:hAnsi="Kalinga"/>
+          <w:color w:val="auto"/>
+          <w:sz w:val="20"/>
+          <w:szCs w:val="20"/>
+        </w:rPr>
+      </w:pPr>
+      <w:r>
+        <w:rPr>
+          <w:rFonts w:hint="default" w:ascii="Kalinga" w:hAnsi="Kalinga"/>
+          <w:color w:val="auto"/>
+          <w:sz w:val="20"/>
+          <w:szCs w:val="20"/>
+        </w:rPr>
+        <w:t>Dilakukan penutupan fasilitas kredit {{ slik_bank_7_jenis | default('', true) }} di {{ slik_bank_7_nama | default('', true) }} atas nama {{ nama_pemohon | default('', true) }} sebesar nominal pelunasan.{% endif %}{% if (jenis_pengajuan == 'top_up' or jenis_pengajuan == 'top_up_sisa_gaji') and slik_bank_8_topup_lunas == 'ya' %}</w:t>
+      </w:r>
+    </w:p>
+    <w:p>
+      <w:pPr>
+        <w:pStyle w:val="6"/>
+        <w:numPr>
+          <w:ilvl w:val="0"/>
+          <w:numId w:val="1"/>
+        </w:numPr>
+        <w:spacing w:line="240" w:lineRule="auto"/>
+        <w:ind w:left="360" w:leftChars="0" w:right="160" w:rightChars="0" w:hanging="280" w:firstLineChars="0"/>
+        <w:jc w:val="both"/>
+        <w:rPr>
+          <w:rFonts w:hint="default" w:ascii="Kalinga" w:hAnsi="Kalinga"/>
+          <w:color w:val="auto"/>
+          <w:sz w:val="20"/>
+          <w:szCs w:val="20"/>
+        </w:rPr>
+      </w:pPr>
+      <w:r>
+        <w:rPr>
+          <w:rFonts w:hint="default" w:ascii="Kalinga" w:hAnsi="Kalinga"/>
+          <w:color w:val="auto"/>
+          <w:sz w:val="20"/>
+          <w:szCs w:val="20"/>
+        </w:rPr>
+        <w:t>Dilakukan penutupan fasilitas kredit {{ slik_bank_8_jenis | default('', true) }} sebelumnya di {{ slik_bank_8_nama | default('', true) }} dengan nomor rekening {{ no_rekening_pinjaman | default('', true) }} atas nama {{ nama_pemohon | default('', true) }} sebesar nominal pelunasan.{% elif jenis_pengajuan == 'takeover' and slik_bank_8_takeover == 'ya' %}</w:t>
+      </w:r>
+    </w:p>
+    <w:p>
+      <w:pPr>
+        <w:pStyle w:val="6"/>
+        <w:numPr>
+          <w:ilvl w:val="0"/>
+          <w:numId w:val="1"/>
+        </w:numPr>
+        <w:spacing w:line="240" w:lineRule="auto"/>
+        <w:ind w:left="360" w:leftChars="0" w:right="160" w:rightChars="0" w:hanging="280" w:firstLineChars="0"/>
+        <w:jc w:val="both"/>
+        <w:rPr>
+          <w:rFonts w:hint="default" w:ascii="Kalinga" w:hAnsi="Kalinga"/>
+          <w:color w:val="auto"/>
+          <w:sz w:val="20"/>
+          <w:szCs w:val="20"/>
+        </w:rPr>
+      </w:pPr>
+      <w:r>
+        <w:rPr>
+          <w:rFonts w:hint="default" w:ascii="Kalinga" w:hAnsi="Kalinga"/>
+          <w:color w:val="auto"/>
+          <w:sz w:val="20"/>
+          <w:szCs w:val="20"/>
+        </w:rPr>
+        <w:t>Dilakukan penutupan fasilitas kredit {{ slik_bank_8_jenis | default('', true) }} di {{ slik_bank_8_nama | default('', true) }} atas nama {{ nama_pemohon | default('', true) }} sebesar nominal pelunasan.{% endif %}{% if (jenis_pengajuan == 'top_up' or jenis_pengajuan == 'top_up_sisa_gaji') and slik_bank_9_topup_lunas == 'ya' %}</w:t>
+      </w:r>
+    </w:p>
+    <w:p>
+      <w:pPr>
+        <w:pStyle w:val="6"/>
+        <w:numPr>
+          <w:ilvl w:val="0"/>
+          <w:numId w:val="1"/>
+        </w:numPr>
+        <w:spacing w:line="240" w:lineRule="auto"/>
+        <w:ind w:left="360" w:leftChars="0" w:right="160" w:rightChars="0" w:hanging="280" w:firstLineChars="0"/>
+        <w:jc w:val="both"/>
+        <w:rPr>
+          <w:rFonts w:hint="default" w:ascii="Kalinga" w:hAnsi="Kalinga"/>
+          <w:color w:val="auto"/>
+          <w:sz w:val="20"/>
+          <w:szCs w:val="20"/>
+        </w:rPr>
+      </w:pPr>
+      <w:r>
+        <w:rPr>
+          <w:rFonts w:hint="default" w:ascii="Kalinga" w:hAnsi="Kalinga"/>
+          <w:color w:val="auto"/>
+          <w:sz w:val="20"/>
+          <w:szCs w:val="20"/>
+        </w:rPr>
+        <w:t>Dilakukan penutupan fasilitas kredit {{ slik_bank_9_jenis | default('', true) }} sebelumnya di {{ slik_bank_9_nama | default('', true) }} dengan nomor rekening {{ no_rekening_pinjaman | default('', true) }} atas nama {{ nama_pemohon | default('', true) }} sebesar nominal pelunasan.{% elif jenis_pengajuan == 'takeover' and slik_bank_9_takeover == 'ya' %}</w:t>
+      </w:r>
+    </w:p>
+    <w:p>
+      <w:pPr>
+        <w:pStyle w:val="6"/>
+        <w:numPr>
+          <w:ilvl w:val="0"/>
+          <w:numId w:val="1"/>
+        </w:numPr>
+        <w:spacing w:line="240" w:lineRule="auto"/>
+        <w:ind w:left="360" w:leftChars="0" w:right="160" w:rightChars="0" w:hanging="280" w:firstLineChars="0"/>
+        <w:jc w:val="both"/>
+        <w:rPr>
+          <w:rFonts w:hint="default" w:ascii="Kalinga" w:hAnsi="Kalinga"/>
+          <w:color w:val="auto"/>
+          <w:sz w:val="20"/>
+          <w:szCs w:val="20"/>
+        </w:rPr>
+      </w:pPr>
+      <w:r>
+        <w:rPr>
+          <w:rFonts w:hint="default" w:ascii="Kalinga" w:hAnsi="Kalinga"/>
+          <w:color w:val="auto"/>
+          <w:sz w:val="20"/>
+          <w:szCs w:val="20"/>
+        </w:rPr>
+        <w:t>Dilakukan penutupan fasilitas kredit {{ slik_bank_9_jenis | default('', true) }} di {{ slik_bank_9_nama | default('', true) }} atas nama {{ nama_pemohon | default('', true) }} sebesar nominal pelunasan.{% endif %}{% if (jenis_pengajuan == 'top_up' or jenis_pengajuan == 'top_up_sisa_gaji') and slik_bank_10_topup_lunas == 'ya' %}</w:t>
+      </w:r>
+    </w:p>
+    <w:p>
+      <w:pPr>
+        <w:pStyle w:val="6"/>
+        <w:numPr>
+          <w:ilvl w:val="0"/>
+          <w:numId w:val="1"/>
+        </w:numPr>
+        <w:spacing w:line="240" w:lineRule="auto"/>
+        <w:ind w:left="360" w:leftChars="0" w:right="160" w:rightChars="0" w:hanging="280" w:firstLineChars="0"/>
+        <w:jc w:val="both"/>
+        <w:rPr>
+          <w:rFonts w:hint="default" w:ascii="Kalinga" w:hAnsi="Kalinga"/>
+          <w:color w:val="auto"/>
+          <w:sz w:val="20"/>
+          <w:szCs w:val="20"/>
+        </w:rPr>
+      </w:pPr>
+      <w:r>
+        <w:rPr>
+          <w:rFonts w:hint="default" w:ascii="Kalinga" w:hAnsi="Kalinga"/>
+          <w:color w:val="auto"/>
+          <w:sz w:val="20"/>
+          <w:szCs w:val="20"/>
+        </w:rPr>
+        <w:t>Dilakukan penutupan fasilitas kredit {{ slik_bank_10_jenis | default('', true) }} sebelumnya di {{ slik_bank_10_nama | default('', true) }} dengan nomor rekening {{ no_rekening_pinjaman | default('', true) }} atas nama {{ nama_pemohon | default('', true) }} sebesar nominal pelunasan.{% elif jenis_pengajuan == 'takeover' and slik_bank_10_takeover == 'ya' %}</w:t>
+      </w:r>
+    </w:p>
+    <w:p>
+      <w:pPr>
+        <w:pStyle w:val="6"/>
+        <w:numPr>
+          <w:ilvl w:val="0"/>
+          <w:numId w:val="1"/>
+        </w:numPr>
+        <w:spacing w:line="240" w:lineRule="auto"/>
+        <w:ind w:left="360" w:leftChars="0" w:right="160" w:rightChars="0" w:hanging="280" w:firstLineChars="0"/>
+        <w:jc w:val="both"/>
+        <w:rPr>
+          <w:rFonts w:hint="default" w:ascii="Kalinga" w:hAnsi="Kalinga"/>
+          <w:color w:val="auto"/>
+          <w:sz w:val="20"/>
+          <w:szCs w:val="20"/>
+        </w:rPr>
+      </w:pPr>
+      <w:r>
+        <w:rPr>
+          <w:rFonts w:hint="default" w:ascii="Kalinga" w:hAnsi="Kalinga"/>
+          <w:color w:val="auto"/>
+          <w:sz w:val="20"/>
+          <w:szCs w:val="20"/>
+        </w:rPr>
+        <w:t>Dilakukan penutupan fasilitas kredit {{ slik_bank_10_jenis | default('', true) }} di {{ slik_bank_10_nama | default('', true) }} atas nama {{ nama_pemohon | default('', true) }} sebesar nominal pelunasan.{% endif %}{% if (jenis_pengajuan == 'top_up' or jenis_pengajuan == 'top_up_sisa_gaji') and slik_bank_11_topup_lunas == 'ya' %}</w:t>
+      </w:r>
+    </w:p>
+    <w:p>
+      <w:pPr>
+        <w:pStyle w:val="6"/>
+        <w:numPr>
+          <w:ilvl w:val="0"/>
+          <w:numId w:val="1"/>
+        </w:numPr>
+        <w:spacing w:line="240" w:lineRule="auto"/>
+        <w:ind w:left="360" w:leftChars="0" w:right="160" w:rightChars="0" w:hanging="280" w:firstLineChars="0"/>
+        <w:jc w:val="both"/>
+        <w:rPr>
+          <w:rFonts w:hint="default" w:ascii="Kalinga" w:hAnsi="Kalinga"/>
+          <w:color w:val="auto"/>
+          <w:sz w:val="20"/>
+          <w:szCs w:val="20"/>
+        </w:rPr>
+      </w:pPr>
+      <w:r>
+        <w:rPr>
+          <w:rFonts w:hint="default" w:ascii="Kalinga" w:hAnsi="Kalinga"/>
+          <w:color w:val="auto"/>
+          <w:sz w:val="20"/>
+          <w:szCs w:val="20"/>
+        </w:rPr>
+        <w:t>Dilakukan penutupan fasilitas kredit {{ slik_bank_11_jenis | default('', true) }} sebelumnya di {{ slik_bank_11_nama | default('', true) }} dengan nomor rekening {{ no_rekening_pinjaman | default('', true) }} atas nama {{ nama_pemohon | default('', true) }} sebesar nominal pelunasan.{% elif jenis_pengajuan == 'takeover' and slik_bank_11_takeover == 'ya' %}</w:t>
+      </w:r>
+    </w:p>
+    <w:p>
+      <w:pPr>
+        <w:pStyle w:val="6"/>
+        <w:numPr>
+          <w:ilvl w:val="0"/>
+          <w:numId w:val="1"/>
+        </w:numPr>
+        <w:spacing w:line="240" w:lineRule="auto"/>
+        <w:ind w:left="360" w:leftChars="0" w:right="160" w:rightChars="0" w:hanging="280" w:firstLineChars="0"/>
+        <w:jc w:val="both"/>
+        <w:rPr>
+          <w:rFonts w:hint="default" w:ascii="Kalinga" w:hAnsi="Kalinga"/>
+          <w:color w:val="auto"/>
+          <w:sz w:val="20"/>
+          <w:szCs w:val="20"/>
+        </w:rPr>
+      </w:pPr>
+      <w:r>
+        <w:rPr>
+          <w:rFonts w:hint="default" w:ascii="Kalinga" w:hAnsi="Kalinga"/>
+          <w:color w:val="auto"/>
+          <w:sz w:val="20"/>
+          <w:szCs w:val="20"/>
+        </w:rPr>
+        <w:t>Dilakukan penutupan fasilitas kredit {{ slik_bank_11_jenis | default('', true) }} di {{ slik_bank_11_nama | default('', true) }} atas nama {{ nama_pemohon | default('', true) }} sebesar nominal pelunasan.{% endif %}{% if (jenis_pengajuan == 'top_up' or jenis_pengajuan == 'top_up_sisa_gaji') and slik_bank_12_topup_lunas == 'ya' %}</w:t>
+      </w:r>
+    </w:p>
+    <w:p>
+      <w:pPr>
+        <w:pStyle w:val="6"/>
+        <w:numPr>
+          <w:ilvl w:val="0"/>
+          <w:numId w:val="1"/>
+        </w:numPr>
+        <w:spacing w:line="240" w:lineRule="auto"/>
+        <w:ind w:left="360" w:leftChars="0" w:right="160" w:rightChars="0" w:hanging="280" w:firstLineChars="0"/>
+        <w:jc w:val="both"/>
+        <w:rPr>
+          <w:rFonts w:hint="default" w:ascii="Kalinga" w:hAnsi="Kalinga"/>
+          <w:color w:val="auto"/>
+          <w:sz w:val="20"/>
+          <w:szCs w:val="20"/>
+        </w:rPr>
+      </w:pPr>
+      <w:r>
+        <w:rPr>
+          <w:rFonts w:hint="default" w:ascii="Kalinga" w:hAnsi="Kalinga"/>
+          <w:color w:val="auto"/>
+          <w:sz w:val="20"/>
+          <w:szCs w:val="20"/>
+        </w:rPr>
+        <w:t>Dilakukan penutupan fasilitas kredit {{ slik_bank_12_jenis | default('', true) }} sebelumnya di {{ slik_bank_12_nama | default('', true) }} dengan nomor rekening {{ no_rekening_pinjaman | default('', true) }} atas nama {{ nama_pemohon | default('', true) }} sebesar nominal pelunasan.{% elif jenis_pengajuan == 'takeover' and slik_bank_12_takeover == 'ya' %}</w:t>
+      </w:r>
+    </w:p>
+    <w:p>
+      <w:pPr>
+        <w:pStyle w:val="6"/>
+        <w:numPr>
+          <w:ilvl w:val="0"/>
+          <w:numId w:val="1"/>
+        </w:numPr>
+        <w:spacing w:line="240" w:lineRule="auto"/>
+        <w:ind w:left="360" w:leftChars="0" w:right="160" w:rightChars="0" w:hanging="280" w:firstLineChars="0"/>
+        <w:jc w:val="both"/>
+        <w:rPr>
+          <w:rFonts w:hint="default" w:ascii="Kalinga" w:hAnsi="Kalinga"/>
+          <w:color w:val="auto"/>
+          <w:sz w:val="20"/>
+          <w:szCs w:val="20"/>
+        </w:rPr>
+      </w:pPr>
+      <w:r>
+        <w:rPr>
+          <w:rFonts w:hint="default" w:ascii="Kalinga" w:hAnsi="Kalinga"/>
+          <w:color w:val="auto"/>
+          <w:sz w:val="20"/>
+          <w:szCs w:val="20"/>
+        </w:rPr>
+        <w:t>Dilakukan penutupan fasilitas kredit {{ slik_bank_12_jenis | default('', true) }} di {{ slik_bank_12_nama | default('', true) }} atas nama {{ nama_pemohon | default('', true) }} sebesar nominal pelunasan.{% endif %}{% if (jenis_pengajuan == 'top_up' or jenis_pengajuan == 'top_up_sisa_gaji') and slik_bank_13_topup_lunas == 'ya' %}</w:t>
+      </w:r>
+    </w:p>
+    <w:p>
+      <w:pPr>
+        <w:pStyle w:val="6"/>
+        <w:numPr>
+          <w:ilvl w:val="0"/>
+          <w:numId w:val="1"/>
+        </w:numPr>
+        <w:spacing w:line="240" w:lineRule="auto"/>
+        <w:ind w:left="360" w:leftChars="0" w:right="160" w:rightChars="0" w:hanging="280" w:firstLineChars="0"/>
+        <w:jc w:val="both"/>
+        <w:rPr>
+          <w:rFonts w:hint="default" w:ascii="Kalinga" w:hAnsi="Kalinga"/>
+          <w:color w:val="auto"/>
+          <w:sz w:val="20"/>
+          <w:szCs w:val="20"/>
+        </w:rPr>
+      </w:pPr>
+      <w:r>
+        <w:rPr>
+          <w:rFonts w:hint="default" w:ascii="Kalinga" w:hAnsi="Kalinga"/>
+          <w:color w:val="auto"/>
+          <w:sz w:val="20"/>
+          <w:szCs w:val="20"/>
+        </w:rPr>
+        <w:t>Dilakukan penutupan fasilitas kredit {{ slik_bank_13_jenis | default('', true) }} sebelumnya di {{ slik_bank_13_nama | default('', true) }} dengan nomor rekening {{ no_rekening_pinjaman | default('', true) }} atas nama {{ nama_pemohon | default('', true) }} sebesar nominal pelunasan.{% elif jenis_pengajuan == 'takeover' and slik_bank_13_takeover == 'ya' %}</w:t>
+      </w:r>
+    </w:p>
+    <w:p>
+      <w:pPr>
+        <w:pStyle w:val="6"/>
+        <w:numPr>
+          <w:ilvl w:val="0"/>
+          <w:numId w:val="1"/>
+        </w:numPr>
+        <w:spacing w:line="240" w:lineRule="auto"/>
+        <w:ind w:left="360" w:leftChars="0" w:right="160" w:rightChars="0" w:hanging="280" w:firstLineChars="0"/>
+        <w:jc w:val="both"/>
+        <w:rPr>
+          <w:rFonts w:hint="default" w:ascii="Kalinga" w:hAnsi="Kalinga"/>
+          <w:color w:val="auto"/>
+          <w:sz w:val="20"/>
+          <w:szCs w:val="20"/>
+        </w:rPr>
+      </w:pPr>
+      <w:r>
+        <w:rPr>
+          <w:rFonts w:hint="default" w:ascii="Kalinga" w:hAnsi="Kalinga"/>
+          <w:color w:val="auto"/>
+          <w:sz w:val="20"/>
+          <w:szCs w:val="20"/>
+        </w:rPr>
+        <w:t>Dilakukan penutupan fasilitas kredit {{ slik_bank_13_jenis | default('', true) }} di {{ slik_bank_13_nama | default('', true) }} atas nama {{ nama_pemohon | default('', true) }} sebesar nominal pelunasan.{% endif %}{% if (jenis_pengajuan == 'top_up' or jenis_pengajuan == 'top_up_sisa_gaji') and slik_bank_14_topup_lunas == 'ya' %}</w:t>
+      </w:r>
+    </w:p>
+    <w:p>
+      <w:pPr>
+        <w:pStyle w:val="6"/>
+        <w:numPr>
+          <w:ilvl w:val="0"/>
+          <w:numId w:val="1"/>
+        </w:numPr>
+        <w:spacing w:line="240" w:lineRule="auto"/>
+        <w:ind w:left="360" w:leftChars="0" w:right="160" w:rightChars="0" w:hanging="280" w:firstLineChars="0"/>
+        <w:jc w:val="both"/>
+        <w:rPr>
+          <w:rFonts w:hint="default" w:ascii="Kalinga" w:hAnsi="Kalinga"/>
+          <w:color w:val="auto"/>
+          <w:sz w:val="20"/>
+          <w:szCs w:val="20"/>
+        </w:rPr>
+      </w:pPr>
+      <w:r>
+        <w:rPr>
+          <w:rFonts w:hint="default" w:ascii="Kalinga" w:hAnsi="Kalinga"/>
+          <w:color w:val="auto"/>
+          <w:sz w:val="20"/>
+          <w:szCs w:val="20"/>
+        </w:rPr>
+        <w:t>Dilakukan penutupan fasilitas kredit {{ slik_bank_14_jenis | default('', true) }} sebelumnya di {{ slik_bank_14_nama | default('', true) }} dengan nomor rekening {{ no_rekening_pinjaman | default('', true) }} atas nama {{ nama_pemohon | default('', true) }} sebesar nominal pelunasan.{% elif jenis_pengajuan == 'takeover' and slik_bank_14_takeover == 'ya' %}</w:t>
+      </w:r>
+    </w:p>
+    <w:p>
+      <w:pPr>
+        <w:pStyle w:val="6"/>
+        <w:numPr>
+          <w:ilvl w:val="0"/>
+          <w:numId w:val="1"/>
+        </w:numPr>
+        <w:spacing w:line="240" w:lineRule="auto"/>
+        <w:ind w:left="360" w:leftChars="0" w:right="160" w:rightChars="0" w:hanging="280" w:firstLineChars="0"/>
+        <w:jc w:val="both"/>
+        <w:rPr>
+          <w:rFonts w:hint="default" w:ascii="Kalinga" w:hAnsi="Kalinga"/>
+          <w:color w:val="auto"/>
+          <w:sz w:val="20"/>
+          <w:szCs w:val="20"/>
+        </w:rPr>
+      </w:pPr>
+      <w:r>
+        <w:rPr>
+          <w:rFonts w:hint="default" w:ascii="Kalinga" w:hAnsi="Kalinga"/>
+          <w:color w:val="auto"/>
+          <w:sz w:val="20"/>
+          <w:szCs w:val="20"/>
+        </w:rPr>
+        <w:t>Dilakukan penutupan fasilitas kredit {{ slik_bank_14_jenis | default('', true) }} di {{ slik_bank_14_nama | default('', true) }} atas nama {{ nama_pemohon | default('', true) }} sebesar nominal pelunasan.{% endif %}{% if (jenis_pengajuan == 'top_up' or jenis_pengajuan == 'top_up_sisa_gaji') and slik_bank_15_topup_lunas == 'ya' %}</w:t>
+      </w:r>
+    </w:p>
+    <w:p>
+      <w:pPr>
+        <w:pStyle w:val="6"/>
+        <w:numPr>
+          <w:ilvl w:val="0"/>
+          <w:numId w:val="1"/>
+        </w:numPr>
+        <w:spacing w:line="240" w:lineRule="auto"/>
+        <w:ind w:left="360" w:leftChars="0" w:right="160" w:rightChars="0" w:hanging="280" w:firstLineChars="0"/>
+        <w:jc w:val="both"/>
+        <w:rPr>
+          <w:rFonts w:hint="default" w:ascii="Kalinga" w:hAnsi="Kalinga"/>
+          <w:color w:val="auto"/>
+          <w:sz w:val="20"/>
+          <w:szCs w:val="20"/>
+        </w:rPr>
+      </w:pPr>
+      <w:r>
+        <w:rPr>
+          <w:rFonts w:hint="default" w:ascii="Kalinga" w:hAnsi="Kalinga"/>
+          <w:color w:val="auto"/>
+          <w:sz w:val="20"/>
+          <w:szCs w:val="20"/>
+        </w:rPr>
+        <w:t>Dilakukan penutupan fasilitas kredit {{ slik_bank_15_jenis | default('', true) }} sebelumnya di {{ slik_bank_15_nama | default('', true) }} dengan nomor rekening {{ no_rekening_pinjaman | default('', true) }} atas nama {{ nama_pemohon | default('', true) }} sebesar nominal pelunasan.{% elif jenis_pengajuan == 'takeover' and slik_bank_15_takeover == 'ya' %}</w:t>
+      </w:r>
+    </w:p>
+    <w:p>
+      <w:pPr>
+        <w:pStyle w:val="6"/>
+        <w:numPr>
+          <w:ilvl w:val="0"/>
+          <w:numId w:val="1"/>
+        </w:numPr>
+        <w:spacing w:line="240" w:lineRule="auto"/>
+        <w:ind w:left="360" w:leftChars="0" w:right="160" w:rightChars="0" w:hanging="280" w:firstLineChars="0"/>
+        <w:jc w:val="both"/>
+        <w:rPr>
+          <w:rFonts w:hint="default" w:ascii="Kalinga" w:hAnsi="Kalinga"/>
+          <w:sz w:val="20"/>
+          <w:szCs w:val="20"/>
+          <w:lang w:val="en-US"/>
+        </w:rPr>
+      </w:pPr>
+      <w:r>
+        <w:rPr>
+          <w:rFonts w:hint="default" w:ascii="Kalinga" w:hAnsi="Kalinga"/>
+          <w:color w:val="auto"/>
+          <w:sz w:val="20"/>
+          <w:szCs w:val="20"/>
+        </w:rPr>
+        <w:t>Dilakukan penutupan fasilitas kredit {{ slik_bank_15_jenis | default('', true) }} di {{ slik_bank_15_nama | default('', true) }} atas nama {{ nama_pemohon | default('', true) }} sebesar nominal pelunasan.{% endif %}</w:t>
+      </w:r>
+      <w:r>
+        <w:rPr>
+          <w:rFonts w:hint="default" w:ascii="Kalinga" w:hAnsi="Kalinga"/>
+          <w:sz w:val="20"/>
+          <w:szCs w:val="20"/>
+          <w:lang w:val="en-US"/>
+        </w:rPr>
+        <w:t>{% if jenis_pengajuan == 'takeover' %}</w:t>
+      </w:r>
+    </w:p>
+    <w:p>
+      <w:pPr>
+        <w:pStyle w:val="6"/>
+        <w:numPr>
+          <w:ilvl w:val="0"/>
+          <w:numId w:val="1"/>
+        </w:numPr>
+        <w:spacing w:line="240" w:lineRule="auto"/>
+        <w:ind w:left="360" w:leftChars="0" w:right="160" w:rightChars="0" w:hanging="280" w:firstLineChars="0"/>
+        <w:jc w:val="both"/>
+        <w:rPr>
+          <w:rFonts w:hint="default" w:ascii="Kalinga" w:hAnsi="Kalinga"/>
+          <w:sz w:val="20"/>
+          <w:szCs w:val="20"/>
+          <w:lang w:val="en-US"/>
+        </w:rPr>
+      </w:pPr>
+      <w:r>
+        <w:rPr>
+          <w:rFonts w:hint="default" w:ascii="Kalinga" w:hAnsi="Kalinga"/>
+          <w:sz w:val="20"/>
+          <w:szCs w:val="20"/>
+          <w:lang w:val="en-US"/>
+        </w:rPr>
+        <w:t>Sisa Pencairan dapat dilakukan setelah Bukti Lunas / Surat Keterangan Lunas Fasilitas Kredit dari Bank {{ takeover_bank_list }} dan Asli SK Pensiun atas nama Pemohon telah diterima Pihak BNI dan Proses Flagging {% if segmentasi == 'asabri' %}ASABRI{% else %}TASPEN{% endif %} di BNI atas nama Pemohon telah dijalankan serta setelah semua persyaratan kredit telah terpenuhi.{% elif jenis_pengajuan == 'top_up' %}</w:t>
+      </w:r>
+    </w:p>
+    <w:p>
+      <w:pPr>
+        <w:pStyle w:val="6"/>
+        <w:numPr>
+          <w:ilvl w:val="0"/>
+          <w:numId w:val="1"/>
+        </w:numPr>
+        <w:spacing w:line="240" w:lineRule="auto"/>
+        <w:ind w:left="360" w:leftChars="0" w:right="160" w:rightChars="0" w:hanging="280" w:firstLineChars="0"/>
+        <w:jc w:val="both"/>
+        <w:rPr>
+          <w:rFonts w:hint="default" w:ascii="Kalinga" w:hAnsi="Kalinga"/>
+          <w:sz w:val="20"/>
+          <w:szCs w:val="20"/>
+          <w:lang w:val="en-US"/>
+        </w:rPr>
+      </w:pPr>
+      <w:r>
+        <w:rPr>
+          <w:rFonts w:hint="default" w:ascii="Kalinga" w:hAnsi="Kalinga"/>
+          <w:sz w:val="20"/>
+          <w:szCs w:val="20"/>
+          <w:lang w:val="en-US"/>
+        </w:rPr>
+        <w:t>Sisa Pencairan dapat dilakukan setelah Fasilitas Kredit sebelumnya telah lunas dan Proses Flagging {% if segmentasi == 'asabri' %}ASABRI{% else %}TASPEN{% endif %} di BNI atas nama Pemohon telah dijalankan serta setelah semua persyaratan kredit telah terpenuhi.{% else %}</w:t>
+      </w:r>
+    </w:p>
+    <w:p>
+      <w:pPr>
+        <w:pStyle w:val="6"/>
+        <w:numPr>
+          <w:ilvl w:val="0"/>
+          <w:numId w:val="1"/>
+        </w:numPr>
+        <w:spacing w:line="240" w:lineRule="auto"/>
+        <w:ind w:left="360" w:leftChars="0" w:right="160" w:rightChars="0" w:hanging="280" w:firstLineChars="0"/>
+        <w:jc w:val="both"/>
+        <w:rPr>
           <w:rFonts w:ascii="Kalinga" w:hAnsi="Kalinga" w:cs="Kalinga"/>
           <w:color w:val="auto"/>
           <w:sz w:val="20"/>
@@ -6228,596 +6469,11 @@
       <w:r>
         <w:rPr>
           <w:rFonts w:hint="default" w:ascii="Kalinga" w:hAnsi="Kalinga"/>
-          <w:color w:val="auto"/>
-          <w:sz w:val="20"/>
-          <w:szCs w:val="20"/>
-        </w:rPr>
-        <w:t>{{ item }}{% endfor %}</w:t>
-      </w:r>
-    </w:p>
-    <w:p>
-      <w:pPr>
-        <w:pStyle w:val="6"/>
-        <w:numPr>
-          <w:ilvl w:val="0"/>
-          <w:numId w:val="1"/>
-        </w:numPr>
-        <w:spacing w:line="240" w:lineRule="auto"/>
-        <w:ind w:left="360" w:leftChars="0" w:right="160" w:rightChars="0" w:hanging="280" w:firstLineChars="0"/>
-        <w:jc w:val="both"/>
-        <w:rPr>
-          <w:rFonts w:hint="default" w:ascii="Kalinga" w:hAnsi="Kalinga"/>
-          <w:color w:val="auto"/>
-          <w:sz w:val="20"/>
-          <w:szCs w:val="20"/>
-        </w:rPr>
-      </w:pPr>
-      <w:r>
-        <w:rPr>
-          <w:rFonts w:hint="default" w:ascii="Kalinga" w:hAnsi="Kalinga"/>
-          <w:color w:val="auto"/>
-          <w:sz w:val="20"/>
-          <w:szCs w:val="20"/>
-        </w:rPr>
-        <w:t xml:space="preserve">{% if jenis_pengajuan == 'top_up' %}Rekening BNI Taplus </w:t>
-      </w:r>
-      <w:r>
-        <w:rPr>
-          <w:rFonts w:hint="default" w:ascii="Kalinga" w:hAnsi="Kalinga"/>
-          <w:color w:val="auto"/>
-          <w:sz w:val="20"/>
-          <w:szCs w:val="20"/>
-          <w:lang w:val="en-US"/>
-        </w:rPr>
-        <w:t xml:space="preserve">nomor </w:t>
-      </w:r>
-      <w:r>
-        <w:rPr>
-          <w:rFonts w:hint="default" w:ascii="Kalinga" w:hAnsi="Kalinga"/>
-          <w:color w:val="auto"/>
-          <w:sz w:val="20"/>
-          <w:szCs w:val="20"/>
-        </w:rPr>
-        <w:t>{{ payroll_no_rek | default('', true) }} atas nama {{ nama_pemohon | default('', true) }}</w:t>
-      </w:r>
-      <w:r>
-        <w:rPr>
-          <w:rFonts w:hint="default" w:ascii="Kalinga" w:hAnsi="Kalinga"/>
-          <w:color w:val="auto"/>
-          <w:sz w:val="20"/>
-          <w:szCs w:val="20"/>
-          <w:lang w:val="en-US"/>
-        </w:rPr>
-        <w:t xml:space="preserve"> tetap dijadikan</w:t>
-      </w:r>
-      <w:r>
-        <w:rPr>
-          <w:rFonts w:hint="default" w:ascii="Kalinga" w:hAnsi="Kalinga"/>
-          <w:color w:val="auto"/>
-          <w:sz w:val="20"/>
-          <w:szCs w:val="20"/>
-        </w:rPr>
-        <w:t xml:space="preserve"> Rekening Payroll Gaji Pensiun </w:t>
-      </w:r>
-      <w:r>
-        <w:rPr>
-          <w:rFonts w:hint="default" w:ascii="Kalinga" w:hAnsi="Kalinga"/>
-          <w:color w:val="auto"/>
-          <w:sz w:val="20"/>
-          <w:szCs w:val="20"/>
-          <w:lang w:val="en-US"/>
-        </w:rPr>
-        <w:t xml:space="preserve">serta </w:t>
-      </w:r>
-      <w:r>
-        <w:rPr>
-          <w:rFonts w:hint="default" w:ascii="Kalinga" w:hAnsi="Kalinga"/>
-          <w:color w:val="auto"/>
-          <w:sz w:val="20"/>
-          <w:szCs w:val="20"/>
-        </w:rPr>
-        <w:t xml:space="preserve">dijadikan sebagai Rekening Afiliasi Kredit </w:t>
-      </w:r>
-      <w:r>
-        <w:rPr>
-          <w:rFonts w:hint="default" w:ascii="Kalinga" w:hAnsi="Kalinga"/>
-          <w:color w:val="auto"/>
-          <w:sz w:val="20"/>
-          <w:szCs w:val="20"/>
-          <w:lang w:val="en-US"/>
-        </w:rPr>
-        <w:t xml:space="preserve">dan </w:t>
-      </w:r>
-      <w:r>
-        <w:rPr>
-          <w:rFonts w:hint="default" w:ascii="Kalinga" w:hAnsi="Kalinga"/>
-          <w:color w:val="auto"/>
-          <w:sz w:val="20"/>
-          <w:szCs w:val="20"/>
-        </w:rPr>
-        <w:t xml:space="preserve">akan diblokir sebesar  {{ blokir_angsuran_lunas | default('0', true) }} ({{ blokir_angsuran_lunas_terbilang | default('', true) }}) kali angsuran (Pokok+ Bunga serta ditambah saldo minimum, </w:t>
-      </w:r>
-      <w:r>
-        <w:rPr>
-          <w:rFonts w:hint="default" w:ascii="Kalinga" w:hAnsi="Kalinga"/>
-          <w:color w:val="auto"/>
-          <w:sz w:val="20"/>
-          <w:szCs w:val="20"/>
-          <w:lang w:val="en-US"/>
-        </w:rPr>
-        <w:t>dapat dibuka blokir saat</w:t>
-      </w:r>
-      <w:r>
-        <w:rPr>
-          <w:rFonts w:hint="default" w:ascii="Kalinga" w:hAnsi="Kalinga"/>
-          <w:color w:val="auto"/>
-          <w:sz w:val="20"/>
-          <w:szCs w:val="20"/>
-        </w:rPr>
-        <w:t xml:space="preserve"> </w:t>
-      </w:r>
-      <w:r>
-        <w:rPr>
-          <w:rFonts w:hint="default" w:ascii="Kalinga" w:hAnsi="Kalinga"/>
-          <w:color w:val="auto"/>
-          <w:sz w:val="20"/>
-          <w:szCs w:val="20"/>
-          <w:lang w:val="en-US"/>
-        </w:rPr>
-        <w:t>kredit lunas</w:t>
-      </w:r>
-      <w:r>
-        <w:rPr>
-          <w:rFonts w:hint="default" w:ascii="Kalinga" w:hAnsi="Kalinga"/>
-          <w:color w:val="auto"/>
-          <w:sz w:val="20"/>
-          <w:szCs w:val="20"/>
-        </w:rPr>
-        <w:t>).</w:t>
-      </w:r>
-      <w:r>
-        <w:rPr>
-          <w:rFonts w:hint="default" w:ascii="Kalinga" w:hAnsi="Kalinga"/>
-          <w:color w:val="auto"/>
-          <w:sz w:val="20"/>
-          <w:szCs w:val="20"/>
-          <w:lang w:val="en-US"/>
-        </w:rPr>
-        <w:t xml:space="preserve"> </w:t>
-      </w:r>
-      <w:r>
-        <w:rPr>
-          <w:rFonts w:hint="default" w:ascii="Kalinga" w:hAnsi="Kalinga"/>
-          <w:color w:val="auto"/>
-          <w:sz w:val="20"/>
-          <w:szCs w:val="20"/>
-        </w:rPr>
-        <w:t xml:space="preserve">Dana ini dapat dipotong dari Pencairan Kredit{% elif jenis_pengajuan == 'top_up_sisa_gaji' %}Rekening BNI Taplus </w:t>
-      </w:r>
-      <w:r>
-        <w:rPr>
-          <w:rFonts w:hint="default" w:ascii="Kalinga" w:hAnsi="Kalinga"/>
-          <w:color w:val="auto"/>
-          <w:sz w:val="20"/>
-          <w:szCs w:val="20"/>
-          <w:lang w:val="en-US"/>
-        </w:rPr>
-        <w:t xml:space="preserve">nomor </w:t>
-      </w:r>
-      <w:r>
-        <w:rPr>
-          <w:rFonts w:hint="default" w:ascii="Kalinga" w:hAnsi="Kalinga"/>
-          <w:color w:val="auto"/>
-          <w:sz w:val="20"/>
-          <w:szCs w:val="20"/>
-        </w:rPr>
-        <w:t>{{ payroll_no_rek | default('', true) }} atas nama {{ nama_pemohon | default('', true) }}</w:t>
-      </w:r>
-      <w:r>
-        <w:rPr>
-          <w:rFonts w:hint="default" w:ascii="Kalinga" w:hAnsi="Kalinga"/>
-          <w:color w:val="auto"/>
-          <w:sz w:val="20"/>
-          <w:szCs w:val="20"/>
-          <w:lang w:val="en-US"/>
-        </w:rPr>
-        <w:t xml:space="preserve"> tetap dijadikan</w:t>
-      </w:r>
-      <w:r>
-        <w:rPr>
-          <w:rFonts w:hint="default" w:ascii="Kalinga" w:hAnsi="Kalinga"/>
-          <w:color w:val="auto"/>
-          <w:sz w:val="20"/>
-          <w:szCs w:val="20"/>
-        </w:rPr>
-        <w:t xml:space="preserve"> Rekening Payroll Gaji Pensiun </w:t>
-      </w:r>
-      <w:r>
-        <w:rPr>
-          <w:rFonts w:hint="default" w:ascii="Kalinga" w:hAnsi="Kalinga"/>
-          <w:color w:val="auto"/>
-          <w:sz w:val="20"/>
-          <w:szCs w:val="20"/>
-          <w:lang w:val="en-US"/>
-        </w:rPr>
-        <w:t xml:space="preserve">serta </w:t>
-      </w:r>
-      <w:r>
-        <w:rPr>
-          <w:rFonts w:hint="default" w:ascii="Kalinga" w:hAnsi="Kalinga"/>
-          <w:color w:val="auto"/>
-          <w:sz w:val="20"/>
-          <w:szCs w:val="20"/>
-        </w:rPr>
-        <w:t xml:space="preserve">dijadikan sebagai Rekening Afiliasi Kredit </w:t>
-      </w:r>
-      <w:r>
-        <w:rPr>
-          <w:rFonts w:hint="default" w:ascii="Kalinga" w:hAnsi="Kalinga"/>
-          <w:color w:val="auto"/>
-          <w:sz w:val="20"/>
-          <w:szCs w:val="20"/>
-          <w:lang w:val="en-US"/>
-        </w:rPr>
-        <w:t xml:space="preserve">dan </w:t>
-      </w:r>
-      <w:r>
-        <w:rPr>
-          <w:rFonts w:hint="default" w:ascii="Kalinga" w:hAnsi="Kalinga"/>
-          <w:color w:val="auto"/>
-          <w:sz w:val="20"/>
-          <w:szCs w:val="20"/>
-        </w:rPr>
-        <w:t xml:space="preserve">akan diblokir sebesar  {{ blokir_angsuran_lunas | default('0', true) }} ({{ blokir_angsuran_lunas_terbilang | default('', true) }}) kali angsuran (Pokok+ Bunga serta ditambah saldo minimum, </w:t>
-      </w:r>
-      <w:r>
-        <w:rPr>
-          <w:rFonts w:hint="default" w:ascii="Kalinga" w:hAnsi="Kalinga"/>
-          <w:color w:val="auto"/>
-          <w:sz w:val="20"/>
-          <w:szCs w:val="20"/>
-          <w:lang w:val="en-US"/>
-        </w:rPr>
-        <w:t>dapat dibuka blokir saat</w:t>
-      </w:r>
-      <w:r>
-        <w:rPr>
-          <w:rFonts w:hint="default" w:ascii="Kalinga" w:hAnsi="Kalinga"/>
-          <w:color w:val="auto"/>
-          <w:sz w:val="20"/>
-          <w:szCs w:val="20"/>
-        </w:rPr>
-        <w:t xml:space="preserve"> </w:t>
-      </w:r>
-      <w:r>
-        <w:rPr>
-          <w:rFonts w:hint="default" w:ascii="Kalinga" w:hAnsi="Kalinga"/>
-          <w:color w:val="auto"/>
-          <w:sz w:val="20"/>
-          <w:szCs w:val="20"/>
-          <w:lang w:val="en-US"/>
-        </w:rPr>
-        <w:t>kredit lunas</w:t>
-      </w:r>
-      <w:r>
-        <w:rPr>
-          <w:rFonts w:hint="default" w:ascii="Kalinga" w:hAnsi="Kalinga"/>
-          <w:color w:val="auto"/>
-          <w:sz w:val="20"/>
-          <w:szCs w:val="20"/>
-        </w:rPr>
-        <w:t>).</w:t>
-      </w:r>
-      <w:r>
-        <w:rPr>
-          <w:rFonts w:hint="default" w:ascii="Kalinga" w:hAnsi="Kalinga"/>
-          <w:color w:val="auto"/>
-          <w:sz w:val="20"/>
-          <w:szCs w:val="20"/>
-          <w:lang w:val="en-US"/>
-        </w:rPr>
-        <w:t xml:space="preserve"> </w:t>
-      </w:r>
-      <w:r>
-        <w:rPr>
-          <w:rFonts w:hint="default" w:ascii="Kalinga" w:hAnsi="Kalinga"/>
-          <w:color w:val="auto"/>
-          <w:sz w:val="20"/>
-          <w:szCs w:val="20"/>
-        </w:rPr>
-        <w:t xml:space="preserve">Dana ini dapat dipotong dari Pencairan Kredit{% else %}Rekening BNI Taplus atas nama </w:t>
-      </w:r>
-      <w:r>
-        <w:rPr>
-          <w:rFonts w:hint="default" w:ascii="Kalinga" w:hAnsi="Kalinga"/>
-          <w:color w:val="auto"/>
-          <w:sz w:val="20"/>
-          <w:szCs w:val="20"/>
-          <w:lang w:val="en-US"/>
-        </w:rPr>
-        <w:t xml:space="preserve">Pemohon </w:t>
-      </w:r>
-      <w:r>
-        <w:rPr>
-          <w:rFonts w:hint="default" w:ascii="Kalinga" w:hAnsi="Kalinga"/>
-          <w:color w:val="auto"/>
-          <w:sz w:val="20"/>
-          <w:szCs w:val="20"/>
-        </w:rPr>
-        <w:t xml:space="preserve">yang </w:t>
-      </w:r>
-      <w:r>
-        <w:rPr>
-          <w:rFonts w:hint="default" w:ascii="Kalinga" w:hAnsi="Kalinga"/>
-          <w:color w:val="auto"/>
-          <w:sz w:val="20"/>
-          <w:szCs w:val="20"/>
-          <w:lang w:val="en-US"/>
-        </w:rPr>
-        <w:t>akan dijadikan</w:t>
-      </w:r>
-      <w:r>
-        <w:rPr>
-          <w:rFonts w:hint="default" w:ascii="Kalinga" w:hAnsi="Kalinga"/>
-          <w:color w:val="auto"/>
-          <w:sz w:val="20"/>
-          <w:szCs w:val="20"/>
-        </w:rPr>
-        <w:t xml:space="preserve"> Rekening Payroll Gaji Pensiun </w:t>
-      </w:r>
-      <w:r>
-        <w:rPr>
-          <w:rFonts w:hint="default" w:ascii="Kalinga" w:hAnsi="Kalinga"/>
-          <w:color w:val="auto"/>
-          <w:sz w:val="20"/>
-          <w:szCs w:val="20"/>
-          <w:lang w:val="en-US"/>
-        </w:rPr>
-        <w:t xml:space="preserve">serta </w:t>
-      </w:r>
-      <w:r>
-        <w:rPr>
-          <w:rFonts w:hint="default" w:ascii="Kalinga" w:hAnsi="Kalinga"/>
-          <w:color w:val="auto"/>
-          <w:sz w:val="20"/>
-          <w:szCs w:val="20"/>
-        </w:rPr>
-        <w:t>dijadikan sebagai Rekening Afiliasi Kredit</w:t>
-      </w:r>
-      <w:r>
-        <w:rPr>
-          <w:rFonts w:hint="default" w:ascii="Kalinga" w:hAnsi="Kalinga"/>
-          <w:color w:val="auto"/>
-          <w:sz w:val="20"/>
-          <w:szCs w:val="20"/>
-          <w:lang w:val="en-US"/>
-        </w:rPr>
-        <w:t xml:space="preserve"> dan </w:t>
-      </w:r>
-      <w:r>
-        <w:rPr>
-          <w:rFonts w:hint="default" w:ascii="Kalinga" w:hAnsi="Kalinga"/>
-          <w:color w:val="auto"/>
-          <w:sz w:val="20"/>
-          <w:szCs w:val="20"/>
-        </w:rPr>
-        <w:t xml:space="preserve">akan diblokir sebesar {{ blokir_angsuran_total | default('0', true) }} ({{ blokir_angsuran_total_terbilang | default('', true) }}) kali angsuran ({{ blokir_angsuran_pindah_gaji | default('0', true) }} ({{ blokir_angsuran_pindah_gaji_terbilang | default('', true) }}) kali angsuran Pindah Gaji (dapat dibuka setelah Gaji Pensiun telah tercermin di Rekening Afiliasi Kredit BNI) dan {{ blokir_angsuran_lunas | default('0', true) }} ({{ blokir_angsuran_lunas_terbilang | default('', true) }}) kali angsuran (Pokok+ Bunga serta ditambah saldo minimum, </w:t>
-      </w:r>
-      <w:r>
-        <w:rPr>
-          <w:rFonts w:hint="default" w:ascii="Kalinga" w:hAnsi="Kalinga"/>
-          <w:color w:val="auto"/>
-          <w:sz w:val="20"/>
-          <w:szCs w:val="20"/>
-          <w:lang w:val="en-US"/>
-        </w:rPr>
-        <w:t>dapat dibuka blokir saat</w:t>
-      </w:r>
-      <w:r>
-        <w:rPr>
-          <w:rFonts w:hint="default" w:ascii="Kalinga" w:hAnsi="Kalinga"/>
-          <w:color w:val="auto"/>
-          <w:sz w:val="20"/>
-          <w:szCs w:val="20"/>
-        </w:rPr>
-        <w:t xml:space="preserve"> </w:t>
-      </w:r>
-      <w:r>
-        <w:rPr>
-          <w:rFonts w:hint="default" w:ascii="Kalinga" w:hAnsi="Kalinga"/>
-          <w:color w:val="auto"/>
-          <w:sz w:val="20"/>
-          <w:szCs w:val="20"/>
-          <w:lang w:val="en-US"/>
-        </w:rPr>
-        <w:t>kredit lunas</w:t>
-      </w:r>
-      <w:r>
-        <w:rPr>
-          <w:rFonts w:hint="default" w:ascii="Kalinga" w:hAnsi="Kalinga"/>
-          <w:color w:val="auto"/>
-          <w:sz w:val="20"/>
-          <w:szCs w:val="20"/>
-        </w:rPr>
-        <w:t>).</w:t>
-      </w:r>
-      <w:r>
-        <w:rPr>
-          <w:rFonts w:hint="default" w:ascii="Kalinga" w:hAnsi="Kalinga"/>
-          <w:color w:val="auto"/>
-          <w:sz w:val="20"/>
-          <w:szCs w:val="20"/>
-          <w:lang w:val="en-US"/>
-        </w:rPr>
-        <w:t xml:space="preserve"> </w:t>
-      </w:r>
-      <w:r>
-        <w:rPr>
-          <w:rFonts w:hint="default" w:ascii="Kalinga" w:hAnsi="Kalinga"/>
-          <w:color w:val="auto"/>
-          <w:sz w:val="20"/>
-          <w:szCs w:val="20"/>
-        </w:rPr>
-        <w:t>Dana ini dapat dipotong dari Pencairan Kredit{% endif %}.</w:t>
-      </w:r>
-    </w:p>
-    <w:p>
-      <w:pPr>
-        <w:pStyle w:val="6"/>
-        <w:numPr>
-          <w:ilvl w:val="0"/>
-          <w:numId w:val="1"/>
-        </w:numPr>
-        <w:spacing w:line="240" w:lineRule="auto"/>
-        <w:ind w:left="360" w:leftChars="0" w:right="160" w:rightChars="0" w:hanging="280" w:firstLineChars="0"/>
-        <w:jc w:val="both"/>
-        <w:rPr>
-          <w:rFonts w:ascii="Kalinga" w:hAnsi="Kalinga" w:cs="Kalinga"/>
-          <w:color w:val="auto"/>
-          <w:sz w:val="20"/>
-          <w:szCs w:val="20"/>
-        </w:rPr>
-      </w:pPr>
-      <w:r>
-        <w:rPr>
-          <w:rFonts w:ascii="Kalinga" w:hAnsi="Kalinga" w:cs="Kalinga"/>
-          <w:color w:val="auto"/>
-          <w:sz w:val="20"/>
-          <w:szCs w:val="20"/>
-        </w:rPr>
-        <w:t xml:space="preserve">Pencairan dengan Maksimum Kredit sebesar Rp. </w:t>
-      </w:r>
-      <w:r>
-        <w:rPr>
-          <w:rFonts w:hint="default" w:ascii="Kalinga" w:hAnsi="Kalinga"/>
-          <w:color w:val="auto"/>
-          <w:sz w:val="20"/>
-          <w:szCs w:val="20"/>
-          <w:lang w:val="en-US"/>
-        </w:rPr>
-        <w:t xml:space="preserve">{{ usulan_plafon_kredit | default('0', true) }},- </w:t>
-      </w:r>
-      <w:r>
-        <w:rPr>
-          <w:rFonts w:ascii="Kalinga" w:hAnsi="Kalinga" w:cs="Kalinga"/>
-          <w:color w:val="auto"/>
-          <w:sz w:val="20"/>
-          <w:szCs w:val="20"/>
-        </w:rPr>
-        <w:t xml:space="preserve"> akan dilakukan secara sekaligus ke Rekening atas nama Pemoho</w:t>
-      </w:r>
-      <w:r>
-        <w:rPr>
-          <w:rFonts w:hint="default" w:ascii="Kalinga" w:hAnsi="Kalinga" w:cs="Kalinga"/>
-          <w:color w:val="auto"/>
-          <w:sz w:val="20"/>
-          <w:szCs w:val="20"/>
-          <w:lang w:val="en-US"/>
-        </w:rPr>
-        <w:t>n.</w:t>
-      </w:r>
-    </w:p>
-    <w:p>
-      <w:pPr>
-        <w:pStyle w:val="6"/>
-        <w:numPr>
-          <w:ilvl w:val="0"/>
-          <w:numId w:val="1"/>
-        </w:numPr>
-        <w:spacing w:line="240" w:lineRule="auto"/>
-        <w:ind w:left="360" w:leftChars="0" w:right="160" w:rightChars="0" w:hanging="280" w:firstLineChars="0"/>
-        <w:jc w:val="both"/>
-        <w:rPr>
-          <w:rFonts w:ascii="Kalinga" w:hAnsi="Kalinga" w:cs="Kalinga"/>
-          <w:color w:val="auto"/>
-          <w:sz w:val="20"/>
-          <w:szCs w:val="20"/>
-        </w:rPr>
-      </w:pPr>
-      <w:r>
-        <w:rPr>
-          <w:rFonts w:hint="default" w:ascii="Kalinga" w:hAnsi="Kalinga"/>
-          <w:color w:val="auto"/>
-          <w:sz w:val="20"/>
-          <w:szCs w:val="20"/>
-        </w:rPr>
-        <w:t xml:space="preserve">Sisa Pencairan </w:t>
-      </w:r>
-      <w:r>
-        <w:rPr>
-          <w:rFonts w:hint="default" w:ascii="Kalinga" w:hAnsi="Kalinga"/>
-          <w:color w:val="auto"/>
-          <w:sz w:val="20"/>
-          <w:szCs w:val="20"/>
-          <w:lang w:val="en-US"/>
-        </w:rPr>
-        <w:t>dapat dilakukan</w:t>
-      </w:r>
-      <w:r>
-        <w:rPr>
-          <w:rFonts w:hint="default" w:ascii="Kalinga" w:hAnsi="Kalinga"/>
-          <w:color w:val="auto"/>
-          <w:sz w:val="20"/>
-          <w:szCs w:val="20"/>
-        </w:rPr>
-        <w:t xml:space="preserve"> setelah Proses Flagging {% if segmentasi == 'asabri' %}</w:t>
-      </w:r>
-      <w:r>
-        <w:rPr>
-          <w:rFonts w:hint="default" w:ascii="Kalinga" w:hAnsi="Kalinga"/>
-          <w:color w:val="auto"/>
-          <w:sz w:val="20"/>
-          <w:szCs w:val="20"/>
-          <w:lang w:val="en-US"/>
-        </w:rPr>
-        <w:t>ASABRI</w:t>
-      </w:r>
-      <w:r>
-        <w:rPr>
-          <w:rFonts w:hint="default" w:ascii="Kalinga" w:hAnsi="Kalinga"/>
-          <w:color w:val="auto"/>
-          <w:sz w:val="20"/>
-          <w:szCs w:val="20"/>
-        </w:rPr>
-        <w:t>{% else %}</w:t>
-      </w:r>
-      <w:r>
-        <w:rPr>
-          <w:rFonts w:hint="default" w:ascii="Kalinga" w:hAnsi="Kalinga"/>
-          <w:color w:val="auto"/>
-          <w:sz w:val="20"/>
-          <w:szCs w:val="20"/>
-          <w:lang w:val="en-US"/>
-        </w:rPr>
-        <w:t>TASPEN</w:t>
-      </w:r>
-      <w:r>
-        <w:rPr>
-          <w:rFonts w:hint="default" w:ascii="Kalinga" w:hAnsi="Kalinga"/>
-          <w:color w:val="auto"/>
-          <w:sz w:val="20"/>
-          <w:szCs w:val="20"/>
-        </w:rPr>
-        <w:t>{% endif %}</w:t>
-      </w:r>
-      <w:r>
-        <w:rPr>
-          <w:rFonts w:hint="default" w:ascii="Kalinga" w:hAnsi="Kalinga"/>
-          <w:color w:val="auto"/>
-          <w:sz w:val="20"/>
-          <w:szCs w:val="20"/>
-          <w:lang w:val="en-US"/>
-        </w:rPr>
-        <w:t xml:space="preserve"> </w:t>
-      </w:r>
-      <w:r>
-        <w:rPr>
-          <w:rFonts w:hint="default" w:ascii="Kalinga" w:hAnsi="Kalinga"/>
-          <w:color w:val="auto"/>
-          <w:sz w:val="20"/>
-          <w:szCs w:val="20"/>
-        </w:rPr>
-        <w:t xml:space="preserve">di BNI atas nama Pemohon telah dijalankan serta setelah semua pensyaratan kredit telah terpenuhi. </w:t>
+          <w:sz w:val="20"/>
+          <w:szCs w:val="20"/>
+          <w:lang w:val="en-US"/>
+        </w:rPr>
+        <w:t>Sisa Pencairan dapat dilakukan setelah Proses Flagging {% if segmentasi == 'asabri' %}ASABRI{% else %}TASPEN{% endif %} di BNI atas nama Pemohon telah dijalankan serta setelah semua persyaratan kredit telah terpenuhi.{% endif %}</w:t>
       </w:r>
     </w:p>
     <w:p>

</xml_diff>

<commit_message>
merapikan file form purna dan file riwayat
</commit_message>
<xml_diff>
--- a/template_purna_reguler.docx
+++ b/template_purna_reguler.docx
@@ -16,8 +16,8 @@
           <w:u w:val="single"/>
         </w:rPr>
       </w:pPr>
-      <w:bookmarkStart w:id="0" w:name="OLE_LINK30"/>
-      <w:bookmarkStart w:id="1" w:name="OLE_LINK2"/>
+      <w:bookmarkStart w:id="0" w:name="OLE_LINK2"/>
+      <w:bookmarkStart w:id="1" w:name="OLE_LINK30"/>
       <w:r>
         <w:rPr>
           <w:rFonts w:ascii="Kalinga" w:hAnsi="Kalinga" w:cs="Kalinga"/>
@@ -522,7 +522,7 @@
           <w:sz w:val="20"/>
           <w:szCs w:val="20"/>
         </w:rPr>
-        <w:t>{{ jenis_pekerjaan_pemohon | default('PNS', true) }} di {{ nama_instansi_pemohon | default('', true) }} TMT {{ tgl_pensiun_tmt | default('', true) }} Cfm</w:t>
+        <w:t>{{ jenis_pekerjaan_pemohon | default('', true) }} di {{ nama_instansi_pemohon | default('', true) }} TMT {{ tgl_pensiun_tmt | default('', true) }} Cfm</w:t>
       </w:r>
       <w:r>
         <w:rPr>
@@ -730,6 +730,7 @@
       <w:pPr>
         <w:pStyle w:val="6"/>
         <w:numPr>
+          <w:ilvl w:val="0"/>
           <w:numId w:val="0"/>
         </w:numPr>
         <w:spacing w:line="240" w:lineRule="auto"/>
@@ -1761,6 +1762,73 @@
       </w:pPr>
       <w:r>
         <w:rPr>
+          <w:rFonts w:hint="default" w:ascii="Kalinga" w:hAnsi="Kalinga"/>
+          <w:color w:val="auto"/>
+          <w:sz w:val="20"/>
+          <w:szCs w:val="20"/>
+        </w:rPr>
+        <w:t>Memang benar Pemohon merupakan</w:t>
+      </w:r>
+      <w:r>
+        <w:rPr>
+          <w:rFonts w:hint="default" w:ascii="Kalinga" w:hAnsi="Kalinga"/>
+          <w:color w:val="auto"/>
+          <w:sz w:val="20"/>
+          <w:szCs w:val="20"/>
+          <w:lang w:val="en-US"/>
+        </w:rPr>
+        <w:t xml:space="preserve"> </w:t>
+      </w:r>
+      <w:r>
+        <w:rPr>
+          <w:rFonts w:hint="default" w:ascii="Kalinga" w:hAnsi="Kalinga"/>
+          <w:color w:val="auto"/>
+          <w:sz w:val="20"/>
+          <w:szCs w:val="20"/>
+        </w:rPr>
+        <w:t>{{ jenis_pekerjaan_pemohon | default('</w:t>
+      </w:r>
+      <w:bookmarkStart w:id="17" w:name="_GoBack"/>
+      <w:bookmarkEnd w:id="17"/>
+      <w:r>
+        <w:rPr>
+          <w:rFonts w:hint="default" w:ascii="Kalinga" w:hAnsi="Kalinga"/>
+          <w:color w:val="auto"/>
+          <w:sz w:val="20"/>
+          <w:szCs w:val="20"/>
+        </w:rPr>
+        <w:t>', true) }} di {{ nama_instansi_pemohon | default('', true) }}</w:t>
+      </w:r>
+      <w:r>
+        <w:rPr>
+          <w:rFonts w:hint="default" w:ascii="Kalinga" w:hAnsi="Kalinga"/>
+          <w:color w:val="auto"/>
+          <w:sz w:val="20"/>
+          <w:szCs w:val="20"/>
+          <w:lang w:val="en-US"/>
+        </w:rPr>
+        <w:t>.</w:t>
+      </w:r>
+    </w:p>
+    <w:p>
+      <w:pPr>
+        <w:pStyle w:val="6"/>
+        <w:numPr>
+          <w:ilvl w:val="0"/>
+          <w:numId w:val="1"/>
+        </w:numPr>
+        <w:spacing w:line="240" w:lineRule="auto"/>
+        <w:ind w:left="360" w:leftChars="0" w:right="160" w:rightChars="0" w:hanging="280" w:firstLineChars="0"/>
+        <w:jc w:val="both"/>
+        <w:rPr>
+          <w:rFonts w:hint="default" w:ascii="Kalinga" w:hAnsi="Kalinga"/>
+          <w:color w:val="auto"/>
+          <w:sz w:val="20"/>
+          <w:szCs w:val="20"/>
+        </w:rPr>
+      </w:pPr>
+      <w:r>
+        <w:rPr>
           <w:rFonts w:ascii="Kalinga" w:hAnsi="Kalinga" w:cs="Kalinga"/>
           <w:color w:val="auto"/>
           <w:sz w:val="20"/>
@@ -4230,16 +4298,16 @@
         </w:rPr>
       </w:pPr>
       <w:bookmarkStart w:id="3" w:name="OLE_LINK19"/>
-      <w:bookmarkStart w:id="4" w:name="OLE_LINK17"/>
-      <w:bookmarkStart w:id="5" w:name="OLE_LINK8"/>
+      <w:bookmarkStart w:id="4" w:name="OLE_LINK8"/>
+      <w:bookmarkStart w:id="5" w:name="OLE_LINK17"/>
       <w:bookmarkStart w:id="6" w:name="OLE_LINK3"/>
-      <w:bookmarkStart w:id="7" w:name="OLE_LINK27"/>
-      <w:bookmarkStart w:id="8" w:name="OLE_LINK33"/>
+      <w:bookmarkStart w:id="7" w:name="OLE_LINK33"/>
+      <w:bookmarkStart w:id="8" w:name="OLE_LINK27"/>
       <w:bookmarkStart w:id="9" w:name="OLE_LINK10"/>
       <w:bookmarkStart w:id="10" w:name="OLE_LINK41"/>
-      <w:bookmarkStart w:id="11" w:name="OLE_LINK23"/>
+      <w:bookmarkStart w:id="11" w:name="OLE_LINK24"/>
       <w:bookmarkStart w:id="12" w:name="OLE_LINK32"/>
-      <w:bookmarkStart w:id="13" w:name="OLE_LINK24"/>
+      <w:bookmarkStart w:id="13" w:name="OLE_LINK23"/>
       <w:r>
         <w:rPr>
           <w:rFonts w:ascii="Kalinga" w:hAnsi="Kalinga" w:cs="Kalinga"/>
@@ -5342,8 +5410,6 @@
         </w:rPr>
         <w:t>v</w:t>
       </w:r>
-      <w:bookmarkStart w:id="17" w:name="_GoBack"/>
-      <w:bookmarkEnd w:id="17"/>
       <w:r>
         <w:rPr>
           <w:rFonts w:hint="default" w:ascii="Kalinga" w:hAnsi="Kalinga"/>

</xml_diff>

<commit_message>
memperbaiki total terbilang form_purna.html dan template purna
</commit_message>
<xml_diff>
--- a/template_purna_reguler.docx
+++ b/template_purna_reguler.docx
@@ -1786,18 +1786,7 @@
           <w:sz w:val="20"/>
           <w:szCs w:val="20"/>
         </w:rPr>
-        <w:t>{{ jenis_pekerjaan_pemohon | default('</w:t>
-      </w:r>
-      <w:bookmarkStart w:id="17" w:name="_GoBack"/>
-      <w:bookmarkEnd w:id="17"/>
-      <w:r>
-        <w:rPr>
-          <w:rFonts w:hint="default" w:ascii="Kalinga" w:hAnsi="Kalinga"/>
-          <w:color w:val="auto"/>
-          <w:sz w:val="20"/>
-          <w:szCs w:val="20"/>
-        </w:rPr>
-        <w:t>', true) }} di {{ nama_instansi_pemohon | default('', true) }}</w:t>
+        <w:t>{{ jenis_pekerjaan_pemohon | default('', true) }} di {{ nama_instansi_pemohon | default('', true) }}</w:t>
       </w:r>
       <w:r>
         <w:rPr>
@@ -4298,16 +4287,16 @@
         </w:rPr>
       </w:pPr>
       <w:bookmarkStart w:id="3" w:name="OLE_LINK19"/>
-      <w:bookmarkStart w:id="4" w:name="OLE_LINK8"/>
-      <w:bookmarkStart w:id="5" w:name="OLE_LINK17"/>
-      <w:bookmarkStart w:id="6" w:name="OLE_LINK3"/>
-      <w:bookmarkStart w:id="7" w:name="OLE_LINK33"/>
-      <w:bookmarkStart w:id="8" w:name="OLE_LINK27"/>
-      <w:bookmarkStart w:id="9" w:name="OLE_LINK10"/>
-      <w:bookmarkStart w:id="10" w:name="OLE_LINK41"/>
-      <w:bookmarkStart w:id="11" w:name="OLE_LINK24"/>
-      <w:bookmarkStart w:id="12" w:name="OLE_LINK32"/>
-      <w:bookmarkStart w:id="13" w:name="OLE_LINK23"/>
+      <w:bookmarkStart w:id="4" w:name="OLE_LINK17"/>
+      <w:bookmarkStart w:id="5" w:name="OLE_LINK8"/>
+      <w:bookmarkStart w:id="6" w:name="OLE_LINK32"/>
+      <w:bookmarkStart w:id="7" w:name="OLE_LINK23"/>
+      <w:bookmarkStart w:id="8" w:name="OLE_LINK10"/>
+      <w:bookmarkStart w:id="9" w:name="OLE_LINK27"/>
+      <w:bookmarkStart w:id="10" w:name="OLE_LINK24"/>
+      <w:bookmarkStart w:id="11" w:name="OLE_LINK41"/>
+      <w:bookmarkStart w:id="12" w:name="OLE_LINK33"/>
+      <w:bookmarkStart w:id="13" w:name="OLE_LINK3"/>
       <w:r>
         <w:rPr>
           <w:rFonts w:ascii="Kalinga" w:hAnsi="Kalinga" w:cs="Kalinga"/>
@@ -5018,7 +5007,36 @@
           <w:sz w:val="20"/>
           <w:szCs w:val="20"/>
         </w:rPr>
-        <w:t xml:space="preserve">Jaminan yang telah ada sebelumnya berupa Asli SK Pensiun atas nama Pemohon tetap dipertahankan sebagai Jaminan Kredit di BNI{% else %}Menyerahkan </w:t>
+        <w:t>Jaminan yang telah ada sebelumnya berupa Asli SK Pensiun atas nama Pemohon tetap dipertahankan sebagai Jaminan Kredit di BNI{% else %}</w:t>
+      </w:r>
+    </w:p>
+    <w:p>
+      <w:pPr>
+        <w:pStyle w:val="6"/>
+        <w:numPr>
+          <w:ilvl w:val="0"/>
+          <w:numId w:val="1"/>
+        </w:numPr>
+        <w:spacing w:line="240" w:lineRule="auto"/>
+        <w:ind w:left="360" w:leftChars="0" w:right="160" w:rightChars="0" w:hanging="280" w:firstLineChars="0"/>
+        <w:jc w:val="both"/>
+        <w:rPr>
+          <w:rFonts w:hint="default" w:ascii="Kalinga" w:hAnsi="Kalinga"/>
+          <w:color w:val="auto"/>
+          <w:sz w:val="20"/>
+          <w:szCs w:val="20"/>
+        </w:rPr>
+      </w:pPr>
+      <w:bookmarkStart w:id="17" w:name="_GoBack"/>
+      <w:bookmarkEnd w:id="17"/>
+      <w:r>
+        <w:rPr>
+          <w:rFonts w:hint="default" w:ascii="Kalinga" w:hAnsi="Kalinga"/>
+          <w:color w:val="auto"/>
+          <w:sz w:val="20"/>
+          <w:szCs w:val="20"/>
+        </w:rPr>
+        <w:t xml:space="preserve">Menyerahkan </w:t>
       </w:r>
       <w:r>
         <w:rPr>

</xml_diff>

<commit_message>
menambahkan fitur alert dan blokir simpan jika DSR lebih dari 90% dan perbaikan file app.py
</commit_message>
<xml_diff>
--- a/template_purna_reguler.docx
+++ b/template_purna_reguler.docx
@@ -16,8 +16,8 @@
           <w:u w:val="single"/>
         </w:rPr>
       </w:pPr>
-      <w:bookmarkStart w:id="0" w:name="OLE_LINK2"/>
-      <w:bookmarkStart w:id="1" w:name="OLE_LINK30"/>
+      <w:bookmarkStart w:id="0" w:name="OLE_LINK30"/>
+      <w:bookmarkStart w:id="1" w:name="OLE_LINK2"/>
       <w:r>
         <w:rPr>
           <w:rFonts w:ascii="Kalinga" w:hAnsi="Kalinga" w:cs="Kalinga"/>
@@ -419,7 +419,63 @@
           <w:sz w:val="20"/>
           <w:szCs w:val="20"/>
         </w:rPr>
-        <w:t>Status Pemohon Menikah Cfm. Kutipan Akta Menikah terlampir.{% elif status_perkawinan_pemohon == 'Belum Menikah' %}Status Pemohon Belum Menikah Cfm. Surat Keterangan Belum Menikah terlampir.{% elif status_perkawinan_pemohon == 'Janda/Duda' %}Status Pemohon Janda/Duda Cfm. Surat Cerai terlampir / Cfm. Akta Kematian Pasangan terlampir.{% endif %}</w:t>
+        <w:t>Status Pemohon Menikah Cfm. Kutipan Akta Menikah terlampir.{% elif status_perkawinan_pemohon == 'Belum Menikah' %}</w:t>
+      </w:r>
+    </w:p>
+    <w:p>
+      <w:pPr>
+        <w:pStyle w:val="6"/>
+        <w:numPr>
+          <w:ilvl w:val="0"/>
+          <w:numId w:val="1"/>
+        </w:numPr>
+        <w:spacing w:line="240" w:lineRule="auto"/>
+        <w:ind w:left="360" w:leftChars="0" w:right="160" w:rightChars="0" w:hanging="280" w:firstLineChars="0"/>
+        <w:jc w:val="both"/>
+        <w:rPr>
+          <w:rFonts w:hint="default" w:ascii="Kalinga" w:hAnsi="Kalinga"/>
+          <w:color w:val="auto"/>
+          <w:sz w:val="20"/>
+          <w:szCs w:val="20"/>
+        </w:rPr>
+      </w:pPr>
+      <w:r>
+        <w:rPr>
+          <w:rFonts w:hint="default" w:ascii="Kalinga" w:hAnsi="Kalinga"/>
+          <w:color w:val="auto"/>
+          <w:sz w:val="20"/>
+          <w:szCs w:val="20"/>
+        </w:rPr>
+        <w:t>Status Pemohon Belum Menikah Cfm. Surat Keterangan Belum Menikah terlampir.{% elif status_perkawinan_pemohon == 'Janda/Duda' %}</w:t>
+      </w:r>
+    </w:p>
+    <w:p>
+      <w:pPr>
+        <w:pStyle w:val="6"/>
+        <w:numPr>
+          <w:ilvl w:val="0"/>
+          <w:numId w:val="1"/>
+        </w:numPr>
+        <w:spacing w:line="240" w:lineRule="auto"/>
+        <w:ind w:left="360" w:leftChars="0" w:right="160" w:rightChars="0" w:hanging="280" w:firstLineChars="0"/>
+        <w:jc w:val="both"/>
+        <w:rPr>
+          <w:rFonts w:hint="default" w:ascii="Kalinga" w:hAnsi="Kalinga"/>
+          <w:color w:val="auto"/>
+          <w:sz w:val="20"/>
+          <w:szCs w:val="20"/>
+        </w:rPr>
+      </w:pPr>
+      <w:bookmarkStart w:id="17" w:name="_GoBack"/>
+      <w:bookmarkEnd w:id="17"/>
+      <w:r>
+        <w:rPr>
+          <w:rFonts w:hint="default" w:ascii="Kalinga" w:hAnsi="Kalinga"/>
+          <w:color w:val="auto"/>
+          <w:sz w:val="20"/>
+          <w:szCs w:val="20"/>
+        </w:rPr>
+        <w:t>Status Pemohon Janda/Duda Cfm. Surat Cerai terlampir / Cfm. Akta Kematian Pasangan terlampir.{% endif %}</w:t>
       </w:r>
     </w:p>
     <w:p>
@@ -1999,7 +2055,7 @@
           <w:szCs w:val="20"/>
           <w:lang w:val="en-US"/>
         </w:rPr>
-        <w:t>Rekening Koran Gaji Bank</w:t>
+        <w:t>Rekening Koran Gaji di</w:t>
       </w:r>
       <w:r>
         <w:rPr>
@@ -4290,13 +4346,13 @@
       <w:bookmarkStart w:id="4" w:name="OLE_LINK17"/>
       <w:bookmarkStart w:id="5" w:name="OLE_LINK8"/>
       <w:bookmarkStart w:id="6" w:name="OLE_LINK32"/>
-      <w:bookmarkStart w:id="7" w:name="OLE_LINK23"/>
-      <w:bookmarkStart w:id="8" w:name="OLE_LINK10"/>
-      <w:bookmarkStart w:id="9" w:name="OLE_LINK27"/>
-      <w:bookmarkStart w:id="10" w:name="OLE_LINK24"/>
-      <w:bookmarkStart w:id="11" w:name="OLE_LINK41"/>
-      <w:bookmarkStart w:id="12" w:name="OLE_LINK33"/>
-      <w:bookmarkStart w:id="13" w:name="OLE_LINK3"/>
+      <w:bookmarkStart w:id="7" w:name="OLE_LINK27"/>
+      <w:bookmarkStart w:id="8" w:name="OLE_LINK24"/>
+      <w:bookmarkStart w:id="9" w:name="OLE_LINK10"/>
+      <w:bookmarkStart w:id="10" w:name="OLE_LINK41"/>
+      <w:bookmarkStart w:id="11" w:name="OLE_LINK23"/>
+      <w:bookmarkStart w:id="12" w:name="OLE_LINK3"/>
+      <w:bookmarkStart w:id="13" w:name="OLE_LINK33"/>
       <w:r>
         <w:rPr>
           <w:rFonts w:ascii="Kalinga" w:hAnsi="Kalinga" w:cs="Kalinga"/>
@@ -5027,8 +5083,6 @@
           <w:szCs w:val="20"/>
         </w:rPr>
       </w:pPr>
-      <w:bookmarkStart w:id="17" w:name="_GoBack"/>
-      <w:bookmarkEnd w:id="17"/>
       <w:r>
         <w:rPr>
           <w:rFonts w:hint="default" w:ascii="Kalinga" w:hAnsi="Kalinga"/>

</xml_diff>

<commit_message>
memperbaiki script jinja2 pada template_purna_reguler.docx
</commit_message>
<xml_diff>
--- a/template_purna_reguler.docx
+++ b/template_purna_reguler.docx
@@ -16,8 +16,8 @@
           <w:u w:val="single"/>
         </w:rPr>
       </w:pPr>
-      <w:bookmarkStart w:id="0" w:name="OLE_LINK30"/>
-      <w:bookmarkStart w:id="1" w:name="OLE_LINK2"/>
+      <w:bookmarkStart w:id="0" w:name="OLE_LINK2"/>
+      <w:bookmarkStart w:id="1" w:name="OLE_LINK30"/>
       <w:r>
         <w:rPr>
           <w:rFonts w:ascii="Kalinga" w:hAnsi="Kalinga" w:cs="Kalinga"/>
@@ -466,8 +466,6 @@
           <w:szCs w:val="20"/>
         </w:rPr>
       </w:pPr>
-      <w:bookmarkStart w:id="17" w:name="_GoBack"/>
-      <w:bookmarkEnd w:id="17"/>
       <w:r>
         <w:rPr>
           <w:rFonts w:hint="default" w:ascii="Kalinga" w:hAnsi="Kalinga"/>
@@ -4343,16 +4341,16 @@
         </w:rPr>
       </w:pPr>
       <w:bookmarkStart w:id="3" w:name="OLE_LINK19"/>
-      <w:bookmarkStart w:id="4" w:name="OLE_LINK17"/>
-      <w:bookmarkStart w:id="5" w:name="OLE_LINK8"/>
-      <w:bookmarkStart w:id="6" w:name="OLE_LINK32"/>
-      <w:bookmarkStart w:id="7" w:name="OLE_LINK27"/>
-      <w:bookmarkStart w:id="8" w:name="OLE_LINK24"/>
-      <w:bookmarkStart w:id="9" w:name="OLE_LINK10"/>
-      <w:bookmarkStart w:id="10" w:name="OLE_LINK41"/>
-      <w:bookmarkStart w:id="11" w:name="OLE_LINK23"/>
-      <w:bookmarkStart w:id="12" w:name="OLE_LINK3"/>
-      <w:bookmarkStart w:id="13" w:name="OLE_LINK33"/>
+      <w:bookmarkStart w:id="4" w:name="OLE_LINK8"/>
+      <w:bookmarkStart w:id="5" w:name="OLE_LINK17"/>
+      <w:bookmarkStart w:id="6" w:name="OLE_LINK10"/>
+      <w:bookmarkStart w:id="7" w:name="OLE_LINK23"/>
+      <w:bookmarkStart w:id="8" w:name="OLE_LINK33"/>
+      <w:bookmarkStart w:id="9" w:name="OLE_LINK41"/>
+      <w:bookmarkStart w:id="10" w:name="OLE_LINK27"/>
+      <w:bookmarkStart w:id="11" w:name="OLE_LINK32"/>
+      <w:bookmarkStart w:id="12" w:name="OLE_LINK24"/>
+      <w:bookmarkStart w:id="13" w:name="OLE_LINK3"/>
       <w:r>
         <w:rPr>
           <w:rFonts w:ascii="Kalinga" w:hAnsi="Kalinga" w:cs="Kalinga"/>
@@ -4752,8 +4750,8 @@
       </w:r>
       <w:bookmarkEnd w:id="4"/>
       <w:bookmarkEnd w:id="5"/>
-      <w:bookmarkStart w:id="14" w:name="OLE_LINK34"/>
-      <w:bookmarkStart w:id="15" w:name="OLE_LINK16"/>
+      <w:bookmarkStart w:id="14" w:name="OLE_LINK16"/>
+      <w:bookmarkStart w:id="15" w:name="OLE_LINK34"/>
       <w:r>
         <w:rPr>
           <w:rFonts w:hint="default" w:ascii="Kalinga" w:hAnsi="Kalinga"/>
@@ -5036,91 +5034,64 @@
           <w:sz w:val="20"/>
           <w:szCs w:val="20"/>
         </w:rPr>
-        <w:t>{% endfor %}{% if jenis_pengajuan == 'top_up' or jenis_pengajuan == 'top_up_sisa_gaji' %}</w:t>
-      </w:r>
-    </w:p>
-    <w:p>
-      <w:pPr>
-        <w:pStyle w:val="6"/>
-        <w:numPr>
-          <w:ilvl w:val="0"/>
-          <w:numId w:val="1"/>
-        </w:numPr>
-        <w:spacing w:line="240" w:lineRule="auto"/>
-        <w:ind w:left="360" w:leftChars="0" w:right="160" w:rightChars="0" w:hanging="280" w:firstLineChars="0"/>
-        <w:jc w:val="both"/>
-        <w:rPr>
-          <w:rFonts w:hint="default" w:ascii="Kalinga" w:hAnsi="Kalinga"/>
-          <w:color w:val="auto"/>
-          <w:sz w:val="20"/>
-          <w:szCs w:val="20"/>
-        </w:rPr>
-      </w:pPr>
-      <w:r>
-        <w:rPr>
-          <w:rFonts w:hint="default" w:ascii="Kalinga" w:hAnsi="Kalinga"/>
-          <w:color w:val="auto"/>
-          <w:sz w:val="20"/>
-          <w:szCs w:val="20"/>
-        </w:rPr>
-        <w:t>Jaminan yang telah ada sebelumnya berupa Asli SK Pensiun atas nama Pemohon tetap dipertahankan sebagai Jaminan Kredit di BNI{% else %}</w:t>
-      </w:r>
-    </w:p>
-    <w:p>
-      <w:pPr>
-        <w:pStyle w:val="6"/>
-        <w:numPr>
-          <w:ilvl w:val="0"/>
-          <w:numId w:val="1"/>
-        </w:numPr>
-        <w:spacing w:line="240" w:lineRule="auto"/>
-        <w:ind w:left="360" w:leftChars="0" w:right="160" w:rightChars="0" w:hanging="280" w:firstLineChars="0"/>
-        <w:jc w:val="both"/>
-        <w:rPr>
-          <w:rFonts w:hint="default" w:ascii="Kalinga" w:hAnsi="Kalinga"/>
-          <w:color w:val="auto"/>
-          <w:sz w:val="20"/>
-          <w:szCs w:val="20"/>
-        </w:rPr>
-      </w:pPr>
-      <w:r>
-        <w:rPr>
-          <w:rFonts w:hint="default" w:ascii="Kalinga" w:hAnsi="Kalinga"/>
-          <w:color w:val="auto"/>
-          <w:sz w:val="20"/>
-          <w:szCs w:val="20"/>
-        </w:rPr>
-        <w:t xml:space="preserve">Menyerahkan </w:t>
-      </w:r>
-      <w:r>
-        <w:rPr>
-          <w:rFonts w:hint="default" w:ascii="Kalinga" w:hAnsi="Kalinga"/>
-          <w:color w:val="auto"/>
-          <w:sz w:val="20"/>
-          <w:szCs w:val="20"/>
-          <w:lang w:val="en-US"/>
-        </w:rPr>
-        <w:t xml:space="preserve">Asli </w:t>
-      </w:r>
-      <w:r>
-        <w:rPr>
-          <w:rFonts w:hint="default" w:ascii="Kalinga" w:hAnsi="Kalinga"/>
-          <w:color w:val="auto"/>
-          <w:sz w:val="20"/>
-          <w:szCs w:val="20"/>
-        </w:rPr>
-        <w:t>SK Pensiun atas nama Pemohon sebagai Jaminan Kredit BNI</w:t>
-      </w:r>
-      <w:r>
-        <w:rPr>
-          <w:rFonts w:hint="default" w:ascii="Kalinga" w:hAnsi="Kalinga"/>
-          <w:color w:val="auto"/>
-          <w:sz w:val="20"/>
-          <w:szCs w:val="20"/>
-          <w:lang w:val="en-US"/>
-        </w:rPr>
-        <w:t>.</w:t>
-      </w:r>
+        <w:t>{% endfor %}{% if jenis_pengajuan == 'baru' %}</w:t>
+      </w:r>
+    </w:p>
+    <w:p>
+      <w:pPr>
+        <w:pStyle w:val="6"/>
+        <w:numPr>
+          <w:ilvl w:val="0"/>
+          <w:numId w:val="1"/>
+        </w:numPr>
+        <w:spacing w:line="240" w:lineRule="auto"/>
+        <w:ind w:left="360" w:leftChars="0" w:right="160" w:rightChars="0" w:hanging="280" w:firstLineChars="0"/>
+        <w:jc w:val="both"/>
+        <w:rPr>
+          <w:rFonts w:hint="default" w:ascii="Kalinga" w:hAnsi="Kalinga"/>
+          <w:color w:val="auto"/>
+          <w:sz w:val="20"/>
+          <w:szCs w:val="20"/>
+        </w:rPr>
+      </w:pPr>
+      <w:r>
+        <w:rPr>
+          <w:rFonts w:hint="default" w:ascii="Kalinga" w:hAnsi="Kalinga"/>
+          <w:color w:val="auto"/>
+          <w:sz w:val="20"/>
+          <w:szCs w:val="20"/>
+        </w:rPr>
+        <w:t>Menyerahkan Asli SK Pensiun atas nama Pemohon sebagai Jaminan Kredit BNI.{% elif jenis_pengajuan == 'top_up' or jenis_pengajuan == 'top_up_sisa_gaji' %}</w:t>
+      </w:r>
+    </w:p>
+    <w:p>
+      <w:pPr>
+        <w:pStyle w:val="6"/>
+        <w:numPr>
+          <w:ilvl w:val="0"/>
+          <w:numId w:val="1"/>
+        </w:numPr>
+        <w:spacing w:line="240" w:lineRule="auto"/>
+        <w:ind w:left="360" w:leftChars="0" w:right="160" w:rightChars="0" w:hanging="280" w:firstLineChars="0"/>
+        <w:jc w:val="both"/>
+        <w:rPr>
+          <w:rFonts w:hint="default" w:ascii="Kalinga" w:hAnsi="Kalinga"/>
+          <w:color w:val="auto"/>
+          <w:sz w:val="20"/>
+          <w:szCs w:val="20"/>
+        </w:rPr>
+      </w:pPr>
+      <w:r>
+        <w:rPr>
+          <w:rFonts w:hint="default" w:ascii="Kalinga" w:hAnsi="Kalinga"/>
+          <w:color w:val="auto"/>
+          <w:sz w:val="20"/>
+          <w:szCs w:val="20"/>
+        </w:rPr>
+        <w:t>Jaminan yang telah ada sebelumnya berupa Asli SK Pensiun atas nama Pemohon tetap dipertahankan sebagai Jaminan Kredit di BNI.</w:t>
+      </w:r>
+      <w:bookmarkStart w:id="17" w:name="_GoBack"/>
+      <w:bookmarkEnd w:id="17"/>
       <w:r>
         <w:rPr>
           <w:rFonts w:hint="default" w:ascii="Kalinga" w:hAnsi="Kalinga"/>

</xml_diff>

<commit_message>
menambahkan field 3 bulan gaji pada form purna dan preview modalnya
</commit_message>
<xml_diff>
--- a/template_purna_reguler.docx
+++ b/template_purna_reguler.docx
@@ -1428,6 +1428,174 @@
         <w:ind w:left="360" w:leftChars="0" w:right="160" w:rightChars="0" w:hanging="280" w:firstLineChars="0"/>
         <w:jc w:val="both"/>
         <w:rPr>
+          <w:rFonts w:hint="default" w:ascii="Kalinga" w:hAnsi="Kalinga"/>
+          <w:color w:val="auto"/>
+          <w:sz w:val="20"/>
+          <w:szCs w:val="20"/>
+        </w:rPr>
+      </w:pPr>
+      <w:r>
+        <w:rPr>
+          <w:rFonts w:hint="default" w:ascii="Kalinga" w:hAnsi="Kalinga"/>
+          <w:color w:val="auto"/>
+          <w:sz w:val="20"/>
+          <w:szCs w:val="20"/>
+        </w:rPr>
+        <w:t xml:space="preserve">Gaji Pensiun Bulan {{ pensiun_bulan_1_nama | default('...', true) }} </w:t>
+      </w:r>
+      <w:r>
+        <w:rPr>
+          <w:rFonts w:hint="default" w:ascii="Kalinga" w:hAnsi="Kalinga"/>
+          <w:color w:val="auto"/>
+          <w:sz w:val="20"/>
+          <w:szCs w:val="20"/>
+        </w:rPr>
+        <w:tab/>
+      </w:r>
+      <w:r>
+        <w:rPr>
+          <w:rFonts w:hint="default" w:ascii="Kalinga" w:hAnsi="Kalinga"/>
+          <w:color w:val="auto"/>
+          <w:sz w:val="20"/>
+          <w:szCs w:val="20"/>
+        </w:rPr>
+        <w:t>:</w:t>
+      </w:r>
+      <w:r>
+        <w:rPr>
+          <w:rFonts w:hint="default" w:ascii="Kalinga" w:hAnsi="Kalinga"/>
+          <w:color w:val="auto"/>
+          <w:sz w:val="20"/>
+          <w:szCs w:val="20"/>
+          <w:lang w:val="en-US"/>
+        </w:rPr>
+        <w:tab/>
+      </w:r>
+      <w:r>
+        <w:rPr>
+          <w:rFonts w:hint="default" w:ascii="Kalinga" w:hAnsi="Kalinga"/>
+          <w:color w:val="auto"/>
+          <w:sz w:val="20"/>
+          <w:szCs w:val="20"/>
+          <w:lang w:val="en-US"/>
+        </w:rPr>
+        <w:tab/>
+      </w:r>
+      <w:r>
+        <w:rPr>
+          <w:rFonts w:hint="default" w:ascii="Kalinga" w:hAnsi="Kalinga"/>
+          <w:color w:val="auto"/>
+          <w:sz w:val="20"/>
+          <w:szCs w:val="20"/>
+          <w:lang w:val="en-US"/>
+        </w:rPr>
+        <w:tab/>
+      </w:r>
+      <w:r>
+        <w:rPr>
+          <w:rFonts w:hint="default" w:ascii="Kalinga" w:hAnsi="Kalinga"/>
+          <w:color w:val="auto"/>
+          <w:sz w:val="20"/>
+          <w:szCs w:val="20"/>
+        </w:rPr>
+        <w:t>Rp. {{ pensiun_bulan_1_jumlah | default('0', true) }},-</w:t>
+      </w:r>
+    </w:p>
+    <w:p>
+      <w:pPr>
+        <w:pStyle w:val="6"/>
+        <w:numPr>
+          <w:ilvl w:val="0"/>
+          <w:numId w:val="1"/>
+        </w:numPr>
+        <w:spacing w:line="240" w:lineRule="auto"/>
+        <w:ind w:left="360" w:leftChars="0" w:right="160" w:rightChars="0" w:hanging="280" w:firstLineChars="0"/>
+        <w:jc w:val="both"/>
+        <w:rPr>
+          <w:rFonts w:hint="default" w:ascii="Kalinga" w:hAnsi="Kalinga"/>
+          <w:color w:val="auto"/>
+          <w:sz w:val="20"/>
+          <w:szCs w:val="20"/>
+        </w:rPr>
+      </w:pPr>
+      <w:r>
+        <w:rPr>
+          <w:rFonts w:hint="default" w:ascii="Kalinga" w:hAnsi="Kalinga"/>
+          <w:color w:val="auto"/>
+          <w:sz w:val="20"/>
+          <w:szCs w:val="20"/>
+        </w:rPr>
+        <w:t xml:space="preserve">Gaji Pensiun Bulan {{ pensiun_bulan_2_nama | default('...', true) }} </w:t>
+      </w:r>
+      <w:r>
+        <w:rPr>
+          <w:rFonts w:hint="default" w:ascii="Kalinga" w:hAnsi="Kalinga"/>
+          <w:color w:val="auto"/>
+          <w:sz w:val="20"/>
+          <w:szCs w:val="20"/>
+        </w:rPr>
+        <w:tab/>
+      </w:r>
+      <w:r>
+        <w:rPr>
+          <w:rFonts w:hint="default" w:ascii="Kalinga" w:hAnsi="Kalinga"/>
+          <w:color w:val="auto"/>
+          <w:sz w:val="20"/>
+          <w:szCs w:val="20"/>
+        </w:rPr>
+        <w:t>:</w:t>
+      </w:r>
+      <w:r>
+        <w:rPr>
+          <w:rFonts w:hint="default" w:ascii="Kalinga" w:hAnsi="Kalinga"/>
+          <w:color w:val="auto"/>
+          <w:sz w:val="20"/>
+          <w:szCs w:val="20"/>
+          <w:lang w:val="en-US"/>
+        </w:rPr>
+        <w:tab/>
+      </w:r>
+      <w:r>
+        <w:rPr>
+          <w:rFonts w:hint="default" w:ascii="Kalinga" w:hAnsi="Kalinga"/>
+          <w:color w:val="auto"/>
+          <w:sz w:val="20"/>
+          <w:szCs w:val="20"/>
+          <w:lang w:val="en-US"/>
+        </w:rPr>
+        <w:tab/>
+      </w:r>
+      <w:r>
+        <w:rPr>
+          <w:rFonts w:hint="default" w:ascii="Kalinga" w:hAnsi="Kalinga"/>
+          <w:color w:val="auto"/>
+          <w:sz w:val="20"/>
+          <w:szCs w:val="20"/>
+          <w:lang w:val="en-US"/>
+        </w:rPr>
+        <w:tab/>
+      </w:r>
+      <w:r>
+        <w:rPr>
+          <w:rFonts w:hint="default" w:ascii="Kalinga" w:hAnsi="Kalinga"/>
+          <w:color w:val="auto"/>
+          <w:sz w:val="20"/>
+          <w:szCs w:val="20"/>
+        </w:rPr>
+        <w:t>Rp. {{ pensiun_bulan_2_jumlah | default('0', true) }},-</w:t>
+      </w:r>
+    </w:p>
+    <w:p>
+      <w:pPr>
+        <w:pStyle w:val="6"/>
+        <w:numPr>
+          <w:ilvl w:val="0"/>
+          <w:numId w:val="1"/>
+        </w:numPr>
+        <w:spacing w:line="240" w:lineRule="auto"/>
+        <w:ind w:left="360" w:leftChars="0" w:right="160" w:rightChars="0" w:hanging="280" w:firstLineChars="0"/>
+        <w:jc w:val="both"/>
+        <w:rPr>
           <w:rFonts w:ascii="Kalinga" w:hAnsi="Kalinga" w:cs="Kalinga"/>
           <w:b/>
           <w:bCs/>
@@ -1443,34 +1611,14 @@
           <w:sz w:val="20"/>
           <w:szCs w:val="20"/>
         </w:rPr>
-        <w:t xml:space="preserve">Gaji Pensiun </w:t>
-      </w:r>
-      <w:r>
-        <w:rPr>
-          <w:rFonts w:hint="default" w:ascii="Kalinga" w:hAnsi="Kalinga"/>
-          <w:color w:val="auto"/>
-          <w:sz w:val="20"/>
-          <w:szCs w:val="20"/>
-          <w:lang w:val="en-US"/>
-        </w:rPr>
-        <w:t>Bulan</w:t>
-      </w:r>
-      <w:r>
-        <w:rPr>
-          <w:rFonts w:hint="default" w:ascii="Kalinga" w:hAnsi="Kalinga"/>
-          <w:color w:val="auto"/>
-          <w:sz w:val="20"/>
-          <w:szCs w:val="20"/>
-        </w:rPr>
-        <w:t xml:space="preserve"> {{ pensiun_bulan_nama | default('Bulan Ybs', true) }}  </w:t>
-      </w:r>
-      <w:r>
-        <w:rPr>
-          <w:rFonts w:hint="default" w:ascii="Kalinga" w:hAnsi="Kalinga"/>
-          <w:color w:val="auto"/>
-          <w:sz w:val="20"/>
-          <w:szCs w:val="20"/>
-          <w:lang w:val="en-US"/>
+        <w:t xml:space="preserve">Gaji Pensiun Bulan {{ pensiun_bulan_nama | default('...', true) }} </w:t>
+      </w:r>
+      <w:r>
+        <w:rPr>
+          <w:rFonts w:hint="default" w:ascii="Kalinga" w:hAnsi="Kalinga"/>
+          <w:color w:val="auto"/>
+          <w:sz w:val="20"/>
+          <w:szCs w:val="20"/>
         </w:rPr>
         <w:tab/>
       </w:r>
@@ -1480,6 +1628,15 @@
           <w:color w:val="auto"/>
           <w:sz w:val="20"/>
           <w:szCs w:val="20"/>
+        </w:rPr>
+        <w:t xml:space="preserve">: </w:t>
+      </w:r>
+      <w:r>
+        <w:rPr>
+          <w:rFonts w:hint="default" w:ascii="Kalinga" w:hAnsi="Kalinga"/>
+          <w:color w:val="auto"/>
+          <w:sz w:val="20"/>
+          <w:szCs w:val="20"/>
           <w:lang w:val="en-US"/>
         </w:rPr>
         <w:tab/>
@@ -1490,8 +1647,28 @@
           <w:color w:val="auto"/>
           <w:sz w:val="20"/>
           <w:szCs w:val="20"/>
-        </w:rPr>
-        <w:t>: Rp. {{ pensiun_bulan_jumlah | default('0', true) }},-</w:t>
+          <w:lang w:val="en-US"/>
+        </w:rPr>
+        <w:tab/>
+      </w:r>
+      <w:r>
+        <w:rPr>
+          <w:rFonts w:hint="default" w:ascii="Kalinga" w:hAnsi="Kalinga"/>
+          <w:color w:val="auto"/>
+          <w:sz w:val="20"/>
+          <w:szCs w:val="20"/>
+          <w:lang w:val="en-US"/>
+        </w:rPr>
+        <w:tab/>
+      </w:r>
+      <w:r>
+        <w:rPr>
+          <w:rFonts w:hint="default" w:ascii="Kalinga" w:hAnsi="Kalinga"/>
+          <w:color w:val="auto"/>
+          <w:sz w:val="20"/>
+          <w:szCs w:val="20"/>
+        </w:rPr>
+        <w:t>Rp. {{ pensiun_bulan_jumlah | default('0', true) }},-</w:t>
       </w:r>
     </w:p>
     <w:p>
@@ -1505,6 +1682,7 @@
           <w:color w:val="auto"/>
           <w:sz w:val="20"/>
           <w:szCs w:val="20"/>
+          <w:u w:val="single"/>
         </w:rPr>
       </w:pPr>
     </w:p>
@@ -1967,8 +2145,10 @@
           <w:sz w:val="20"/>
           <w:szCs w:val="20"/>
         </w:rPr>
-        <w:t>Pemohon dikenal baik dan bertanggung jawab..</w:t>
-      </w:r>
+        <w:t>Pemohon dikenal baik dan bertanggung jawab.</w:t>
+      </w:r>
+      <w:bookmarkStart w:id="17" w:name="_GoBack"/>
+      <w:bookmarkEnd w:id="17"/>
     </w:p>
     <w:p>
       <w:pPr>
@@ -4343,14 +4523,14 @@
       <w:bookmarkStart w:id="3" w:name="OLE_LINK19"/>
       <w:bookmarkStart w:id="4" w:name="OLE_LINK8"/>
       <w:bookmarkStart w:id="5" w:name="OLE_LINK17"/>
-      <w:bookmarkStart w:id="6" w:name="OLE_LINK10"/>
-      <w:bookmarkStart w:id="7" w:name="OLE_LINK23"/>
-      <w:bookmarkStart w:id="8" w:name="OLE_LINK33"/>
+      <w:bookmarkStart w:id="6" w:name="OLE_LINK3"/>
+      <w:bookmarkStart w:id="7" w:name="OLE_LINK10"/>
+      <w:bookmarkStart w:id="8" w:name="OLE_LINK32"/>
       <w:bookmarkStart w:id="9" w:name="OLE_LINK41"/>
-      <w:bookmarkStart w:id="10" w:name="OLE_LINK27"/>
-      <w:bookmarkStart w:id="11" w:name="OLE_LINK32"/>
-      <w:bookmarkStart w:id="12" w:name="OLE_LINK24"/>
-      <w:bookmarkStart w:id="13" w:name="OLE_LINK3"/>
+      <w:bookmarkStart w:id="10" w:name="OLE_LINK24"/>
+      <w:bookmarkStart w:id="11" w:name="OLE_LINK23"/>
+      <w:bookmarkStart w:id="12" w:name="OLE_LINK33"/>
+      <w:bookmarkStart w:id="13" w:name="OLE_LINK27"/>
       <w:r>
         <w:rPr>
           <w:rFonts w:ascii="Kalinga" w:hAnsi="Kalinga" w:cs="Kalinga"/>
@@ -4750,8 +4930,8 @@
       </w:r>
       <w:bookmarkEnd w:id="4"/>
       <w:bookmarkEnd w:id="5"/>
-      <w:bookmarkStart w:id="14" w:name="OLE_LINK16"/>
-      <w:bookmarkStart w:id="15" w:name="OLE_LINK34"/>
+      <w:bookmarkStart w:id="14" w:name="OLE_LINK34"/>
+      <w:bookmarkStart w:id="15" w:name="OLE_LINK16"/>
       <w:r>
         <w:rPr>
           <w:rFonts w:hint="default" w:ascii="Kalinga" w:hAnsi="Kalinga"/>
@@ -5088,18 +5268,7 @@
           <w:sz w:val="20"/>
           <w:szCs w:val="20"/>
         </w:rPr>
-        <w:t>Jaminan yang telah ada sebelumnya berupa Asli SK Pensiun atas nama Pemohon tetap dipertahankan sebagai Jaminan Kredit di BNI.</w:t>
-      </w:r>
-      <w:bookmarkStart w:id="17" w:name="_GoBack"/>
-      <w:bookmarkEnd w:id="17"/>
-      <w:r>
-        <w:rPr>
-          <w:rFonts w:hint="default" w:ascii="Kalinga" w:hAnsi="Kalinga"/>
-          <w:color w:val="auto"/>
-          <w:sz w:val="20"/>
-          <w:szCs w:val="20"/>
-        </w:rPr>
-        <w:t>{% endif %}{% if jenis_pengajuan == 'top_up_sisa_gaji' %}</w:t>
+        <w:t>Jaminan yang telah ada sebelumnya berupa Asli SK Pensiun atas nama Pemohon tetap dipertahankan sebagai Jaminan Kredit di BNI.{% endif %}{% if jenis_pengajuan == 'top_up_sisa_gaji' %}</w:t>
       </w:r>
     </w:p>
     <w:p>

</xml_diff>